<commit_message>
Ukonczenie bazy danych + dokumentacja z API i BD
</commit_message>
<xml_diff>
--- a/dokumentacja_backend/dokumnetacja_backend.docx
+++ b/dokumentacja_backend/dokumnetacja_backend.docx
@@ -291,11 +291,10 @@
           <w:bCs/>
           <w:noProof/>
         </w:rPr>
-        <w:lastRenderedPageBreak/>
         <w:drawing>
-          <wp:inline distT="0" distB="0" distL="0" distR="0" wp14:anchorId="292AA4E9" wp14:editId="0F0BA498">
-            <wp:extent cx="5760720" cy="3444875"/>
-            <wp:effectExtent l="0" t="0" r="0" b="3175"/>
+          <wp:inline distT="0" distB="0" distL="0" distR="0" wp14:anchorId="292AA4E9" wp14:editId="4D134F4C">
+            <wp:extent cx="5760720" cy="2538410"/>
+            <wp:effectExtent l="0" t="0" r="0" b="0"/>
             <wp:docPr id="83114013" name="Obraz 2"/>
             <wp:cNvGraphicFramePr>
               <a:graphicFrameLocks xmlns:a="http://schemas.openxmlformats.org/drawingml/2006/main" noChangeAspect="1"/>
@@ -304,13 +303,1075 @@
               <a:graphicData uri="http://schemas.openxmlformats.org/drawingml/2006/picture">
                 <pic:pic xmlns:pic="http://schemas.openxmlformats.org/drawingml/2006/picture">
                   <pic:nvPicPr>
-                    <pic:cNvPr id="0" name="Picture 30"/>
+                    <pic:cNvPr id="83114013" name="Obraz 2"/>
                     <pic:cNvPicPr>
                       <a:picLocks noChangeAspect="1" noChangeArrowheads="1"/>
                     </pic:cNvPicPr>
                   </pic:nvPicPr>
                   <pic:blipFill>
-                    <a:blip r:embed="rId5" cstate="print">
+                    <a:blip r:embed="rId6" cstate="print">
+                      <a:extLst>
+                        <a:ext uri="{28A0092B-C50C-407E-A947-70E740481C1C}">
+                          <a14:useLocalDpi xmlns:a14="http://schemas.microsoft.com/office/drawing/2010/main" val="0"/>
+                        </a:ext>
+                      </a:extLst>
+                    </a:blip>
+                    <a:stretch>
+                      <a:fillRect/>
+                    </a:stretch>
+                  </pic:blipFill>
+                  <pic:spPr bwMode="auto">
+                    <a:xfrm>
+                      <a:off x="0" y="0"/>
+                      <a:ext cx="5760720" cy="2538410"/>
+                    </a:xfrm>
+                    <a:prstGeom prst="rect">
+                      <a:avLst/>
+                    </a:prstGeom>
+                    <a:noFill/>
+                    <a:ln>
+                      <a:noFill/>
+                    </a:ln>
+                  </pic:spPr>
+                </pic:pic>
+              </a:graphicData>
+            </a:graphic>
+          </wp:inline>
+        </w:drawing>
+      </w:r>
+    </w:p>
+    <w:p>
+      <w:pPr>
+        <w:rPr>
+          <w:b/>
+          <w:bCs/>
+        </w:rPr>
+      </w:pPr>
+    </w:p>
+    <w:p>
+      <w:pPr>
+        <w:rPr>
+          <w:b/>
+          <w:bCs/>
+        </w:rPr>
+      </w:pPr>
+    </w:p>
+    <w:p>
+      <w:pPr>
+        <w:rPr>
+          <w:b/>
+          <w:bCs/>
+        </w:rPr>
+      </w:pPr>
+      <w:r>
+        <w:rPr>
+          <w:b/>
+          <w:bCs/>
+        </w:rPr>
+        <w:lastRenderedPageBreak/>
+        <w:t>Moduł Autoryzacji i Użytkowników</w:t>
+      </w:r>
+    </w:p>
+    <w:p>
+      <w:pPr>
+        <w:numPr>
+          <w:ilvl w:val="0"/>
+          <w:numId w:val="1"/>
+        </w:numPr>
+      </w:pPr>
+      <w:proofErr w:type="spellStart"/>
+      <w:r>
+        <w:rPr>
+          <w:b/>
+          <w:bCs/>
+        </w:rPr>
+        <w:t>Uzytkownik</w:t>
+      </w:r>
+      <w:proofErr w:type="spellEnd"/>
+      <w:r>
+        <w:rPr>
+          <w:b/>
+          <w:bCs/>
+        </w:rPr>
+        <w:t xml:space="preserve"> (Rozszerzenie </w:t>
+      </w:r>
+      <w:proofErr w:type="spellStart"/>
+      <w:r>
+        <w:rPr>
+          <w:b/>
+          <w:bCs/>
+        </w:rPr>
+        <w:t>AbstractUser</w:t>
+      </w:r>
+      <w:proofErr w:type="spellEnd"/>
+      <w:r>
+        <w:rPr>
+          <w:b/>
+          <w:bCs/>
+        </w:rPr>
+        <w:t>):</w:t>
+      </w:r>
+      <w:r>
+        <w:t xml:space="preserve"> Centralny punkt systemu. Przechowuje podstawowe dane logowania (login, hasło, email) oraz dedykowane pola uczelniane: rola (Student/Profesor), </w:t>
+      </w:r>
+      <w:proofErr w:type="spellStart"/>
+      <w:r>
+        <w:t>numer_indeksu</w:t>
+      </w:r>
+      <w:proofErr w:type="spellEnd"/>
+      <w:r>
+        <w:t xml:space="preserve"> i </w:t>
+      </w:r>
+      <w:proofErr w:type="spellStart"/>
+      <w:r>
+        <w:t>grupa_dziekanska</w:t>
+      </w:r>
+      <w:proofErr w:type="spellEnd"/>
+      <w:r>
+        <w:t>.</w:t>
+      </w:r>
+    </w:p>
+    <w:p>
+      <w:pPr>
+        <w:rPr>
+          <w:b/>
+          <w:bCs/>
+        </w:rPr>
+      </w:pPr>
+      <w:r>
+        <w:rPr>
+          <w:b/>
+          <w:bCs/>
+        </w:rPr>
+        <w:t>Moduł Zadań i Weryfikacji Kodu</w:t>
+      </w:r>
+    </w:p>
+    <w:p>
+      <w:pPr>
+        <w:numPr>
+          <w:ilvl w:val="0"/>
+          <w:numId w:val="2"/>
+        </w:numPr>
+      </w:pPr>
+      <w:proofErr w:type="spellStart"/>
+      <w:r>
+        <w:rPr>
+          <w:b/>
+          <w:bCs/>
+        </w:rPr>
+        <w:t>Snippet</w:t>
+      </w:r>
+      <w:proofErr w:type="spellEnd"/>
+      <w:r>
+        <w:rPr>
+          <w:b/>
+          <w:bCs/>
+        </w:rPr>
+        <w:t>:</w:t>
+      </w:r>
+      <w:r>
+        <w:t xml:space="preserve"> Tabela pełniąca rolę notatnika. Przechowuje luźne kawałki kodu (</w:t>
+      </w:r>
+      <w:proofErr w:type="spellStart"/>
+      <w:r>
+        <w:t>code</w:t>
+      </w:r>
+      <w:proofErr w:type="spellEnd"/>
+      <w:r>
+        <w:t xml:space="preserve">, </w:t>
+      </w:r>
+      <w:proofErr w:type="spellStart"/>
+      <w:r>
+        <w:t>language</w:t>
+      </w:r>
+      <w:proofErr w:type="spellEnd"/>
+      <w:r>
+        <w:t>) tworzone przez użytkowników na "brudno", niezwiązane z żadnym konkretnym zadaniem.</w:t>
+      </w:r>
+    </w:p>
+    <w:p>
+      <w:pPr>
+        <w:numPr>
+          <w:ilvl w:val="0"/>
+          <w:numId w:val="2"/>
+        </w:numPr>
+      </w:pPr>
+      <w:proofErr w:type="spellStart"/>
+      <w:r>
+        <w:rPr>
+          <w:b/>
+          <w:bCs/>
+        </w:rPr>
+        <w:t>Task</w:t>
+      </w:r>
+      <w:proofErr w:type="spellEnd"/>
+      <w:r>
+        <w:rPr>
+          <w:b/>
+          <w:bCs/>
+        </w:rPr>
+        <w:t xml:space="preserve"> (Zadanie):</w:t>
+      </w:r>
+      <w:r>
+        <w:t xml:space="preserve"> Główna tabela z problemami algorytmicznymi. Zawiera tytuł, treść, poziom trudności oraz flagę </w:t>
+      </w:r>
+      <w:proofErr w:type="spellStart"/>
+      <w:r>
+        <w:t>is_public</w:t>
+      </w:r>
+      <w:proofErr w:type="spellEnd"/>
+      <w:r>
+        <w:t xml:space="preserve">. Definiuje też krytyczne ograniczenia dla systemu sprawdzającego: </w:t>
+      </w:r>
+      <w:proofErr w:type="spellStart"/>
+      <w:r>
+        <w:t>time_limit</w:t>
+      </w:r>
+      <w:proofErr w:type="spellEnd"/>
+      <w:r>
+        <w:t xml:space="preserve"> (w ms) oraz </w:t>
+      </w:r>
+      <w:proofErr w:type="spellStart"/>
+      <w:r>
+        <w:t>memory_limit</w:t>
+      </w:r>
+      <w:proofErr w:type="spellEnd"/>
+      <w:r>
+        <w:t xml:space="preserve"> (w MB).</w:t>
+      </w:r>
+    </w:p>
+    <w:p>
+      <w:pPr>
+        <w:numPr>
+          <w:ilvl w:val="0"/>
+          <w:numId w:val="2"/>
+        </w:numPr>
+      </w:pPr>
+      <w:proofErr w:type="spellStart"/>
+      <w:r>
+        <w:rPr>
+          <w:b/>
+          <w:bCs/>
+        </w:rPr>
+        <w:t>TestCase</w:t>
+      </w:r>
+      <w:proofErr w:type="spellEnd"/>
+      <w:r>
+        <w:rPr>
+          <w:b/>
+          <w:bCs/>
+        </w:rPr>
+        <w:t xml:space="preserve"> (Przypadek Testowy):</w:t>
+      </w:r>
+      <w:r>
+        <w:t xml:space="preserve"> Zestawy danych służące do weryfikacji poprawności algorytmów. Każde zadanie posiada wiele testów (relacja Jeden-do-Wielu). Model zawiera dane wejściowe (</w:t>
+      </w:r>
+      <w:proofErr w:type="spellStart"/>
+      <w:r>
+        <w:t>input_data</w:t>
+      </w:r>
+      <w:proofErr w:type="spellEnd"/>
+      <w:r>
+        <w:t>), oczekiwany wynik (</w:t>
+      </w:r>
+      <w:proofErr w:type="spellStart"/>
+      <w:r>
+        <w:t>expected_output</w:t>
+      </w:r>
+      <w:proofErr w:type="spellEnd"/>
+      <w:r>
+        <w:t xml:space="preserve">) oraz flagę </w:t>
+      </w:r>
+      <w:proofErr w:type="spellStart"/>
+      <w:r>
+        <w:t>is_sample</w:t>
+      </w:r>
+      <w:proofErr w:type="spellEnd"/>
+      <w:r>
+        <w:t xml:space="preserve"> decydującą, czy test jest widoczny dla rozwiązującego, czy ukryty.</w:t>
+      </w:r>
+    </w:p>
+    <w:p>
+      <w:pPr>
+        <w:numPr>
+          <w:ilvl w:val="0"/>
+          <w:numId w:val="2"/>
+        </w:numPr>
+      </w:pPr>
+      <w:r>
+        <w:rPr>
+          <w:b/>
+          <w:bCs/>
+        </w:rPr>
+        <w:t>Solution (Rozwiązanie):</w:t>
+      </w:r>
+      <w:r>
+        <w:t xml:space="preserve"> Łącznik pomiędzy Użytkownikiem a Zadaniem. Zapisuje wysłany kod źródłowy, język programowania oraz ewentualny opis (</w:t>
+      </w:r>
+      <w:proofErr w:type="spellStart"/>
+      <w:r>
+        <w:t>Markdown</w:t>
+      </w:r>
+      <w:proofErr w:type="spellEnd"/>
+      <w:r>
+        <w:t>). Baza przechowuje tu również fizyczny czas wykonania i zużytą pamięć podczas ewaluacji oraz ostateczny status (np. Zaakceptowane, Błąd Kompilacji).</w:t>
+      </w:r>
+    </w:p>
+    <w:p>
+      <w:pPr>
+        <w:rPr>
+          <w:b/>
+          <w:bCs/>
+        </w:rPr>
+      </w:pPr>
+      <w:r>
+        <w:rPr>
+          <w:b/>
+          <w:bCs/>
+        </w:rPr>
+        <w:t>Moduł Społeczności</w:t>
+      </w:r>
+    </w:p>
+    <w:p>
+      <w:pPr>
+        <w:numPr>
+          <w:ilvl w:val="0"/>
+          <w:numId w:val="3"/>
+        </w:numPr>
+      </w:pPr>
+      <w:proofErr w:type="spellStart"/>
+      <w:r>
+        <w:rPr>
+          <w:b/>
+          <w:bCs/>
+        </w:rPr>
+        <w:t>CodeGroup</w:t>
+      </w:r>
+      <w:proofErr w:type="spellEnd"/>
+      <w:r>
+        <w:rPr>
+          <w:b/>
+          <w:bCs/>
+        </w:rPr>
+        <w:t xml:space="preserve"> (Grupa):</w:t>
+      </w:r>
+      <w:r>
+        <w:t xml:space="preserve"> Reprezentuje zrzeszenie użytkowników (np. konkretną klasę na uczelni). Definiuje nazwę, opis oraz flagę </w:t>
+      </w:r>
+      <w:proofErr w:type="spellStart"/>
+      <w:r>
+        <w:t>is_open</w:t>
+      </w:r>
+      <w:proofErr w:type="spellEnd"/>
+      <w:r>
+        <w:t>, która określa, czy do grupy można dołączyć z "ulicy".</w:t>
+      </w:r>
+    </w:p>
+    <w:p>
+      <w:pPr>
+        <w:numPr>
+          <w:ilvl w:val="0"/>
+          <w:numId w:val="3"/>
+        </w:numPr>
+      </w:pPr>
+      <w:proofErr w:type="spellStart"/>
+      <w:r>
+        <w:rPr>
+          <w:b/>
+          <w:bCs/>
+        </w:rPr>
+        <w:t>GroupMembership</w:t>
+      </w:r>
+      <w:proofErr w:type="spellEnd"/>
+      <w:r>
+        <w:rPr>
+          <w:b/>
+          <w:bCs/>
+        </w:rPr>
+        <w:t>:</w:t>
+      </w:r>
+      <w:r>
+        <w:t xml:space="preserve"> Tabela pośrednia (</w:t>
+      </w:r>
+      <w:proofErr w:type="spellStart"/>
+      <w:r>
+        <w:t>Many-to-Many</w:t>
+      </w:r>
+      <w:proofErr w:type="spellEnd"/>
+      <w:r>
+        <w:t>) decydująca o tym, kto należy do jakiej grupy. Co ważne, przechowuje również role, pozwalając odróżnić zwykłego członka od Administratora danej grupy.</w:t>
+      </w:r>
+    </w:p>
+    <w:p>
+      <w:pPr>
+        <w:rPr>
+          <w:b/>
+          <w:bCs/>
+        </w:rPr>
+      </w:pPr>
+      <w:r>
+        <w:rPr>
+          <w:b/>
+          <w:bCs/>
+        </w:rPr>
+        <w:t>Moduł Turniejowy (Konkursy)</w:t>
+      </w:r>
+    </w:p>
+    <w:p>
+      <w:pPr>
+        <w:numPr>
+          <w:ilvl w:val="0"/>
+          <w:numId w:val="4"/>
+        </w:numPr>
+      </w:pPr>
+      <w:proofErr w:type="spellStart"/>
+      <w:r>
+        <w:rPr>
+          <w:b/>
+          <w:bCs/>
+        </w:rPr>
+        <w:t>Contest</w:t>
+      </w:r>
+      <w:proofErr w:type="spellEnd"/>
+      <w:r>
+        <w:rPr>
+          <w:b/>
+          <w:bCs/>
+        </w:rPr>
+        <w:t xml:space="preserve"> (Konkurs):</w:t>
+      </w:r>
+      <w:r>
+        <w:t xml:space="preserve"> Organizuje zadania w ograniczone czasowo ramy (</w:t>
+      </w:r>
+      <w:proofErr w:type="spellStart"/>
+      <w:r>
+        <w:t>start_time</w:t>
+      </w:r>
+      <w:proofErr w:type="spellEnd"/>
+      <w:r>
+        <w:t xml:space="preserve">, </w:t>
+      </w:r>
+      <w:proofErr w:type="spellStart"/>
+      <w:r>
+        <w:t>end_time</w:t>
+      </w:r>
+      <w:proofErr w:type="spellEnd"/>
+      <w:r>
+        <w:t xml:space="preserve">). Posiada flagę </w:t>
+      </w:r>
+      <w:proofErr w:type="spellStart"/>
+      <w:r>
+        <w:t>strict_mode</w:t>
+      </w:r>
+      <w:proofErr w:type="spellEnd"/>
+      <w:r>
+        <w:t xml:space="preserve">, która aktywuje na </w:t>
+      </w:r>
+      <w:proofErr w:type="spellStart"/>
+      <w:r>
+        <w:t>frontendzie</w:t>
+      </w:r>
+      <w:proofErr w:type="spellEnd"/>
+      <w:r>
+        <w:t xml:space="preserve"> tryb zabezpieczeń </w:t>
+      </w:r>
+      <w:proofErr w:type="spellStart"/>
+      <w:r>
+        <w:t>antysciągowych</w:t>
+      </w:r>
+      <w:proofErr w:type="spellEnd"/>
+      <w:r>
+        <w:t xml:space="preserve"> (np. blokadę wyjścia z karty przeglądarki).</w:t>
+      </w:r>
+    </w:p>
+    <w:p>
+      <w:pPr>
+        <w:numPr>
+          <w:ilvl w:val="0"/>
+          <w:numId w:val="4"/>
+        </w:numPr>
+      </w:pPr>
+      <w:proofErr w:type="spellStart"/>
+      <w:r>
+        <w:rPr>
+          <w:b/>
+          <w:bCs/>
+        </w:rPr>
+        <w:t>ContestParticipation</w:t>
+      </w:r>
+      <w:proofErr w:type="spellEnd"/>
+      <w:r>
+        <w:rPr>
+          <w:b/>
+          <w:bCs/>
+        </w:rPr>
+        <w:t>:</w:t>
+      </w:r>
+      <w:r>
+        <w:t xml:space="preserve"> Tabela pośrednia łącząca Konkurs z Grupami startującymi. Rejestruje łączny wynik (</w:t>
+      </w:r>
+      <w:proofErr w:type="spellStart"/>
+      <w:r>
+        <w:t>total_score</w:t>
+      </w:r>
+      <w:proofErr w:type="spellEnd"/>
+      <w:r>
+        <w:t>) oraz status ewentualnej dyskwalifikacji (</w:t>
+      </w:r>
+      <w:proofErr w:type="spellStart"/>
+      <w:r>
+        <w:t>is_disqualified</w:t>
+      </w:r>
+      <w:proofErr w:type="spellEnd"/>
+      <w:r>
+        <w:t>).</w:t>
+      </w:r>
+    </w:p>
+    <w:p>
+      <w:pPr>
+        <w:numPr>
+          <w:ilvl w:val="0"/>
+          <w:numId w:val="4"/>
+        </w:numPr>
+      </w:pPr>
+      <w:proofErr w:type="spellStart"/>
+      <w:r>
+        <w:rPr>
+          <w:b/>
+          <w:bCs/>
+        </w:rPr>
+        <w:lastRenderedPageBreak/>
+        <w:t>ContestHost</w:t>
+      </w:r>
+      <w:proofErr w:type="spellEnd"/>
+      <w:r>
+        <w:rPr>
+          <w:b/>
+          <w:bCs/>
+        </w:rPr>
+        <w:t>:</w:t>
+      </w:r>
+      <w:r>
+        <w:t xml:space="preserve"> Tabela delegująca uprawnienia. Pozwala Głównemu Twórcy konkursu przypisać innych użytkowników jako sędziów/pomocników z precyzyjnie określonymi prawami (np. możliwość modyfikacji zadań, wyrzucania grup).</w:t>
+      </w:r>
+    </w:p>
+    <w:p>
+      <w:pPr>
+        <w:rPr>
+          <w:b/>
+          <w:bCs/>
+        </w:rPr>
+      </w:pPr>
+      <w:r>
+        <w:rPr>
+          <w:b/>
+          <w:bCs/>
+        </w:rPr>
+        <w:t>Moduł Zgłoszeń</w:t>
+      </w:r>
+    </w:p>
+    <w:p>
+      <w:pPr>
+        <w:numPr>
+          <w:ilvl w:val="0"/>
+          <w:numId w:val="5"/>
+        </w:numPr>
+      </w:pPr>
+      <w:proofErr w:type="spellStart"/>
+      <w:r>
+        <w:rPr>
+          <w:b/>
+          <w:bCs/>
+        </w:rPr>
+        <w:t>TaskReport</w:t>
+      </w:r>
+      <w:proofErr w:type="spellEnd"/>
+      <w:r>
+        <w:rPr>
+          <w:b/>
+          <w:bCs/>
+        </w:rPr>
+        <w:t xml:space="preserve"> (Zgłoszenie/</w:t>
+      </w:r>
+      <w:proofErr w:type="spellStart"/>
+      <w:r>
+        <w:rPr>
+          <w:b/>
+          <w:bCs/>
+        </w:rPr>
+        <w:t>Ticket</w:t>
+      </w:r>
+      <w:proofErr w:type="spellEnd"/>
+      <w:r>
+        <w:rPr>
+          <w:b/>
+          <w:bCs/>
+        </w:rPr>
+        <w:t>):</w:t>
+      </w:r>
+      <w:r>
+        <w:t xml:space="preserve"> Pozwala użytkownikom zgłaszać problemy z zadaniami (np. błędny test ukryty). Łączy konkretne zadanie z osobą zgłaszającą i udostępnia status rozwiązania problemu (</w:t>
+      </w:r>
+      <w:proofErr w:type="spellStart"/>
+      <w:r>
+        <w:t>is_resolved</w:t>
+      </w:r>
+      <w:proofErr w:type="spellEnd"/>
+      <w:r>
+        <w:t>).</w:t>
+      </w:r>
+    </w:p>
+    <w:p>
+      <w:r>
+        <w:pict w14:anchorId="5F918391">
+          <v:rect id="_x0000_i1026" style="width:0;height:1.5pt" o:hralign="center" o:hrstd="t" o:hr="t" fillcolor="#a0a0a0" stroked="f"/>
+        </w:pict>
+      </w:r>
+    </w:p>
+    <w:p>
+      <w:pPr>
+        <w:pStyle w:val="Nagwek2"/>
+      </w:pPr>
+      <w:r>
+        <w:t>3. Pokrycie Wymagań Biznesowych (Historie Użytkowników - HU)</w:t>
+      </w:r>
+    </w:p>
+    <w:p>
+      <w:r>
+        <w:t>Architektura została ściśle dopasowana do wymagań projektowych. Tabela poniżej przedstawia, jak poszczególne modele realizują założenia HU:</w:t>
+      </w:r>
+    </w:p>
+    <w:p>
+      <w:pPr>
+        <w:numPr>
+          <w:ilvl w:val="0"/>
+          <w:numId w:val="6"/>
+        </w:numPr>
+      </w:pPr>
+      <w:r>
+        <w:rPr>
+          <w:b/>
+          <w:bCs/>
+        </w:rPr>
+        <w:t>Zarządzanie Zadaniami (HU 1.3, 1.4, 1.12):</w:t>
+      </w:r>
+      <w:r>
+        <w:t xml:space="preserve"> Tabela </w:t>
+      </w:r>
+      <w:proofErr w:type="spellStart"/>
+      <w:r>
+        <w:t>Task</w:t>
+      </w:r>
+      <w:proofErr w:type="spellEnd"/>
+      <w:r>
+        <w:t xml:space="preserve"> pozwala na tworzenie zadań prywatnych i publicznych. Obsługę treści zapewnia elastyczne pole </w:t>
+      </w:r>
+      <w:proofErr w:type="spellStart"/>
+      <w:r>
+        <w:t>description</w:t>
+      </w:r>
+      <w:proofErr w:type="spellEnd"/>
+      <w:r>
+        <w:t xml:space="preserve"> (gotowe na </w:t>
+      </w:r>
+      <w:proofErr w:type="spellStart"/>
+      <w:r>
+        <w:t>parsowanie</w:t>
+      </w:r>
+      <w:proofErr w:type="spellEnd"/>
+      <w:r>
+        <w:t xml:space="preserve"> </w:t>
+      </w:r>
+      <w:proofErr w:type="spellStart"/>
+      <w:r>
+        <w:t>Markdown</w:t>
+      </w:r>
+      <w:proofErr w:type="spellEnd"/>
+      <w:r>
+        <w:t xml:space="preserve">). Ograniczenia sprzętowe dla sprawdzarki kodu gwarantują pola </w:t>
+      </w:r>
+      <w:proofErr w:type="spellStart"/>
+      <w:r>
+        <w:t>time_limit</w:t>
+      </w:r>
+      <w:proofErr w:type="spellEnd"/>
+      <w:r>
+        <w:t xml:space="preserve"> oraz </w:t>
+      </w:r>
+      <w:proofErr w:type="spellStart"/>
+      <w:r>
+        <w:t>memory_limit</w:t>
+      </w:r>
+      <w:proofErr w:type="spellEnd"/>
+      <w:r>
+        <w:t>.</w:t>
+      </w:r>
+    </w:p>
+    <w:p>
+      <w:pPr>
+        <w:numPr>
+          <w:ilvl w:val="0"/>
+          <w:numId w:val="6"/>
+        </w:numPr>
+      </w:pPr>
+      <w:r>
+        <w:rPr>
+          <w:b/>
+          <w:bCs/>
+        </w:rPr>
+        <w:t>System Ewaluacji Testowej (HU 1.7, 1.8):</w:t>
+      </w:r>
+      <w:r>
+        <w:t xml:space="preserve"> Rozdzielenie testów jawnych od ukrytych zostało osiągnięte poprzez dedykowany model </w:t>
+      </w:r>
+      <w:proofErr w:type="spellStart"/>
+      <w:r>
+        <w:t>TestCase</w:t>
+      </w:r>
+      <w:proofErr w:type="spellEnd"/>
+      <w:r>
+        <w:t xml:space="preserve"> z flagą </w:t>
+      </w:r>
+      <w:proofErr w:type="spellStart"/>
+      <w:r>
+        <w:t>is_sample</w:t>
+      </w:r>
+      <w:proofErr w:type="spellEnd"/>
+      <w:r>
+        <w:t xml:space="preserve"> i opcją punktacji za każdy pojedynczy test.</w:t>
+      </w:r>
+    </w:p>
+    <w:p>
+      <w:pPr>
+        <w:numPr>
+          <w:ilvl w:val="0"/>
+          <w:numId w:val="6"/>
+        </w:numPr>
+      </w:pPr>
+      <w:r>
+        <w:rPr>
+          <w:b/>
+          <w:bCs/>
+        </w:rPr>
+        <w:t>Zarządzanie Społecznością (HU 2.1, 2.2):</w:t>
+      </w:r>
+      <w:r>
+        <w:t xml:space="preserve"> Tabela </w:t>
+      </w:r>
+      <w:proofErr w:type="spellStart"/>
+      <w:r>
+        <w:t>CodeGroup</w:t>
+      </w:r>
+      <w:proofErr w:type="spellEnd"/>
+      <w:r>
+        <w:t xml:space="preserve"> oraz przypisana do niej relacja </w:t>
+      </w:r>
+      <w:proofErr w:type="spellStart"/>
+      <w:r>
+        <w:t>GroupMembership</w:t>
+      </w:r>
+      <w:proofErr w:type="spellEnd"/>
+      <w:r>
+        <w:t xml:space="preserve"> obsługuje zarówno zróżnicowanie dostępu (grupy otwarte/zamknięte), jak i hierarchię wewnątrz społeczności (role członka i </w:t>
+      </w:r>
+      <w:proofErr w:type="gramStart"/>
+      <w:r>
+        <w:t>admina</w:t>
+      </w:r>
+      <w:proofErr w:type="gramEnd"/>
+      <w:r>
+        <w:t>).</w:t>
+      </w:r>
+    </w:p>
+    <w:p>
+      <w:pPr>
+        <w:numPr>
+          <w:ilvl w:val="0"/>
+          <w:numId w:val="6"/>
+        </w:numPr>
+      </w:pPr>
+      <w:r>
+        <w:rPr>
+          <w:b/>
+          <w:bCs/>
+        </w:rPr>
+        <w:t>Zabezpieczenia i Turnieje (HU 2.3):</w:t>
+      </w:r>
+      <w:r>
+        <w:t xml:space="preserve"> System Konkursów (</w:t>
+      </w:r>
+      <w:proofErr w:type="spellStart"/>
+      <w:r>
+        <w:t>Contest</w:t>
+      </w:r>
+      <w:proofErr w:type="spellEnd"/>
+      <w:r>
+        <w:t xml:space="preserve">) poprzez flagę </w:t>
+      </w:r>
+      <w:proofErr w:type="spellStart"/>
+      <w:r>
+        <w:t>strict_mode</w:t>
+      </w:r>
+      <w:proofErr w:type="spellEnd"/>
+      <w:r>
+        <w:t xml:space="preserve"> natywnie wspiera implementację mechanizmów </w:t>
+      </w:r>
+      <w:proofErr w:type="spellStart"/>
+      <w:r>
+        <w:t>antysciągowych</w:t>
+      </w:r>
+      <w:proofErr w:type="spellEnd"/>
+      <w:r>
+        <w:t>, a zaawansowane tabele pośrednie umożliwiają organizację turniejów międzyszkolnych (wiele grup w jednym konkursie).</w:t>
+      </w:r>
+    </w:p>
+    <w:p>
+      <w:pPr>
+        <w:numPr>
+          <w:ilvl w:val="0"/>
+          <w:numId w:val="6"/>
+        </w:numPr>
+      </w:pPr>
+      <w:r>
+        <w:rPr>
+          <w:b/>
+          <w:bCs/>
+        </w:rPr>
+        <w:t>Utrzymanie Jakości (HU 1.10, 3.3):</w:t>
+      </w:r>
+      <w:r>
+        <w:t xml:space="preserve"> Dedykowany model </w:t>
+      </w:r>
+      <w:proofErr w:type="spellStart"/>
+      <w:r>
+        <w:t>TaskReport</w:t>
+      </w:r>
+      <w:proofErr w:type="spellEnd"/>
+      <w:r>
+        <w:t xml:space="preserve"> implementuje pełnoprawny, śledzony system zgłaszania błędów przez studentów do wykładowców.</w:t>
+      </w:r>
+    </w:p>
+    <w:p>
+      <w:r>
+        <w:pict w14:anchorId="6C7130AF">
+          <v:rect id="_x0000_i1027" style="width:0;height:1.5pt" o:hralign="center" o:hrstd="t" o:hr="t" fillcolor="#a0a0a0" stroked="f"/>
+        </w:pict>
+      </w:r>
+    </w:p>
+    <w:p>
+      <w:pPr>
+        <w:pStyle w:val="Nagwek2"/>
+      </w:pPr>
+      <w:r>
+        <w:t>4. Wizualizacja i Aktualizacja Schematu</w:t>
+      </w:r>
+    </w:p>
+    <w:p>
+      <w:r>
+        <w:t>Zgodnie z zasadą DRY (</w:t>
+      </w:r>
+      <w:proofErr w:type="spellStart"/>
+      <w:r>
+        <w:t>Don't</w:t>
+      </w:r>
+      <w:proofErr w:type="spellEnd"/>
+      <w:r>
+        <w:t xml:space="preserve"> </w:t>
+      </w:r>
+      <w:proofErr w:type="spellStart"/>
+      <w:r>
+        <w:t>Repeat</w:t>
+      </w:r>
+      <w:proofErr w:type="spellEnd"/>
+      <w:r>
+        <w:t xml:space="preserve"> </w:t>
+      </w:r>
+      <w:proofErr w:type="spellStart"/>
+      <w:r>
+        <w:t>Yourself</w:t>
+      </w:r>
+      <w:proofErr w:type="spellEnd"/>
+      <w:r>
+        <w:t>), nie utrzymujemy ręcznie rysowanych schematów bazy danych, ponieważ szybko stają się nieaktualne.</w:t>
+      </w:r>
+    </w:p>
+    <w:p>
+      <w:r>
+        <w:lastRenderedPageBreak/>
+        <w:t xml:space="preserve">Wizualizacja bazy generowana jest </w:t>
+      </w:r>
+      <w:r>
+        <w:rPr>
+          <w:b/>
+          <w:bCs/>
+        </w:rPr>
+        <w:t>automatycznie</w:t>
+      </w:r>
+      <w:r>
+        <w:t xml:space="preserve"> bezpośrednio z kodu źródłowego (models.py). Wykorzystujemy do tego połączenie programu systemowego </w:t>
+      </w:r>
+      <w:proofErr w:type="spellStart"/>
+      <w:r>
+        <w:rPr>
+          <w:b/>
+          <w:bCs/>
+        </w:rPr>
+        <w:t>Graphviz</w:t>
+      </w:r>
+      <w:proofErr w:type="spellEnd"/>
+      <w:r>
+        <w:t xml:space="preserve"> oraz biblioteki </w:t>
+      </w:r>
+      <w:proofErr w:type="spellStart"/>
+      <w:r>
+        <w:t>pythonowej</w:t>
+      </w:r>
+      <w:proofErr w:type="spellEnd"/>
+      <w:r>
+        <w:t xml:space="preserve"> </w:t>
+      </w:r>
+      <w:proofErr w:type="spellStart"/>
+      <w:r>
+        <w:rPr>
+          <w:b/>
+          <w:bCs/>
+        </w:rPr>
+        <w:t>django-extensions</w:t>
+      </w:r>
+      <w:proofErr w:type="spellEnd"/>
+      <w:r>
+        <w:t>.</w:t>
+      </w:r>
+    </w:p>
+    <w:p>
+      <w:r>
+        <w:rPr>
+          <w:b/>
+          <w:bCs/>
+        </w:rPr>
+        <w:t>Instrukcja wygenerowania aktualnego diagramu (ERD):</w:t>
+      </w:r>
+      <w:r>
+        <w:t xml:space="preserve"> Aby pobrać najświeższy schemat relacji między tabelami, w głównym katalogu projektu uruchom poniższą komendę w terminalu:</w:t>
+      </w:r>
+    </w:p>
+    <w:p>
+      <w:pPr>
+        <w:rPr>
+          <w:lang w:val="en-US"/>
+        </w:rPr>
+      </w:pPr>
+      <w:r>
+        <w:rPr>
+          <w:lang w:val="en-US"/>
+        </w:rPr>
+        <w:t>Bash</w:t>
+      </w:r>
+    </w:p>
+    <w:p>
+      <w:pPr>
+        <w:shd w:val="clear" w:color="auto" w:fill="2B2B2B"/>
+        <w:rPr>
+          <w:lang w:val="en-US"/>
+        </w:rPr>
+      </w:pPr>
+      <w:r>
+        <w:rPr>
+          <w:lang w:val="en-US"/>
+        </w:rPr>
+        <w:t xml:space="preserve">docker-compose exec web python manage.py </w:t>
+      </w:r>
+      <w:proofErr w:type="spellStart"/>
+      <w:r>
+        <w:rPr>
+          <w:lang w:val="en-US"/>
+        </w:rPr>
+        <w:t>graph_models</w:t>
+      </w:r>
+      <w:proofErr w:type="spellEnd"/>
+      <w:r>
+        <w:rPr>
+          <w:lang w:val="en-US"/>
+        </w:rPr>
+        <w:t xml:space="preserve"> -a -o diagram_bazy_danych.png</w:t>
+      </w:r>
+    </w:p>
+    <w:p>
+      <w:pPr>
+        <w:rPr>
+          <w:lang w:val="en-US"/>
+        </w:rPr>
+      </w:pPr>
+    </w:p>
+    <w:p>
+      <w:pPr>
+        <w:rPr>
+          <w:lang w:val="en-US"/>
+        </w:rPr>
+      </w:pPr>
+    </w:p>
+    <w:p>
+      <w:r>
+        <w:t>Wygenerowany plik diagram_bazy_danych.png pojawi się w folderze roboczym i będzie zawierał wszystkie bieżące tabele, relacje (Klucze Obce) oraz typy danych.</w:t>
+      </w:r>
+    </w:p>
+    <w:p/>
+    <w:p/>
+    <w:p/>
+    <w:p/>
+    <w:p/>
+    <w:p/>
+    <w:p/>
+    <w:p>
+      <w:pPr>
+        <w:pStyle w:val="Nagwek1"/>
+      </w:pPr>
+      <w:proofErr w:type="spellStart"/>
+      <w:r>
+        <w:t>Endpointy</w:t>
+      </w:r>
+      <w:proofErr w:type="spellEnd"/>
+      <w:r>
+        <w:t xml:space="preserve"> w API</w:t>
+      </w:r>
+    </w:p>
+    <w:p>
+      <w:pPr>
+        <w:pStyle w:val="Nagwek2"/>
+      </w:pPr>
+      <w:r>
+        <w:t xml:space="preserve">Diagram </w:t>
+      </w:r>
+      <w:proofErr w:type="spellStart"/>
+      <w:r>
+        <w:t>endpoinów</w:t>
+      </w:r>
+      <w:proofErr w:type="spellEnd"/>
+      <w:r>
+        <w:t>:</w:t>
+      </w:r>
+    </w:p>
+    <w:p>
+      <w:r>
+        <w:drawing>
+          <wp:inline distT="0" distB="0" distL="0" distR="0" wp14:anchorId="159C42D1" wp14:editId="4B86F268">
+            <wp:extent cx="5760720" cy="2033270"/>
+            <wp:effectExtent l="0" t="0" r="0" b="5080"/>
+            <wp:docPr id="341320927" name="Obraz 2"/>
+            <wp:cNvGraphicFramePr>
+              <a:graphicFrameLocks xmlns:a="http://schemas.openxmlformats.org/drawingml/2006/main" noChangeAspect="1"/>
+            </wp:cNvGraphicFramePr>
+            <a:graphic xmlns:a="http://schemas.openxmlformats.org/drawingml/2006/main">
+              <a:graphicData uri="http://schemas.openxmlformats.org/drawingml/2006/picture">
+                <pic:pic xmlns:pic="http://schemas.openxmlformats.org/drawingml/2006/picture">
+                  <pic:nvPicPr>
+                    <pic:cNvPr id="0" name="Picture 9"/>
+                    <pic:cNvPicPr>
+                      <a:picLocks noChangeAspect="1" noChangeArrowheads="1"/>
+                    </pic:cNvPicPr>
+                  </pic:nvPicPr>
+                  <pic:blipFill>
+                    <a:blip r:embed="rId7" cstate="print">
                       <a:extLst>
                         <a:ext uri="{28A0092B-C50C-407E-A947-70E740481C1C}">
                           <a14:useLocalDpi xmlns:a14="http://schemas.microsoft.com/office/drawing/2010/main" val="0"/>
@@ -325,7 +1386,7 @@
                   <pic:spPr bwMode="auto">
                     <a:xfrm>
                       <a:off x="0" y="0"/>
-                      <a:ext cx="5760720" cy="3444875"/>
+                      <a:ext cx="5760720" cy="2033270"/>
                     </a:xfrm>
                     <a:prstGeom prst="rect">
                       <a:avLst/>
@@ -342,261 +1403,545 @@
         </w:drawing>
       </w:r>
     </w:p>
-    <w:p>
-      <w:pPr>
-        <w:rPr>
-          <w:b/>
-          <w:bCs/>
-        </w:rPr>
-      </w:pPr>
-    </w:p>
-    <w:p>
-      <w:pPr>
-        <w:rPr>
-          <w:b/>
-          <w:bCs/>
-        </w:rPr>
-      </w:pPr>
-    </w:p>
-    <w:p>
-      <w:pPr>
-        <w:rPr>
-          <w:b/>
-          <w:bCs/>
-        </w:rPr>
-      </w:pPr>
-      <w:r>
-        <w:rPr>
-          <w:b/>
-          <w:bCs/>
-        </w:rPr>
-        <w:t>Moduł Autoryzacji i Użytkowników</w:t>
+    <w:p/>
+    <w:p>
+      <w:pPr>
+        <w:pStyle w:val="Nagwek2"/>
+      </w:pPr>
+      <w:r>
+        <w:t xml:space="preserve">1. Zrealizowane </w:t>
+      </w:r>
+      <w:proofErr w:type="spellStart"/>
+      <w:r>
+        <w:t>Endpointy</w:t>
+      </w:r>
+      <w:proofErr w:type="spellEnd"/>
+      <w:r>
+        <w:t xml:space="preserve"> (Działające)</w:t>
+      </w:r>
+    </w:p>
+    <w:p>
+      <w:r>
+        <w:t>P</w:t>
+      </w:r>
+      <w:r>
+        <w:t xml:space="preserve">osiadamy w pełni funkcjonalny moduł autoryzacji i uwierzytelniania oparty na </w:t>
+      </w:r>
+      <w:proofErr w:type="spellStart"/>
+      <w:r>
+        <w:t>tokenach</w:t>
+      </w:r>
+      <w:proofErr w:type="spellEnd"/>
+      <w:r>
+        <w:t xml:space="preserve"> (</w:t>
+      </w:r>
+      <w:proofErr w:type="spellStart"/>
+      <w:r>
+        <w:t>Token</w:t>
+      </w:r>
+      <w:proofErr w:type="spellEnd"/>
+      <w:r>
+        <w:t xml:space="preserve"> </w:t>
+      </w:r>
+      <w:proofErr w:type="spellStart"/>
+      <w:r>
+        <w:t>Authentication</w:t>
+      </w:r>
+      <w:proofErr w:type="spellEnd"/>
+      <w:r>
+        <w:t xml:space="preserve"> z </w:t>
+      </w:r>
+      <w:proofErr w:type="spellStart"/>
+      <w:r>
+        <w:t>Django</w:t>
+      </w:r>
+      <w:proofErr w:type="spellEnd"/>
+      <w:r>
+        <w:t xml:space="preserve"> REST Framework).</w:t>
+      </w:r>
+    </w:p>
+    <w:p>
+      <w:pPr>
+        <w:pStyle w:val="Nagwek3"/>
+      </w:pPr>
+      <w:r>
+        <w:t>1.1 Rejestracja Użytkownika</w:t>
       </w:r>
     </w:p>
     <w:p>
       <w:pPr>
         <w:numPr>
           <w:ilvl w:val="0"/>
-          <w:numId w:val="1"/>
+          <w:numId w:val="7"/>
         </w:numPr>
       </w:pPr>
-      <w:proofErr w:type="spellStart"/>
-      <w:r>
-        <w:rPr>
-          <w:b/>
-          <w:bCs/>
-        </w:rPr>
-        <w:t>Uzytkownik</w:t>
-      </w:r>
-      <w:proofErr w:type="spellEnd"/>
-      <w:r>
-        <w:rPr>
-          <w:b/>
-          <w:bCs/>
-        </w:rPr>
-        <w:t xml:space="preserve"> (Rozszerzenie </w:t>
-      </w:r>
-      <w:proofErr w:type="spellStart"/>
-      <w:r>
-        <w:rPr>
-          <w:b/>
-          <w:bCs/>
-        </w:rPr>
-        <w:t>AbstractUser</w:t>
-      </w:r>
-      <w:proofErr w:type="spellEnd"/>
-      <w:r>
-        <w:rPr>
-          <w:b/>
-          <w:bCs/>
-        </w:rPr>
-        <w:t>):</w:t>
-      </w:r>
-      <w:r>
-        <w:t xml:space="preserve"> Centralny punkt systemu. Przechowuje podstawowe dane logowania (login, hasło, email) oraz dedykowane pola uczelniane: rola (Student/Profesor), </w:t>
-      </w:r>
-      <w:proofErr w:type="spellStart"/>
-      <w:r>
-        <w:t>numer_indeksu</w:t>
-      </w:r>
-      <w:proofErr w:type="spellEnd"/>
-      <w:r>
-        <w:t xml:space="preserve"> i </w:t>
-      </w:r>
-      <w:proofErr w:type="spellStart"/>
-      <w:r>
-        <w:t>grupa_dziekanska</w:t>
-      </w:r>
-      <w:proofErr w:type="spellEnd"/>
-      <w:r>
-        <w:t>.</w:t>
-      </w:r>
-    </w:p>
-    <w:p>
-      <w:pPr>
-        <w:rPr>
-          <w:b/>
-          <w:bCs/>
-        </w:rPr>
-      </w:pPr>
-      <w:r>
-        <w:rPr>
-          <w:b/>
-          <w:bCs/>
-        </w:rPr>
-        <w:t>Moduł Zadań i Weryfikacji Kodu</w:t>
+      <w:r>
+        <w:rPr>
+          <w:b/>
+          <w:bCs/>
+        </w:rPr>
+        <w:t>Adres URL:</w:t>
+      </w:r>
+      <w:r>
+        <w:t xml:space="preserve"> POST /</w:t>
+      </w:r>
+      <w:proofErr w:type="spellStart"/>
+      <w:r>
+        <w:t>api</w:t>
+      </w:r>
+      <w:proofErr w:type="spellEnd"/>
+      <w:r>
+        <w:t>/rejestracja/</w:t>
       </w:r>
     </w:p>
     <w:p>
       <w:pPr>
         <w:numPr>
           <w:ilvl w:val="0"/>
-          <w:numId w:val="2"/>
+          <w:numId w:val="7"/>
         </w:numPr>
       </w:pPr>
-      <w:proofErr w:type="spellStart"/>
-      <w:r>
-        <w:rPr>
-          <w:b/>
-          <w:bCs/>
-        </w:rPr>
-        <w:t>Snippet</w:t>
-      </w:r>
-      <w:proofErr w:type="spellEnd"/>
-      <w:r>
-        <w:rPr>
-          <w:b/>
-          <w:bCs/>
-        </w:rPr>
-        <w:t>:</w:t>
-      </w:r>
-      <w:r>
-        <w:t xml:space="preserve"> Tabela pełniąca rolę notatnika. Przechowuje luźne kawałki kodu (</w:t>
-      </w:r>
-      <w:proofErr w:type="spellStart"/>
-      <w:r>
-        <w:t>code</w:t>
-      </w:r>
-      <w:proofErr w:type="spellEnd"/>
-      <w:r>
-        <w:t xml:space="preserve">, </w:t>
-      </w:r>
-      <w:proofErr w:type="spellStart"/>
-      <w:r>
-        <w:t>language</w:t>
-      </w:r>
-      <w:proofErr w:type="spellEnd"/>
-      <w:r>
-        <w:t>) tworzone przez użytkowników na "brudno", niezwiązane z żadnym konkretnym zadaniem.</w:t>
+      <w:r>
+        <w:rPr>
+          <w:b/>
+          <w:bCs/>
+        </w:rPr>
+        <w:t>Kto ma dostęp:</w:t>
+      </w:r>
+      <w:r>
+        <w:t xml:space="preserve"> Każdy (Brak kłódki / </w:t>
+      </w:r>
+      <w:proofErr w:type="spellStart"/>
+      <w:r>
+        <w:t>AllowAny</w:t>
+      </w:r>
+      <w:proofErr w:type="spellEnd"/>
+      <w:r>
+        <w:t>)</w:t>
       </w:r>
     </w:p>
     <w:p>
       <w:pPr>
         <w:numPr>
           <w:ilvl w:val="0"/>
-          <w:numId w:val="2"/>
+          <w:numId w:val="7"/>
         </w:numPr>
       </w:pPr>
-      <w:proofErr w:type="spellStart"/>
-      <w:r>
-        <w:rPr>
-          <w:b/>
-          <w:bCs/>
-        </w:rPr>
-        <w:t>Task</w:t>
-      </w:r>
-      <w:proofErr w:type="spellEnd"/>
-      <w:r>
-        <w:rPr>
-          <w:b/>
-          <w:bCs/>
-        </w:rPr>
-        <w:t xml:space="preserve"> (Zadanie):</w:t>
-      </w:r>
-      <w:r>
-        <w:t xml:space="preserve"> Główna tabela z problemami algorytmicznymi. Zawiera tytuł, treść, poziom trudności oraz flagę </w:t>
-      </w:r>
-      <w:proofErr w:type="spellStart"/>
-      <w:r>
-        <w:t>is_public</w:t>
-      </w:r>
-      <w:proofErr w:type="spellEnd"/>
-      <w:r>
-        <w:t xml:space="preserve">. Definiuje też krytyczne ograniczenia dla systemu sprawdzającego: </w:t>
-      </w:r>
-      <w:proofErr w:type="spellStart"/>
-      <w:r>
-        <w:t>time_limit</w:t>
-      </w:r>
-      <w:proofErr w:type="spellEnd"/>
-      <w:r>
-        <w:t xml:space="preserve"> (w ms) oraz </w:t>
-      </w:r>
-      <w:proofErr w:type="spellStart"/>
-      <w:r>
-        <w:t>memory_limit</w:t>
-      </w:r>
-      <w:proofErr w:type="spellEnd"/>
-      <w:r>
-        <w:t xml:space="preserve"> (w MB).</w:t>
+      <w:r>
+        <w:rPr>
+          <w:b/>
+          <w:bCs/>
+        </w:rPr>
+        <w:t xml:space="preserve">Działanie z </w:t>
+      </w:r>
+      <w:proofErr w:type="spellStart"/>
+      <w:r>
+        <w:rPr>
+          <w:b/>
+          <w:bCs/>
+        </w:rPr>
+        <w:t>frontendem</w:t>
+      </w:r>
+      <w:proofErr w:type="spellEnd"/>
+      <w:r>
+        <w:rPr>
+          <w:b/>
+          <w:bCs/>
+        </w:rPr>
+        <w:t>:</w:t>
+      </w:r>
+      <w:r>
+        <w:t xml:space="preserve"> </w:t>
+      </w:r>
+      <w:proofErr w:type="spellStart"/>
+      <w:r>
+        <w:t>Frontend</w:t>
+      </w:r>
+      <w:proofErr w:type="spellEnd"/>
+      <w:r>
+        <w:t xml:space="preserve"> wysyła obiekt JSON z danymi z formularza. </w:t>
+      </w:r>
+      <w:proofErr w:type="spellStart"/>
+      <w:r>
+        <w:t>Backend</w:t>
+      </w:r>
+      <w:proofErr w:type="spellEnd"/>
+      <w:r>
+        <w:t xml:space="preserve"> waliduje dane (sprawdza unikalność maila, poprawność ról, wymogi uczelniane). Jeśli dane są błędne, </w:t>
+      </w:r>
+      <w:proofErr w:type="spellStart"/>
+      <w:r>
+        <w:t>backend</w:t>
+      </w:r>
+      <w:proofErr w:type="spellEnd"/>
+      <w:r>
+        <w:t xml:space="preserve"> zwraca status 400 Bad </w:t>
+      </w:r>
+      <w:proofErr w:type="spellStart"/>
+      <w:r>
+        <w:t>Request</w:t>
+      </w:r>
+      <w:proofErr w:type="spellEnd"/>
+      <w:r>
+        <w:t xml:space="preserve"> wraz z obiektem zawierającym tablice błędów dla konkretnych pól (co </w:t>
+      </w:r>
+      <w:proofErr w:type="spellStart"/>
+      <w:r>
+        <w:t>frontend</w:t>
+      </w:r>
+      <w:proofErr w:type="spellEnd"/>
+      <w:r>
+        <w:t xml:space="preserve"> teraz poprawnie łapie i wyświetla w czerwonej belce).</w:t>
       </w:r>
     </w:p>
     <w:p>
       <w:pPr>
         <w:numPr>
           <w:ilvl w:val="0"/>
-          <w:numId w:val="2"/>
+          <w:numId w:val="7"/>
         </w:numPr>
       </w:pPr>
-      <w:proofErr w:type="spellStart"/>
-      <w:r>
-        <w:rPr>
-          <w:b/>
-          <w:bCs/>
-        </w:rPr>
-        <w:t>TestCase</w:t>
-      </w:r>
-      <w:proofErr w:type="spellEnd"/>
-      <w:r>
-        <w:rPr>
-          <w:b/>
-          <w:bCs/>
-        </w:rPr>
-        <w:t xml:space="preserve"> (Przypadek Testowy):</w:t>
-      </w:r>
-      <w:r>
-        <w:t xml:space="preserve"> Zestawy danych służące do weryfikacji poprawności algorytmów. Każde zadanie posiada wiele testów (relacja Jeden-do-Wielu). Model zawiera dane wejściowe (</w:t>
-      </w:r>
-      <w:proofErr w:type="spellStart"/>
-      <w:r>
-        <w:t>input_data</w:t>
-      </w:r>
-      <w:proofErr w:type="spellEnd"/>
-      <w:r>
-        <w:t>), oczekiwany wynik (</w:t>
-      </w:r>
-      <w:proofErr w:type="spellStart"/>
-      <w:r>
-        <w:t>expected_output</w:t>
-      </w:r>
-      <w:proofErr w:type="spellEnd"/>
-      <w:r>
-        <w:t xml:space="preserve">) oraz flagę </w:t>
-      </w:r>
-      <w:proofErr w:type="spellStart"/>
-      <w:r>
-        <w:t>is_sample</w:t>
-      </w:r>
-      <w:proofErr w:type="spellEnd"/>
-      <w:r>
-        <w:t xml:space="preserve"> decydującą, czy test jest widoczny dla rozwiązującego, czy ukryty.</w:t>
+      <w:r>
+        <w:rPr>
+          <w:b/>
+          <w:bCs/>
+        </w:rPr>
+        <w:t xml:space="preserve">Oczekiwany </w:t>
+      </w:r>
+      <w:proofErr w:type="spellStart"/>
+      <w:r>
+        <w:rPr>
+          <w:b/>
+          <w:bCs/>
+        </w:rPr>
+        <w:t>Payload</w:t>
+      </w:r>
+      <w:proofErr w:type="spellEnd"/>
+      <w:r>
+        <w:rPr>
+          <w:b/>
+          <w:bCs/>
+        </w:rPr>
+        <w:t xml:space="preserve"> (JSON):</w:t>
+      </w:r>
+    </w:p>
+    <w:p>
+      <w:r>
+        <w:t>JSON</w:t>
+      </w:r>
+    </w:p>
+    <w:p>
+      <w:pPr>
+        <w:shd w:val="clear" w:color="auto" w:fill="2B2B2B"/>
+        <w:rPr>
+          <w:lang w:val="en-US"/>
+        </w:rPr>
+      </w:pPr>
+      <w:r>
+        <w:rPr>
+          <w:rFonts w:ascii="Courier New" w:hAnsi="Courier New" w:cs="Courier New"/>
+          <w:color w:val="F8F8F2"/>
+          <w:lang w:val="en-US"/>
+        </w:rPr>
+        <w:t>{</w:t>
+      </w:r>
+      <w:r>
+        <w:rPr>
+          <w:rFonts w:ascii="Courier New" w:hAnsi="Courier New" w:cs="Courier New"/>
+          <w:color w:val="F8F8F2"/>
+          <w:lang w:val="en-US"/>
+        </w:rPr>
+        <w:br/>
+        <w:t xml:space="preserve">  "username": </w:t>
+      </w:r>
+      <w:r>
+        <w:rPr>
+          <w:rFonts w:ascii="Courier New" w:hAnsi="Courier New" w:cs="Courier New"/>
+          <w:color w:val="ABE338"/>
+          <w:lang w:val="en-US"/>
+        </w:rPr>
+        <w:t>"igor22"</w:t>
+      </w:r>
+      <w:r>
+        <w:rPr>
+          <w:rFonts w:ascii="Courier New" w:hAnsi="Courier New" w:cs="Courier New"/>
+          <w:color w:val="F8F8F2"/>
+          <w:lang w:val="en-US"/>
+        </w:rPr>
+        <w:t>,</w:t>
+      </w:r>
+      <w:r>
+        <w:rPr>
+          <w:rFonts w:ascii="Courier New" w:hAnsi="Courier New" w:cs="Courier New"/>
+          <w:color w:val="F8F8F2"/>
+          <w:lang w:val="en-US"/>
+        </w:rPr>
+        <w:br/>
+        <w:t xml:space="preserve">  "email": </w:t>
+      </w:r>
+      <w:r>
+        <w:rPr>
+          <w:rFonts w:ascii="Courier New" w:hAnsi="Courier New" w:cs="Courier New"/>
+          <w:color w:val="ABE338"/>
+          <w:lang w:val="en-US"/>
+        </w:rPr>
+        <w:t>"k12345@student.wat.edu.pl"</w:t>
+      </w:r>
+      <w:r>
+        <w:rPr>
+          <w:rFonts w:ascii="Courier New" w:hAnsi="Courier New" w:cs="Courier New"/>
+          <w:color w:val="F8F8F2"/>
+          <w:lang w:val="en-US"/>
+        </w:rPr>
+        <w:t>,</w:t>
+      </w:r>
+      <w:r>
+        <w:rPr>
+          <w:rFonts w:ascii="Courier New" w:hAnsi="Courier New" w:cs="Courier New"/>
+          <w:color w:val="F8F8F2"/>
+          <w:lang w:val="en-US"/>
+        </w:rPr>
+        <w:br/>
+        <w:t xml:space="preserve">  "password": </w:t>
+      </w:r>
+      <w:r>
+        <w:rPr>
+          <w:rFonts w:ascii="Courier New" w:hAnsi="Courier New" w:cs="Courier New"/>
+          <w:color w:val="ABE338"/>
+          <w:lang w:val="en-US"/>
+        </w:rPr>
+        <w:t>"SuperTajneHaslo123#"</w:t>
+      </w:r>
+      <w:r>
+        <w:rPr>
+          <w:rFonts w:ascii="Courier New" w:hAnsi="Courier New" w:cs="Courier New"/>
+          <w:color w:val="F8F8F2"/>
+          <w:lang w:val="en-US"/>
+        </w:rPr>
+        <w:t>,</w:t>
+      </w:r>
+      <w:r>
+        <w:rPr>
+          <w:rFonts w:ascii="Courier New" w:hAnsi="Courier New" w:cs="Courier New"/>
+          <w:color w:val="F8F8F2"/>
+          <w:lang w:val="en-US"/>
+        </w:rPr>
+        <w:br/>
+        <w:t xml:space="preserve">  "</w:t>
+      </w:r>
+      <w:proofErr w:type="spellStart"/>
+      <w:r>
+        <w:rPr>
+          <w:rFonts w:ascii="Courier New" w:hAnsi="Courier New" w:cs="Courier New"/>
+          <w:color w:val="F8F8F2"/>
+          <w:lang w:val="en-US"/>
+        </w:rPr>
+        <w:t>first_name</w:t>
+      </w:r>
+      <w:proofErr w:type="spellEnd"/>
+      <w:r>
+        <w:rPr>
+          <w:rFonts w:ascii="Courier New" w:hAnsi="Courier New" w:cs="Courier New"/>
+          <w:color w:val="F8F8F2"/>
+          <w:lang w:val="en-US"/>
+        </w:rPr>
+        <w:t xml:space="preserve">": </w:t>
+      </w:r>
+      <w:r>
+        <w:rPr>
+          <w:rFonts w:ascii="Courier New" w:hAnsi="Courier New" w:cs="Courier New"/>
+          <w:color w:val="ABE338"/>
+          <w:lang w:val="en-US"/>
+        </w:rPr>
+        <w:t>"Igor"</w:t>
+      </w:r>
+      <w:r>
+        <w:rPr>
+          <w:rFonts w:ascii="Courier New" w:hAnsi="Courier New" w:cs="Courier New"/>
+          <w:color w:val="F8F8F2"/>
+          <w:lang w:val="en-US"/>
+        </w:rPr>
+        <w:t>,</w:t>
+      </w:r>
+      <w:r>
+        <w:rPr>
+          <w:rFonts w:ascii="Courier New" w:hAnsi="Courier New" w:cs="Courier New"/>
+          <w:color w:val="F8F8F2"/>
+          <w:lang w:val="en-US"/>
+        </w:rPr>
+        <w:br/>
+        <w:t xml:space="preserve">  "</w:t>
+      </w:r>
+      <w:proofErr w:type="spellStart"/>
+      <w:r>
+        <w:rPr>
+          <w:rFonts w:ascii="Courier New" w:hAnsi="Courier New" w:cs="Courier New"/>
+          <w:color w:val="F8F8F2"/>
+          <w:lang w:val="en-US"/>
+        </w:rPr>
+        <w:t>last_name</w:t>
+      </w:r>
+      <w:proofErr w:type="spellEnd"/>
+      <w:r>
+        <w:rPr>
+          <w:rFonts w:ascii="Courier New" w:hAnsi="Courier New" w:cs="Courier New"/>
+          <w:color w:val="F8F8F2"/>
+          <w:lang w:val="en-US"/>
+        </w:rPr>
+        <w:t xml:space="preserve">": </w:t>
+      </w:r>
+      <w:r>
+        <w:rPr>
+          <w:rFonts w:ascii="Courier New" w:hAnsi="Courier New" w:cs="Courier New"/>
+          <w:color w:val="ABE338"/>
+          <w:lang w:val="en-US"/>
+        </w:rPr>
+        <w:t>"Filipiak"</w:t>
+      </w:r>
+      <w:r>
+        <w:rPr>
+          <w:rFonts w:ascii="Courier New" w:hAnsi="Courier New" w:cs="Courier New"/>
+          <w:color w:val="F8F8F2"/>
+          <w:lang w:val="en-US"/>
+        </w:rPr>
+        <w:t>,</w:t>
+      </w:r>
+      <w:r>
+        <w:rPr>
+          <w:rFonts w:ascii="Courier New" w:hAnsi="Courier New" w:cs="Courier New"/>
+          <w:color w:val="F8F8F2"/>
+          <w:lang w:val="en-US"/>
+        </w:rPr>
+        <w:br/>
+        <w:t xml:space="preserve">  "</w:t>
+      </w:r>
+      <w:proofErr w:type="spellStart"/>
+      <w:r>
+        <w:rPr>
+          <w:rFonts w:ascii="Courier New" w:hAnsi="Courier New" w:cs="Courier New"/>
+          <w:color w:val="F8F8F2"/>
+          <w:lang w:val="en-US"/>
+        </w:rPr>
+        <w:t>rola</w:t>
+      </w:r>
+      <w:proofErr w:type="spellEnd"/>
+      <w:r>
+        <w:rPr>
+          <w:rFonts w:ascii="Courier New" w:hAnsi="Courier New" w:cs="Courier New"/>
+          <w:color w:val="F8F8F2"/>
+          <w:lang w:val="en-US"/>
+        </w:rPr>
+        <w:t xml:space="preserve">": </w:t>
+      </w:r>
+      <w:r>
+        <w:rPr>
+          <w:rFonts w:ascii="Courier New" w:hAnsi="Courier New" w:cs="Courier New"/>
+          <w:color w:val="ABE338"/>
+          <w:lang w:val="en-US"/>
+        </w:rPr>
+        <w:t>"student"</w:t>
+      </w:r>
+      <w:r>
+        <w:rPr>
+          <w:rFonts w:ascii="Courier New" w:hAnsi="Courier New" w:cs="Courier New"/>
+          <w:color w:val="F8F8F2"/>
+          <w:lang w:val="en-US"/>
+        </w:rPr>
+        <w:t>,</w:t>
+      </w:r>
+      <w:r>
+        <w:rPr>
+          <w:rFonts w:ascii="Courier New" w:hAnsi="Courier New" w:cs="Courier New"/>
+          <w:color w:val="F8F8F2"/>
+          <w:lang w:val="en-US"/>
+        </w:rPr>
+        <w:br/>
+        <w:t xml:space="preserve">  "</w:t>
+      </w:r>
+      <w:proofErr w:type="spellStart"/>
+      <w:r>
+        <w:rPr>
+          <w:rFonts w:ascii="Courier New" w:hAnsi="Courier New" w:cs="Courier New"/>
+          <w:color w:val="F8F8F2"/>
+          <w:lang w:val="en-US"/>
+        </w:rPr>
+        <w:t>grupa_dziekanska</w:t>
+      </w:r>
+      <w:proofErr w:type="spellEnd"/>
+      <w:r>
+        <w:rPr>
+          <w:rFonts w:ascii="Courier New" w:hAnsi="Courier New" w:cs="Courier New"/>
+          <w:color w:val="F8F8F2"/>
+          <w:lang w:val="en-US"/>
+        </w:rPr>
+        <w:t xml:space="preserve">": </w:t>
+      </w:r>
+      <w:r>
+        <w:rPr>
+          <w:rFonts w:ascii="Courier New" w:hAnsi="Courier New" w:cs="Courier New"/>
+          <w:color w:val="ABE338"/>
+          <w:lang w:val="en-US"/>
+        </w:rPr>
+        <w:t>"WCY24KY2S1"</w:t>
+      </w:r>
+      <w:r>
+        <w:rPr>
+          <w:rFonts w:ascii="Courier New" w:hAnsi="Courier New" w:cs="Courier New"/>
+          <w:color w:val="F8F8F2"/>
+          <w:lang w:val="en-US"/>
+        </w:rPr>
+        <w:t>,</w:t>
+      </w:r>
+      <w:r>
+        <w:rPr>
+          <w:rFonts w:ascii="Courier New" w:hAnsi="Courier New" w:cs="Courier New"/>
+          <w:color w:val="F8F8F2"/>
+          <w:lang w:val="en-US"/>
+        </w:rPr>
+        <w:br/>
+        <w:t xml:space="preserve">  "</w:t>
+      </w:r>
+      <w:proofErr w:type="spellStart"/>
+      <w:r>
+        <w:rPr>
+          <w:rFonts w:ascii="Courier New" w:hAnsi="Courier New" w:cs="Courier New"/>
+          <w:color w:val="F8F8F2"/>
+          <w:lang w:val="en-US"/>
+        </w:rPr>
+        <w:t>numer_indeksu</w:t>
+      </w:r>
+      <w:proofErr w:type="spellEnd"/>
+      <w:r>
+        <w:rPr>
+          <w:rFonts w:ascii="Courier New" w:hAnsi="Courier New" w:cs="Courier New"/>
+          <w:color w:val="F8F8F2"/>
+          <w:lang w:val="en-US"/>
+        </w:rPr>
+        <w:t xml:space="preserve">": </w:t>
+      </w:r>
+      <w:r>
+        <w:rPr>
+          <w:rFonts w:ascii="Courier New" w:hAnsi="Courier New" w:cs="Courier New"/>
+          <w:color w:val="ABE338"/>
+          <w:lang w:val="en-US"/>
+        </w:rPr>
+        <w:t>"11111"</w:t>
+      </w:r>
+      <w:r>
+        <w:rPr>
+          <w:rFonts w:ascii="Courier New" w:hAnsi="Courier New" w:cs="Courier New"/>
+          <w:color w:val="F8F8F2"/>
+          <w:lang w:val="en-US"/>
+        </w:rPr>
+        <w:br/>
+        <w:t>}</w:t>
       </w:r>
     </w:p>
     <w:p>
       <w:pPr>
         <w:numPr>
           <w:ilvl w:val="0"/>
-          <w:numId w:val="2"/>
+          <w:numId w:val="7"/>
         </w:numPr>
       </w:pPr>
       <w:r>
@@ -604,352 +1949,532 @@
           <w:b/>
           <w:bCs/>
         </w:rPr>
-        <w:t>Solution (Rozwiązanie):</w:t>
-      </w:r>
-      <w:r>
-        <w:t xml:space="preserve"> Łącznik pomiędzy Użytkownikiem a Zadaniem. Zapisuje wysłany kod źródłowy, język programowania oraz ewentualny opis (</w:t>
-      </w:r>
-      <w:proofErr w:type="spellStart"/>
-      <w:r>
-        <w:t>Markdown</w:t>
-      </w:r>
-      <w:proofErr w:type="spellEnd"/>
-      <w:r>
-        <w:t xml:space="preserve">). </w:t>
-      </w:r>
-      <w:r>
-        <w:lastRenderedPageBreak/>
-        <w:t>Baza przechowuje tu również fizyczny czas wykonania i zużytą pamięć podczas ewaluacji oraz ostateczny status (np. Zaakceptowane, Błąd Kompilacji).</w:t>
-      </w:r>
-    </w:p>
-    <w:p>
-      <w:pPr>
-        <w:rPr>
-          <w:b/>
-          <w:bCs/>
-        </w:rPr>
-      </w:pPr>
-      <w:r>
-        <w:rPr>
-          <w:b/>
-          <w:bCs/>
-        </w:rPr>
-        <w:t>Moduł Społeczności</w:t>
-      </w:r>
+        <w:t>Poprawna Odpowiedź:</w:t>
+      </w:r>
+      <w:r>
+        <w:t xml:space="preserve"> Status 201 </w:t>
+      </w:r>
+      <w:proofErr w:type="spellStart"/>
+      <w:r>
+        <w:t>Created</w:t>
+      </w:r>
+      <w:proofErr w:type="spellEnd"/>
+    </w:p>
+    <w:p>
+      <w:pPr>
+        <w:pStyle w:val="Nagwek3"/>
+      </w:pPr>
+      <w:r>
+        <w:t xml:space="preserve">1.2 Logowanie i Pobieranie </w:t>
+      </w:r>
+      <w:proofErr w:type="spellStart"/>
+      <w:r>
+        <w:t>Tokenu</w:t>
+      </w:r>
+      <w:proofErr w:type="spellEnd"/>
     </w:p>
     <w:p>
       <w:pPr>
         <w:numPr>
           <w:ilvl w:val="0"/>
-          <w:numId w:val="3"/>
+          <w:numId w:val="8"/>
         </w:numPr>
       </w:pPr>
-      <w:proofErr w:type="spellStart"/>
-      <w:r>
-        <w:rPr>
-          <w:b/>
-          <w:bCs/>
-        </w:rPr>
-        <w:t>CodeGroup</w:t>
-      </w:r>
-      <w:proofErr w:type="spellEnd"/>
-      <w:r>
-        <w:rPr>
-          <w:b/>
-          <w:bCs/>
-        </w:rPr>
-        <w:t xml:space="preserve"> (Grupa):</w:t>
-      </w:r>
-      <w:r>
-        <w:t xml:space="preserve"> Reprezentuje zrzeszenie użytkowników (np. konkretną klasę na uczelni). Definiuje nazwę, opis oraz flagę </w:t>
-      </w:r>
-      <w:proofErr w:type="spellStart"/>
-      <w:r>
-        <w:t>is_open</w:t>
-      </w:r>
-      <w:proofErr w:type="spellEnd"/>
-      <w:r>
-        <w:t>, która określa, czy do grupy można dołączyć z "ulicy".</w:t>
+      <w:r>
+        <w:rPr>
+          <w:b/>
+          <w:bCs/>
+        </w:rPr>
+        <w:t>Adres URL:</w:t>
+      </w:r>
+      <w:r>
+        <w:t xml:space="preserve"> POST /</w:t>
+      </w:r>
+      <w:proofErr w:type="spellStart"/>
+      <w:r>
+        <w:t>api</w:t>
+      </w:r>
+      <w:proofErr w:type="spellEnd"/>
+      <w:r>
+        <w:t>/log</w:t>
+      </w:r>
+      <w:r>
+        <w:t>owanie</w:t>
+      </w:r>
+      <w:r>
+        <w:t>/ (lub odpowiednik zdefiniowany w urls.py)</w:t>
       </w:r>
     </w:p>
     <w:p>
       <w:pPr>
         <w:numPr>
           <w:ilvl w:val="0"/>
-          <w:numId w:val="3"/>
+          <w:numId w:val="8"/>
         </w:numPr>
       </w:pPr>
-      <w:proofErr w:type="spellStart"/>
-      <w:r>
-        <w:rPr>
-          <w:b/>
-          <w:bCs/>
-        </w:rPr>
-        <w:t>GroupMembership</w:t>
-      </w:r>
-      <w:proofErr w:type="spellEnd"/>
-      <w:r>
-        <w:rPr>
-          <w:b/>
-          <w:bCs/>
-        </w:rPr>
-        <w:t>:</w:t>
-      </w:r>
-      <w:r>
-        <w:t xml:space="preserve"> Tabela pośrednia (</w:t>
-      </w:r>
-      <w:proofErr w:type="spellStart"/>
-      <w:r>
-        <w:t>Many-to-Many</w:t>
-      </w:r>
-      <w:proofErr w:type="spellEnd"/>
-      <w:r>
-        <w:t>) decydująca o tym, kto należy do jakiej grupy. Co ważne, przechowuje również role, pozwalając odróżnić zwykłego członka od Administratora danej grupy.</w:t>
-      </w:r>
-    </w:p>
-    <w:p>
-      <w:pPr>
-        <w:rPr>
-          <w:b/>
-          <w:bCs/>
-        </w:rPr>
-      </w:pPr>
-      <w:r>
-        <w:rPr>
-          <w:b/>
-          <w:bCs/>
-        </w:rPr>
-        <w:t>Moduł Turniejowy (Konkursy)</w:t>
+      <w:r>
+        <w:rPr>
+          <w:b/>
+          <w:bCs/>
+        </w:rPr>
+        <w:t>Kto ma dostęp:</w:t>
+      </w:r>
+      <w:r>
+        <w:t xml:space="preserve"> Każdy</w:t>
       </w:r>
     </w:p>
     <w:p>
       <w:pPr>
         <w:numPr>
           <w:ilvl w:val="0"/>
-          <w:numId w:val="4"/>
+          <w:numId w:val="8"/>
         </w:numPr>
       </w:pPr>
-      <w:proofErr w:type="spellStart"/>
-      <w:r>
-        <w:rPr>
-          <w:b/>
-          <w:bCs/>
-        </w:rPr>
-        <w:t>Contest</w:t>
-      </w:r>
-      <w:proofErr w:type="spellEnd"/>
-      <w:r>
-        <w:rPr>
-          <w:b/>
-          <w:bCs/>
-        </w:rPr>
-        <w:t xml:space="preserve"> (Konkurs):</w:t>
-      </w:r>
-      <w:r>
-        <w:t xml:space="preserve"> Organizuje zadania w ograniczone czasowo ramy (</w:t>
-      </w:r>
-      <w:proofErr w:type="spellStart"/>
-      <w:r>
-        <w:t>start_time</w:t>
-      </w:r>
-      <w:proofErr w:type="spellEnd"/>
-      <w:r>
-        <w:t xml:space="preserve">, </w:t>
-      </w:r>
-      <w:proofErr w:type="spellStart"/>
-      <w:r>
-        <w:t>end_time</w:t>
-      </w:r>
-      <w:proofErr w:type="spellEnd"/>
-      <w:r>
-        <w:t xml:space="preserve">). Posiada flagę </w:t>
-      </w:r>
-      <w:proofErr w:type="spellStart"/>
-      <w:r>
-        <w:t>strict_mode</w:t>
-      </w:r>
-      <w:proofErr w:type="spellEnd"/>
-      <w:r>
-        <w:t xml:space="preserve">, która aktywuje na </w:t>
-      </w:r>
-      <w:proofErr w:type="spellStart"/>
-      <w:r>
-        <w:t>frontendzie</w:t>
-      </w:r>
-      <w:proofErr w:type="spellEnd"/>
-      <w:r>
-        <w:t xml:space="preserve"> tryb zabezpieczeń </w:t>
-      </w:r>
-      <w:proofErr w:type="spellStart"/>
-      <w:r>
-        <w:t>antysciągowych</w:t>
-      </w:r>
-      <w:proofErr w:type="spellEnd"/>
-      <w:r>
-        <w:t xml:space="preserve"> (np. blokadę wyjścia z karty przeglądarki).</w:t>
+      <w:r>
+        <w:rPr>
+          <w:b/>
+          <w:bCs/>
+        </w:rPr>
+        <w:t xml:space="preserve">Działanie z </w:t>
+      </w:r>
+      <w:proofErr w:type="spellStart"/>
+      <w:r>
+        <w:rPr>
+          <w:b/>
+          <w:bCs/>
+        </w:rPr>
+        <w:t>frontendem</w:t>
+      </w:r>
+      <w:proofErr w:type="spellEnd"/>
+      <w:r>
+        <w:rPr>
+          <w:b/>
+          <w:bCs/>
+        </w:rPr>
+        <w:t>:</w:t>
+      </w:r>
+      <w:r>
+        <w:t xml:space="preserve"> </w:t>
+      </w:r>
+      <w:proofErr w:type="spellStart"/>
+      <w:r>
+        <w:t>Frontend</w:t>
+      </w:r>
+      <w:proofErr w:type="spellEnd"/>
+      <w:r>
+        <w:t xml:space="preserve"> wysyła poświadczenia logowania. Jeśli są poprawne, </w:t>
+      </w:r>
+      <w:proofErr w:type="spellStart"/>
+      <w:r>
+        <w:t>Django</w:t>
+      </w:r>
+      <w:proofErr w:type="spellEnd"/>
+      <w:r>
+        <w:t xml:space="preserve"> nie zwraca ciasteczek sesyjnych, lecz generuje unikalny </w:t>
+      </w:r>
+      <w:proofErr w:type="spellStart"/>
+      <w:r>
+        <w:rPr>
+          <w:b/>
+          <w:bCs/>
+        </w:rPr>
+        <w:t>Token</w:t>
+      </w:r>
+      <w:proofErr w:type="spellEnd"/>
+      <w:r>
+        <w:t xml:space="preserve"> (widoczny w naszej bazie jako </w:t>
+      </w:r>
+      <w:proofErr w:type="spellStart"/>
+      <w:r>
+        <w:t>TokenProxy</w:t>
+      </w:r>
+      <w:proofErr w:type="spellEnd"/>
+      <w:r>
+        <w:t xml:space="preserve">). </w:t>
+      </w:r>
+      <w:proofErr w:type="spellStart"/>
+      <w:r>
+        <w:t>Frontend</w:t>
+      </w:r>
+      <w:proofErr w:type="spellEnd"/>
+      <w:r>
+        <w:t xml:space="preserve"> musi przechwycić ten </w:t>
+      </w:r>
+      <w:proofErr w:type="spellStart"/>
+      <w:r>
+        <w:t>token</w:t>
+      </w:r>
+      <w:proofErr w:type="spellEnd"/>
+      <w:r>
+        <w:t xml:space="preserve"> i zapisać go u siebie (najlepiej w </w:t>
+      </w:r>
+      <w:proofErr w:type="spellStart"/>
+      <w:r>
+        <w:t>localStorage</w:t>
+      </w:r>
+      <w:proofErr w:type="spellEnd"/>
+      <w:r>
+        <w:t xml:space="preserve"> lub </w:t>
+      </w:r>
+      <w:proofErr w:type="spellStart"/>
+      <w:r>
+        <w:t>sessionStorage</w:t>
+      </w:r>
+      <w:proofErr w:type="spellEnd"/>
+      <w:r>
+        <w:t xml:space="preserve">). Od tego momentu przy </w:t>
+      </w:r>
+      <w:r>
+        <w:rPr>
+          <w:b/>
+          <w:bCs/>
+        </w:rPr>
+        <w:t>każdym</w:t>
+      </w:r>
+      <w:r>
+        <w:t xml:space="preserve"> kolejnym zapytaniu (np. o listę zadań), </w:t>
+      </w:r>
+      <w:proofErr w:type="spellStart"/>
+      <w:r>
+        <w:t>React</w:t>
+      </w:r>
+      <w:proofErr w:type="spellEnd"/>
+      <w:r>
+        <w:t xml:space="preserve"> musi doklejać ten </w:t>
+      </w:r>
+      <w:proofErr w:type="spellStart"/>
+      <w:r>
+        <w:t>token</w:t>
+      </w:r>
+      <w:proofErr w:type="spellEnd"/>
+      <w:r>
+        <w:t xml:space="preserve"> do nagłówków HTTP: </w:t>
+      </w:r>
+      <w:proofErr w:type="spellStart"/>
+      <w:r>
+        <w:t>Authorization</w:t>
+      </w:r>
+      <w:proofErr w:type="spellEnd"/>
+      <w:r>
+        <w:t xml:space="preserve">: </w:t>
+      </w:r>
+      <w:proofErr w:type="spellStart"/>
+      <w:r>
+        <w:t>Token</w:t>
+      </w:r>
+      <w:proofErr w:type="spellEnd"/>
+      <w:r>
+        <w:t xml:space="preserve"> &lt;</w:t>
+      </w:r>
+      <w:proofErr w:type="spellStart"/>
+      <w:r>
+        <w:t>twój_ciag_znakow</w:t>
+      </w:r>
+      <w:proofErr w:type="spellEnd"/>
+      <w:r>
+        <w:t>&gt;.</w:t>
       </w:r>
     </w:p>
     <w:p>
       <w:pPr>
         <w:numPr>
           <w:ilvl w:val="0"/>
-          <w:numId w:val="4"/>
+          <w:numId w:val="8"/>
         </w:numPr>
       </w:pPr>
-      <w:proofErr w:type="spellStart"/>
-      <w:r>
-        <w:rPr>
-          <w:b/>
-          <w:bCs/>
-        </w:rPr>
-        <w:t>ContestParticipation</w:t>
-      </w:r>
-      <w:proofErr w:type="spellEnd"/>
-      <w:r>
-        <w:rPr>
-          <w:b/>
-          <w:bCs/>
-        </w:rPr>
-        <w:t>:</w:t>
-      </w:r>
-      <w:r>
-        <w:t xml:space="preserve"> Tabela pośrednia łącząca Konkurs z Grupami startującymi. Rejestruje łączny wynik (</w:t>
-      </w:r>
-      <w:proofErr w:type="spellStart"/>
-      <w:r>
-        <w:t>total_score</w:t>
-      </w:r>
-      <w:proofErr w:type="spellEnd"/>
-      <w:r>
-        <w:t>) oraz status ewentualnej dyskwalifikacji (</w:t>
-      </w:r>
-      <w:proofErr w:type="spellStart"/>
-      <w:r>
-        <w:t>is_disqualified</w:t>
-      </w:r>
-      <w:proofErr w:type="spellEnd"/>
-      <w:r>
-        <w:t>).</w:t>
-      </w:r>
-    </w:p>
+      <w:r>
+        <w:rPr>
+          <w:b/>
+          <w:bCs/>
+        </w:rPr>
+        <w:lastRenderedPageBreak/>
+        <w:t xml:space="preserve">Oczekiwany </w:t>
+      </w:r>
+      <w:proofErr w:type="spellStart"/>
+      <w:r>
+        <w:rPr>
+          <w:b/>
+          <w:bCs/>
+        </w:rPr>
+        <w:t>Payload</w:t>
+      </w:r>
+      <w:proofErr w:type="spellEnd"/>
+      <w:r>
+        <w:rPr>
+          <w:b/>
+          <w:bCs/>
+        </w:rPr>
+        <w:t xml:space="preserve"> (JSON):</w:t>
+      </w:r>
+    </w:p>
+    <w:p>
+      <w:r>
+        <w:t>JSON</w:t>
+      </w:r>
+    </w:p>
+    <w:p>
+      <w:pPr>
+        <w:shd w:val="clear" w:color="auto" w:fill="2B2B2B"/>
+      </w:pPr>
+      <w:r>
+        <w:rPr>
+          <w:rFonts w:ascii="Courier New" w:hAnsi="Courier New" w:cs="Courier New"/>
+          <w:color w:val="F8F8F2"/>
+        </w:rPr>
+        <w:t>{</w:t>
+      </w:r>
+      <w:r>
+        <w:rPr>
+          <w:rFonts w:ascii="Courier New" w:hAnsi="Courier New" w:cs="Courier New"/>
+          <w:color w:val="F8F8F2"/>
+        </w:rPr>
+        <w:br/>
+        <w:t xml:space="preserve">  "</w:t>
+      </w:r>
+      <w:proofErr w:type="spellStart"/>
+      <w:r>
+        <w:rPr>
+          <w:rFonts w:ascii="Courier New" w:hAnsi="Courier New" w:cs="Courier New"/>
+          <w:color w:val="F8F8F2"/>
+        </w:rPr>
+        <w:t>username</w:t>
+      </w:r>
+      <w:proofErr w:type="spellEnd"/>
+      <w:r>
+        <w:rPr>
+          <w:rFonts w:ascii="Courier New" w:hAnsi="Courier New" w:cs="Courier New"/>
+          <w:color w:val="F8F8F2"/>
+        </w:rPr>
+        <w:t xml:space="preserve">": </w:t>
+      </w:r>
+      <w:r>
+        <w:rPr>
+          <w:rFonts w:ascii="Courier New" w:hAnsi="Courier New" w:cs="Courier New"/>
+          <w:color w:val="ABE338"/>
+        </w:rPr>
+        <w:t>"igor22"</w:t>
+      </w:r>
+      <w:r>
+        <w:rPr>
+          <w:rFonts w:ascii="Courier New" w:hAnsi="Courier New" w:cs="Courier New"/>
+          <w:color w:val="F8F8F2"/>
+        </w:rPr>
+        <w:t>,</w:t>
+      </w:r>
+      <w:r>
+        <w:rPr>
+          <w:rFonts w:ascii="Courier New" w:hAnsi="Courier New" w:cs="Courier New"/>
+          <w:color w:val="F8F8F2"/>
+        </w:rPr>
+        <w:br/>
+        <w:t xml:space="preserve">  "</w:t>
+      </w:r>
+      <w:proofErr w:type="spellStart"/>
+      <w:r>
+        <w:rPr>
+          <w:rFonts w:ascii="Courier New" w:hAnsi="Courier New" w:cs="Courier New"/>
+          <w:color w:val="F8F8F2"/>
+        </w:rPr>
+        <w:t>password</w:t>
+      </w:r>
+      <w:proofErr w:type="spellEnd"/>
+      <w:r>
+        <w:rPr>
+          <w:rFonts w:ascii="Courier New" w:hAnsi="Courier New" w:cs="Courier New"/>
+          <w:color w:val="F8F8F2"/>
+        </w:rPr>
+        <w:t xml:space="preserve">": </w:t>
+      </w:r>
+      <w:r>
+        <w:rPr>
+          <w:rFonts w:ascii="Courier New" w:hAnsi="Courier New" w:cs="Courier New"/>
+          <w:color w:val="ABE338"/>
+        </w:rPr>
+        <w:t>"SuperTajneHaslo123#"</w:t>
+      </w:r>
+      <w:r>
+        <w:rPr>
+          <w:rFonts w:ascii="Courier New" w:hAnsi="Courier New" w:cs="Courier New"/>
+          <w:color w:val="F8F8F2"/>
+        </w:rPr>
+        <w:br/>
+        <w:t>}</w:t>
+      </w:r>
+    </w:p>
+    <w:p/>
     <w:p>
       <w:pPr>
         <w:numPr>
           <w:ilvl w:val="0"/>
-          <w:numId w:val="4"/>
+          <w:numId w:val="8"/>
         </w:numPr>
       </w:pPr>
-      <w:proofErr w:type="spellStart"/>
-      <w:r>
-        <w:rPr>
-          <w:b/>
-          <w:bCs/>
-        </w:rPr>
-        <w:t>ContestHost</w:t>
-      </w:r>
-      <w:proofErr w:type="spellEnd"/>
-      <w:r>
-        <w:rPr>
-          <w:b/>
-          <w:bCs/>
-        </w:rPr>
+      <w:r>
+        <w:rPr>
+          <w:b/>
+          <w:bCs/>
+        </w:rPr>
+        <w:t>Poprawna Odpowiedź:</w:t>
+      </w:r>
+      <w:r>
+        <w:t xml:space="preserve"> Status 200 OK</w:t>
+      </w:r>
+    </w:p>
+    <w:p>
+      <w:r>
+        <w:t>JSON</w:t>
+      </w:r>
+    </w:p>
+    <w:p>
+      <w:pPr>
+        <w:shd w:val="clear" w:color="auto" w:fill="2B2B2B"/>
+      </w:pPr>
+      <w:r>
+        <w:rPr>
+          <w:rFonts w:ascii="Courier New" w:hAnsi="Courier New" w:cs="Courier New"/>
+          <w:color w:val="F8F8F2"/>
+        </w:rPr>
+        <w:t>{</w:t>
+      </w:r>
+      <w:r>
+        <w:rPr>
+          <w:rFonts w:ascii="Courier New" w:hAnsi="Courier New" w:cs="Courier New"/>
+          <w:color w:val="F8F8F2"/>
+        </w:rPr>
+        <w:br/>
+        <w:t xml:space="preserve">  "token": </w:t>
+      </w:r>
+      <w:r>
+        <w:rPr>
+          <w:rFonts w:ascii="Courier New" w:hAnsi="Courier New" w:cs="Courier New"/>
+          <w:color w:val="ABE338"/>
+        </w:rPr>
+        <w:t>"9944b09199c62bcf9418ad846dd0e4bbdfc6ee4b"</w:t>
+      </w:r>
+      <w:r>
+        <w:rPr>
+          <w:rFonts w:ascii="Courier New" w:hAnsi="Courier New" w:cs="Courier New"/>
+          <w:color w:val="F8F8F2"/>
+        </w:rPr>
+        <w:br/>
+        <w:t>}</w:t>
+      </w:r>
+    </w:p>
+    <w:p/>
+    <w:p>
+      <w:pPr>
+        <w:pStyle w:val="Nagwek2"/>
+      </w:pPr>
+      <w:r>
+        <w:t xml:space="preserve">2. Następne Wymagane </w:t>
+      </w:r>
+      <w:proofErr w:type="spellStart"/>
+      <w:r>
+        <w:t>Endpointy</w:t>
+      </w:r>
+      <w:proofErr w:type="spellEnd"/>
+    </w:p>
+    <w:p>
+      <w:r>
+        <w:t xml:space="preserve">Mając gotową bazę danych i system logowania, musimy teraz stworzyć "okna" na resztę naszego systemu. Zgodnie z naszą architekturą (models.py) i historyjkami użytkownika, w najbliższym czasie będziemy musieli napisać w views.py następujące </w:t>
+      </w:r>
+      <w:proofErr w:type="spellStart"/>
+      <w:r>
+        <w:t>endpointy</w:t>
+      </w:r>
+      <w:proofErr w:type="spellEnd"/>
+      <w:r>
         <w:t>:</w:t>
       </w:r>
-      <w:r>
-        <w:t xml:space="preserve"> Tabela delegująca uprawnienia. Pozwala Głównemu Twórcy konkursu przypisać innych użytkowników jako sędziów/pomocników z precyzyjnie określonymi prawami (np. możliwość modyfikacji zadań, wyrzucania grup).</w:t>
-      </w:r>
-    </w:p>
-    <w:p>
-      <w:pPr>
-        <w:rPr>
-          <w:b/>
-          <w:bCs/>
-        </w:rPr>
-      </w:pPr>
-      <w:r>
-        <w:rPr>
-          <w:b/>
-          <w:bCs/>
-        </w:rPr>
-        <w:t>Moduł Zgłoszeń</w:t>
+    </w:p>
+    <w:p>
+      <w:pPr>
+        <w:rPr>
+          <w:b/>
+          <w:bCs/>
+        </w:rPr>
+      </w:pPr>
+      <w:r>
+        <w:rPr>
+          <w:b/>
+          <w:bCs/>
+        </w:rPr>
+        <w:t>Moduł Zadań (Priorytet)</w:t>
+      </w:r>
+    </w:p>
+    <w:p>
+      <w:proofErr w:type="spellStart"/>
+      <w:r>
+        <w:t>Frontend</w:t>
+      </w:r>
+      <w:proofErr w:type="spellEnd"/>
+      <w:r>
+        <w:t xml:space="preserve"> nie ma obecnie czego wyświetlać po zalogowaniu. Musimy wystawić zadania.</w:t>
       </w:r>
     </w:p>
     <w:p>
       <w:pPr>
         <w:numPr>
           <w:ilvl w:val="0"/>
-          <w:numId w:val="5"/>
+          <w:numId w:val="9"/>
         </w:numPr>
       </w:pPr>
-      <w:proofErr w:type="spellStart"/>
-      <w:r>
-        <w:rPr>
-          <w:b/>
-          <w:bCs/>
-        </w:rPr>
-        <w:t>TaskReport</w:t>
-      </w:r>
-      <w:proofErr w:type="spellEnd"/>
-      <w:r>
-        <w:rPr>
-          <w:b/>
-          <w:bCs/>
-        </w:rPr>
-        <w:t xml:space="preserve"> (Zgłoszenie/</w:t>
-      </w:r>
-      <w:proofErr w:type="spellStart"/>
-      <w:r>
-        <w:rPr>
-          <w:b/>
-          <w:bCs/>
-        </w:rPr>
-        <w:t>Ticket</w:t>
-      </w:r>
-      <w:proofErr w:type="spellEnd"/>
-      <w:r>
-        <w:rPr>
-          <w:b/>
-          <w:bCs/>
-        </w:rPr>
-        <w:t>):</w:t>
-      </w:r>
-      <w:r>
-        <w:t xml:space="preserve"> Pozwala użytkownikom zgłaszać problemy z zadaniami (np. błędny test ukryty). Łączy konkretne zadanie z osobą zgłaszającą i udostępnia status rozwiązania problemu (</w:t>
-      </w:r>
-      <w:proofErr w:type="spellStart"/>
-      <w:r>
-        <w:t>is_resolved</w:t>
-      </w:r>
-      <w:proofErr w:type="spellEnd"/>
-      <w:r>
-        <w:t>).</w:t>
-      </w:r>
-    </w:p>
-    <w:p>
-      <w:r>
-        <w:pict w14:anchorId="5F918391">
-          <v:rect id="_x0000_i1026" style="width:0;height:1.5pt" o:hralign="center" o:hrstd="t" o:hr="t" fillcolor="#a0a0a0" stroked="f"/>
-        </w:pict>
-      </w:r>
-    </w:p>
-    <w:p>
-      <w:pPr>
-        <w:pStyle w:val="Nagwek2"/>
-      </w:pPr>
-      <w:r>
-        <w:t>3. Pokrycie Wymagań Biznesowych (Historie Użytkowników - HU)</w:t>
-      </w:r>
-    </w:p>
-    <w:p>
-      <w:r>
-        <w:t>Architektura została ściśle dopasowana do wymagań projektowych. Tabela poniżej przedstawia, jak poszczególne modele realizują założenia HU:</w:t>
+      <w:r>
+        <w:rPr>
+          <w:b/>
+          <w:bCs/>
+        </w:rPr>
+        <w:t>GET /</w:t>
+      </w:r>
+      <w:proofErr w:type="spellStart"/>
+      <w:r>
+        <w:rPr>
+          <w:b/>
+          <w:bCs/>
+        </w:rPr>
+        <w:t>api</w:t>
+      </w:r>
+      <w:proofErr w:type="spellEnd"/>
+      <w:r>
+        <w:rPr>
+          <w:b/>
+          <w:bCs/>
+        </w:rPr>
+        <w:t>/</w:t>
+      </w:r>
+      <w:proofErr w:type="spellStart"/>
+      <w:r>
+        <w:rPr>
+          <w:b/>
+          <w:bCs/>
+        </w:rPr>
+        <w:t>tasks</w:t>
+      </w:r>
+      <w:proofErr w:type="spellEnd"/>
+      <w:r>
+        <w:rPr>
+          <w:b/>
+          <w:bCs/>
+        </w:rPr>
+        <w:t>/</w:t>
+      </w:r>
+      <w:r>
+        <w:t xml:space="preserve"> – Pobiera listę dostępnych zadań (tylko te z </w:t>
+      </w:r>
+      <w:proofErr w:type="spellStart"/>
+      <w:r>
+        <w:t>is_public</w:t>
+      </w:r>
+      <w:proofErr w:type="spellEnd"/>
+      <w:r>
+        <w:t>=True oraz zadania z grup, do których należy użytkownik).</w:t>
       </w:r>
     </w:p>
     <w:p>
       <w:pPr>
         <w:numPr>
           <w:ilvl w:val="0"/>
-          <w:numId w:val="6"/>
+          <w:numId w:val="9"/>
         </w:numPr>
       </w:pPr>
       <w:r>
@@ -957,34 +2482,42 @@
           <w:b/>
           <w:bCs/>
         </w:rPr>
-        <w:t>Zarządzanie Zadaniami (HU 1.3, 1.4, 1.12):</w:t>
-      </w:r>
-      <w:r>
-        <w:t xml:space="preserve"> Tabela </w:t>
-      </w:r>
-      <w:proofErr w:type="spellStart"/>
-      <w:r>
-        <w:t>Task</w:t>
-      </w:r>
-      <w:proofErr w:type="spellEnd"/>
-      <w:r>
-        <w:t xml:space="preserve"> pozwala na tworzenie zadań prywatnych i publicznych. Obsługę treści zapewnia elastyczne pole </w:t>
-      </w:r>
-      <w:proofErr w:type="spellStart"/>
-      <w:r>
-        <w:t>description</w:t>
-      </w:r>
-      <w:proofErr w:type="spellEnd"/>
-      <w:r>
-        <w:t xml:space="preserve"> (gotowe na </w:t>
-      </w:r>
-      <w:proofErr w:type="spellStart"/>
-      <w:r>
-        <w:t>parsowanie</w:t>
-      </w:r>
-      <w:proofErr w:type="spellEnd"/>
-      <w:r>
-        <w:t xml:space="preserve"> </w:t>
+        <w:t>GET /</w:t>
+      </w:r>
+      <w:proofErr w:type="spellStart"/>
+      <w:r>
+        <w:rPr>
+          <w:b/>
+          <w:bCs/>
+        </w:rPr>
+        <w:t>api</w:t>
+      </w:r>
+      <w:proofErr w:type="spellEnd"/>
+      <w:r>
+        <w:rPr>
+          <w:b/>
+          <w:bCs/>
+        </w:rPr>
+        <w:t>/</w:t>
+      </w:r>
+      <w:proofErr w:type="spellStart"/>
+      <w:r>
+        <w:rPr>
+          <w:b/>
+          <w:bCs/>
+        </w:rPr>
+        <w:t>tasks</w:t>
+      </w:r>
+      <w:proofErr w:type="spellEnd"/>
+      <w:r>
+        <w:rPr>
+          <w:b/>
+          <w:bCs/>
+        </w:rPr>
+        <w:t>/&lt;id&gt;/</w:t>
+      </w:r>
+      <w:r>
+        <w:t xml:space="preserve"> – Zwraca pełne szczegóły pojedynczego zadania (treść </w:t>
       </w:r>
       <w:proofErr w:type="spellStart"/>
       <w:r>
@@ -992,30 +2525,14 @@
       </w:r>
       <w:proofErr w:type="spellEnd"/>
       <w:r>
-        <w:t xml:space="preserve">). Ograniczenia sprzętowe dla sprawdzarki kodu gwarantują pola </w:t>
-      </w:r>
-      <w:proofErr w:type="spellStart"/>
-      <w:r>
-        <w:t>time_limit</w:t>
-      </w:r>
-      <w:proofErr w:type="spellEnd"/>
-      <w:r>
-        <w:t xml:space="preserve"> oraz </w:t>
-      </w:r>
-      <w:proofErr w:type="spellStart"/>
-      <w:r>
-        <w:t>memory_limit</w:t>
-      </w:r>
-      <w:proofErr w:type="spellEnd"/>
-      <w:r>
-        <w:t>.</w:t>
+        <w:t>, limity czasowe).</w:t>
       </w:r>
     </w:p>
     <w:p>
       <w:pPr>
         <w:numPr>
           <w:ilvl w:val="0"/>
-          <w:numId w:val="6"/>
+          <w:numId w:val="9"/>
         </w:numPr>
       </w:pPr>
       <w:r>
@@ -1023,33 +2540,69 @@
           <w:b/>
           <w:bCs/>
         </w:rPr>
-        <w:t>System Ewaluacji Testowej (HU 1.7, 1.8):</w:t>
-      </w:r>
-      <w:r>
-        <w:t xml:space="preserve"> Rozdzielenie testów jawnych od ukrytych zostało osiągnięte poprzez dedykowany model </w:t>
-      </w:r>
-      <w:proofErr w:type="spellStart"/>
-      <w:r>
-        <w:t>TestCase</w:t>
-      </w:r>
-      <w:proofErr w:type="spellEnd"/>
-      <w:r>
-        <w:t xml:space="preserve"> z flagą </w:t>
-      </w:r>
-      <w:proofErr w:type="spellStart"/>
-      <w:r>
-        <w:t>is_sample</w:t>
-      </w:r>
-      <w:proofErr w:type="spellEnd"/>
-      <w:r>
-        <w:t xml:space="preserve"> i opcją punktacji za każdy pojedynczy test.</w:t>
+        <w:t>POST /</w:t>
+      </w:r>
+      <w:proofErr w:type="spellStart"/>
+      <w:r>
+        <w:rPr>
+          <w:b/>
+          <w:bCs/>
+        </w:rPr>
+        <w:t>api</w:t>
+      </w:r>
+      <w:proofErr w:type="spellEnd"/>
+      <w:r>
+        <w:rPr>
+          <w:b/>
+          <w:bCs/>
+        </w:rPr>
+        <w:t>/</w:t>
+      </w:r>
+      <w:proofErr w:type="spellStart"/>
+      <w:r>
+        <w:rPr>
+          <w:b/>
+          <w:bCs/>
+        </w:rPr>
+        <w:t>tasks</w:t>
+      </w:r>
+      <w:proofErr w:type="spellEnd"/>
+      <w:r>
+        <w:rPr>
+          <w:b/>
+          <w:bCs/>
+        </w:rPr>
+        <w:t>/</w:t>
+      </w:r>
+      <w:r>
+        <w:t xml:space="preserve"> – Pozwala użytkownikom z uprawnieniami (lub pracownikom) dodać nowe zadanie do bazy.</w:t>
+      </w:r>
+    </w:p>
+    <w:p>
+      <w:pPr>
+        <w:rPr>
+          <w:b/>
+          <w:bCs/>
+        </w:rPr>
+      </w:pPr>
+      <w:r>
+        <w:rPr>
+          <w:b/>
+          <w:bCs/>
+        </w:rPr>
+        <w:t>Moduł Rozwiązań (Silnik Platformy)</w:t>
+      </w:r>
+    </w:p>
+    <w:p>
+      <w:r>
+        <w:t>Użytkownik musi mieć gdzie wysłać swój kod do sprawdzenia.</w:t>
       </w:r>
     </w:p>
     <w:p>
       <w:pPr>
         <w:numPr>
           <w:ilvl w:val="0"/>
-          <w:numId w:val="6"/>
+          <w:numId w:val="10"/>
         </w:numPr>
       </w:pPr>
       <w:r>
@@ -1057,42 +2610,65 @@
           <w:b/>
           <w:bCs/>
         </w:rPr>
-        <w:lastRenderedPageBreak/>
-        <w:t>Zarządzanie Społecznością (HU 2.1, 2.2):</w:t>
-      </w:r>
-      <w:r>
-        <w:t xml:space="preserve"> Tabela </w:t>
-      </w:r>
-      <w:proofErr w:type="spellStart"/>
-      <w:r>
-        <w:t>CodeGroup</w:t>
-      </w:r>
-      <w:proofErr w:type="spellEnd"/>
-      <w:r>
-        <w:t xml:space="preserve"> oraz przypisana do niej relacja </w:t>
-      </w:r>
-      <w:proofErr w:type="spellStart"/>
-      <w:r>
-        <w:t>GroupMembership</w:t>
-      </w:r>
-      <w:proofErr w:type="spellEnd"/>
-      <w:r>
-        <w:t xml:space="preserve"> obsługuje zarówno zróżnicowanie dostępu (grupy otwarte/zamknięte), jak i hierarchię wewnątrz społeczności (role członka i </w:t>
-      </w:r>
-      <w:proofErr w:type="gramStart"/>
-      <w:r>
-        <w:t>admina</w:t>
-      </w:r>
-      <w:proofErr w:type="gramEnd"/>
-      <w:r>
-        <w:t>).</w:t>
+        <w:t>POST /</w:t>
+      </w:r>
+      <w:proofErr w:type="spellStart"/>
+      <w:r>
+        <w:rPr>
+          <w:b/>
+          <w:bCs/>
+        </w:rPr>
+        <w:t>api</w:t>
+      </w:r>
+      <w:proofErr w:type="spellEnd"/>
+      <w:r>
+        <w:rPr>
+          <w:b/>
+          <w:bCs/>
+        </w:rPr>
+        <w:t>/</w:t>
+      </w:r>
+      <w:proofErr w:type="spellStart"/>
+      <w:r>
+        <w:rPr>
+          <w:b/>
+          <w:bCs/>
+        </w:rPr>
+        <w:t>solutions</w:t>
+      </w:r>
+      <w:proofErr w:type="spellEnd"/>
+      <w:r>
+        <w:rPr>
+          <w:b/>
+          <w:bCs/>
+        </w:rPr>
+        <w:t>/</w:t>
+      </w:r>
+      <w:r>
+        <w:t xml:space="preserve"> – </w:t>
+      </w:r>
+      <w:proofErr w:type="spellStart"/>
+      <w:r>
+        <w:t>Endpoint</w:t>
+      </w:r>
+      <w:proofErr w:type="spellEnd"/>
+      <w:r>
+        <w:t xml:space="preserve"> przyjmujący kod napisany w edytorze na froncie. Zapisuje go do bazy ze statusem </w:t>
+      </w:r>
+      <w:proofErr w:type="spellStart"/>
+      <w:r>
+        <w:t>pending</w:t>
+      </w:r>
+      <w:proofErr w:type="spellEnd"/>
+      <w:r>
+        <w:t xml:space="preserve"> (Oczekujące) i przygotowuje do weryfikacji.</w:t>
       </w:r>
     </w:p>
     <w:p>
       <w:pPr>
         <w:numPr>
           <w:ilvl w:val="0"/>
-          <w:numId w:val="6"/>
+          <w:numId w:val="10"/>
         </w:numPr>
       </w:pPr>
       <w:r>
@@ -1100,41 +2676,70 @@
           <w:b/>
           <w:bCs/>
         </w:rPr>
-        <w:t>Zabezpieczenia i Turnieje (HU 2.3):</w:t>
-      </w:r>
-      <w:r>
-        <w:t xml:space="preserve"> System Konkursów (</w:t>
-      </w:r>
-      <w:proofErr w:type="spellStart"/>
-      <w:r>
-        <w:t>Contest</w:t>
-      </w:r>
-      <w:proofErr w:type="spellEnd"/>
-      <w:r>
-        <w:t xml:space="preserve">) poprzez flagę </w:t>
-      </w:r>
-      <w:proofErr w:type="spellStart"/>
-      <w:r>
-        <w:t>strict_mode</w:t>
-      </w:r>
-      <w:proofErr w:type="spellEnd"/>
-      <w:r>
-        <w:t xml:space="preserve"> natywnie wspiera implementację mechanizmów </w:t>
-      </w:r>
-      <w:proofErr w:type="spellStart"/>
-      <w:r>
-        <w:t>antysciągowych</w:t>
-      </w:r>
-      <w:proofErr w:type="spellEnd"/>
-      <w:r>
-        <w:t>, a zaawansowane tabele pośrednie umożliwiają organizację turniejów międzyszkolnych (wiele grup w jednym konkursie).</w:t>
+        <w:t>GET /</w:t>
+      </w:r>
+      <w:proofErr w:type="spellStart"/>
+      <w:r>
+        <w:rPr>
+          <w:b/>
+          <w:bCs/>
+        </w:rPr>
+        <w:t>api</w:t>
+      </w:r>
+      <w:proofErr w:type="spellEnd"/>
+      <w:r>
+        <w:rPr>
+          <w:b/>
+          <w:bCs/>
+        </w:rPr>
+        <w:t>/</w:t>
+      </w:r>
+      <w:proofErr w:type="spellStart"/>
+      <w:r>
+        <w:rPr>
+          <w:b/>
+          <w:bCs/>
+        </w:rPr>
+        <w:t>solutions</w:t>
+      </w:r>
+      <w:proofErr w:type="spellEnd"/>
+      <w:r>
+        <w:rPr>
+          <w:b/>
+          <w:bCs/>
+        </w:rPr>
+        <w:t>/</w:t>
+      </w:r>
+      <w:r>
+        <w:t xml:space="preserve"> – Zwraca historię rozwiązań zalogowanego użytkownika (aby mógł zobaczyć, które zadania już zaliczył).</w:t>
+      </w:r>
+    </w:p>
+    <w:p>
+      <w:pPr>
+        <w:rPr>
+          <w:b/>
+          <w:bCs/>
+        </w:rPr>
+      </w:pPr>
+      <w:r>
+        <w:rPr>
+          <w:b/>
+          <w:bCs/>
+        </w:rPr>
+        <w:lastRenderedPageBreak/>
+        <w:t>Moduł Społeczności i Grup</w:t>
+      </w:r>
+    </w:p>
+    <w:p>
+      <w:r>
+        <w:t>Aby działały funkcje socjalne i ograniczenia dostępności.</w:t>
       </w:r>
     </w:p>
     <w:p>
       <w:pPr>
         <w:numPr>
           <w:ilvl w:val="0"/>
-          <w:numId w:val="6"/>
+          <w:numId w:val="11"/>
         </w:numPr>
       </w:pPr>
       <w:r>
@@ -1142,105 +2747,128 @@
           <w:b/>
           <w:bCs/>
         </w:rPr>
-        <w:t>Utrzymanie Jakości (HU 1.10, 3.3):</w:t>
-      </w:r>
-      <w:r>
-        <w:t xml:space="preserve"> Dedykowany model </w:t>
-      </w:r>
-      <w:proofErr w:type="spellStart"/>
-      <w:r>
-        <w:t>TaskReport</w:t>
-      </w:r>
-      <w:proofErr w:type="spellEnd"/>
-      <w:r>
-        <w:t xml:space="preserve"> implementuje pełnoprawny, śledzony system zgłaszania błędów przez studentów do wykładowców.</w:t>
-      </w:r>
-    </w:p>
-    <w:p>
-      <w:r>
-        <w:pict w14:anchorId="6C7130AF">
-          <v:rect id="_x0000_i1027" style="width:0;height:1.5pt" o:hralign="center" o:hrstd="t" o:hr="t" fillcolor="#a0a0a0" stroked="f"/>
-        </w:pict>
-      </w:r>
-    </w:p>
-    <w:p>
-      <w:pPr>
-        <w:pStyle w:val="Nagwek2"/>
-      </w:pPr>
-      <w:r>
-        <w:t>4. Wizualizacja i Aktualizacja Schematu</w:t>
-      </w:r>
-    </w:p>
-    <w:p>
-      <w:r>
-        <w:t>Zgodnie z zasadą DRY (</w:t>
-      </w:r>
-      <w:proofErr w:type="spellStart"/>
-      <w:r>
-        <w:t>Don't</w:t>
-      </w:r>
-      <w:proofErr w:type="spellEnd"/>
-      <w:r>
-        <w:t xml:space="preserve"> </w:t>
-      </w:r>
-      <w:proofErr w:type="spellStart"/>
-      <w:r>
-        <w:t>Repeat</w:t>
-      </w:r>
-      <w:proofErr w:type="spellEnd"/>
-      <w:r>
-        <w:t xml:space="preserve"> </w:t>
-      </w:r>
-      <w:proofErr w:type="spellStart"/>
-      <w:r>
-        <w:t>Yourself</w:t>
-      </w:r>
-      <w:proofErr w:type="spellEnd"/>
-      <w:r>
-        <w:t>), nie utrzymujemy ręcznie rysowanych schematów bazy danych, ponieważ szybko stają się nieaktualne.</w:t>
-      </w:r>
-    </w:p>
-    <w:p>
-      <w:r>
-        <w:t xml:space="preserve">Wizualizacja bazy generowana jest </w:t>
-      </w:r>
-      <w:r>
-        <w:rPr>
-          <w:b/>
-          <w:bCs/>
-        </w:rPr>
-        <w:t>automatycznie</w:t>
-      </w:r>
-      <w:r>
-        <w:t xml:space="preserve"> bezpośrednio z kodu źródłowego (models.py). Wykorzystujemy do tego połączenie programu systemowego </w:t>
-      </w:r>
-      <w:proofErr w:type="spellStart"/>
-      <w:r>
-        <w:rPr>
-          <w:b/>
-          <w:bCs/>
-        </w:rPr>
-        <w:t>Graphviz</w:t>
-      </w:r>
-      <w:proofErr w:type="spellEnd"/>
-      <w:r>
-        <w:t xml:space="preserve"> oraz biblioteki </w:t>
-      </w:r>
-      <w:proofErr w:type="spellStart"/>
-      <w:r>
-        <w:t>pythonowej</w:t>
-      </w:r>
-      <w:proofErr w:type="spellEnd"/>
-      <w:r>
-        <w:t xml:space="preserve"> </w:t>
-      </w:r>
-      <w:proofErr w:type="spellStart"/>
-      <w:r>
-        <w:rPr>
-          <w:b/>
-          <w:bCs/>
-        </w:rPr>
-        <w:t>django-extensions</w:t>
+        <w:t>GET /</w:t>
+      </w:r>
+      <w:proofErr w:type="spellStart"/>
+      <w:r>
+        <w:rPr>
+          <w:b/>
+          <w:bCs/>
+        </w:rPr>
+        <w:t>api</w:t>
+      </w:r>
+      <w:proofErr w:type="spellEnd"/>
+      <w:r>
+        <w:rPr>
+          <w:b/>
+          <w:bCs/>
+        </w:rPr>
+        <w:t>/</w:t>
+      </w:r>
+      <w:proofErr w:type="spellStart"/>
+      <w:r>
+        <w:rPr>
+          <w:b/>
+          <w:bCs/>
+        </w:rPr>
+        <w:t>groups</w:t>
+      </w:r>
+      <w:proofErr w:type="spellEnd"/>
+      <w:r>
+        <w:rPr>
+          <w:b/>
+          <w:bCs/>
+        </w:rPr>
+        <w:t>/</w:t>
+      </w:r>
+      <w:r>
+        <w:t xml:space="preserve"> – Zwraca listę otwartych grup (</w:t>
+      </w:r>
+      <w:proofErr w:type="spellStart"/>
+      <w:r>
+        <w:t>is_open</w:t>
+      </w:r>
+      <w:proofErr w:type="spellEnd"/>
+      <w:r>
+        <w:t>=True), do których można dołączyć.</w:t>
+      </w:r>
+    </w:p>
+    <w:p>
+      <w:pPr>
+        <w:numPr>
+          <w:ilvl w:val="0"/>
+          <w:numId w:val="11"/>
+        </w:numPr>
+      </w:pPr>
+      <w:r>
+        <w:rPr>
+          <w:b/>
+          <w:bCs/>
+        </w:rPr>
+        <w:t>POST /</w:t>
+      </w:r>
+      <w:proofErr w:type="spellStart"/>
+      <w:r>
+        <w:rPr>
+          <w:b/>
+          <w:bCs/>
+        </w:rPr>
+        <w:t>api</w:t>
+      </w:r>
+      <w:proofErr w:type="spellEnd"/>
+      <w:r>
+        <w:rPr>
+          <w:b/>
+          <w:bCs/>
+        </w:rPr>
+        <w:t>/</w:t>
+      </w:r>
+      <w:proofErr w:type="spellStart"/>
+      <w:r>
+        <w:rPr>
+          <w:b/>
+          <w:bCs/>
+        </w:rPr>
+        <w:t>groups</w:t>
+      </w:r>
+      <w:proofErr w:type="spellEnd"/>
+      <w:r>
+        <w:rPr>
+          <w:b/>
+          <w:bCs/>
+        </w:rPr>
+        <w:t>/&lt;id&gt;/</w:t>
+      </w:r>
+      <w:proofErr w:type="spellStart"/>
+      <w:r>
+        <w:rPr>
+          <w:b/>
+          <w:bCs/>
+        </w:rPr>
+        <w:t>join</w:t>
+      </w:r>
+      <w:proofErr w:type="spellEnd"/>
+      <w:r>
+        <w:rPr>
+          <w:b/>
+          <w:bCs/>
+        </w:rPr>
+        <w:t>/</w:t>
+      </w:r>
+      <w:r>
+        <w:t xml:space="preserve"> – </w:t>
+      </w:r>
+      <w:proofErr w:type="spellStart"/>
+      <w:r>
+        <w:t>Endpoint</w:t>
+      </w:r>
+      <w:proofErr w:type="spellEnd"/>
+      <w:r>
+        <w:t xml:space="preserve"> podpinany pod przycisk "Dołącz" na froncie, dodający użytkownika do </w:t>
+      </w:r>
+      <w:proofErr w:type="spellStart"/>
+      <w:r>
+        <w:t>GroupMembership</w:t>
       </w:r>
       <w:proofErr w:type="spellEnd"/>
       <w:r>
@@ -1248,60 +2876,92 @@
       </w:r>
     </w:p>
     <w:p>
-      <w:r>
-        <w:rPr>
-          <w:b/>
-          <w:bCs/>
-        </w:rPr>
-        <w:t>Instrukcja wygenerowania aktualnego diagramu (ERD):</w:t>
-      </w:r>
-      <w:r>
-        <w:t xml:space="preserve"> Aby pobrać najświeższy schemat relacji między tabelami, w głównym katalogu projektu uruchom poniższą komendę w terminalu:</w:t>
-      </w:r>
-    </w:p>
-    <w:p>
-      <w:pPr>
-        <w:rPr>
-          <w:lang w:val="en-US"/>
-        </w:rPr>
-      </w:pPr>
-      <w:r>
-        <w:rPr>
-          <w:lang w:val="en-US"/>
-        </w:rPr>
-        <w:t>Bash</w:t>
-      </w:r>
-    </w:p>
-    <w:p>
-      <w:pPr>
-        <w:rPr>
-          <w:lang w:val="en-US"/>
-        </w:rPr>
-      </w:pPr>
-      <w:r>
-        <w:rPr>
-          <w:lang w:val="en-US"/>
-        </w:rPr>
-        <w:t xml:space="preserve">docker-compose exec web python manage.py </w:t>
-      </w:r>
-      <w:proofErr w:type="spellStart"/>
-      <w:r>
-        <w:rPr>
-          <w:lang w:val="en-US"/>
-        </w:rPr>
-        <w:t>graph_models</w:t>
-      </w:r>
-      <w:proofErr w:type="spellEnd"/>
-      <w:r>
-        <w:rPr>
-          <w:lang w:val="en-US"/>
-        </w:rPr>
-        <w:t xml:space="preserve"> -a -o diagram_bazy_danych.png</w:t>
-      </w:r>
-    </w:p>
-    <w:p>
-      <w:r>
-        <w:t>Wygenerowany plik diagram_bazy_danych.png pojawi się w folderze roboczym i będzie zawierał wszystkie bieżące tabele, relacje (Klucze Obce) oraz typy danych.</w:t>
+      <w:pPr>
+        <w:rPr>
+          <w:b/>
+          <w:bCs/>
+        </w:rPr>
+      </w:pPr>
+      <w:r>
+        <w:rPr>
+          <w:b/>
+          <w:bCs/>
+        </w:rPr>
+        <w:t>Moduł Konkursów (Opcjonalnie, w późniejszym etapie)</w:t>
+      </w:r>
+    </w:p>
+    <w:p>
+      <w:pPr>
+        <w:numPr>
+          <w:ilvl w:val="0"/>
+          <w:numId w:val="12"/>
+        </w:numPr>
+      </w:pPr>
+      <w:r>
+        <w:rPr>
+          <w:b/>
+          <w:bCs/>
+        </w:rPr>
+        <w:t>GET /</w:t>
+      </w:r>
+      <w:proofErr w:type="spellStart"/>
+      <w:r>
+        <w:rPr>
+          <w:b/>
+          <w:bCs/>
+        </w:rPr>
+        <w:t>api</w:t>
+      </w:r>
+      <w:proofErr w:type="spellEnd"/>
+      <w:r>
+        <w:rPr>
+          <w:b/>
+          <w:bCs/>
+        </w:rPr>
+        <w:t>/</w:t>
+      </w:r>
+      <w:proofErr w:type="spellStart"/>
+      <w:r>
+        <w:rPr>
+          <w:b/>
+          <w:bCs/>
+        </w:rPr>
+        <w:t>contests</w:t>
+      </w:r>
+      <w:proofErr w:type="spellEnd"/>
+      <w:r>
+        <w:rPr>
+          <w:b/>
+          <w:bCs/>
+        </w:rPr>
+        <w:t>/</w:t>
+      </w:r>
+      <w:r>
+        <w:t xml:space="preserve"> – Wyświetlanie aktywnych i nadchodzących konkursów przypisanych do grup użytkownika. To tutaj </w:t>
+      </w:r>
+      <w:proofErr w:type="spellStart"/>
+      <w:r>
+        <w:t>frontend</w:t>
+      </w:r>
+      <w:proofErr w:type="spellEnd"/>
+      <w:r>
+        <w:t xml:space="preserve"> będzie odczytywał flagę </w:t>
+      </w:r>
+      <w:proofErr w:type="spellStart"/>
+      <w:r>
+        <w:t>strict_mode</w:t>
+      </w:r>
+      <w:proofErr w:type="spellEnd"/>
+      <w:r>
+        <w:t xml:space="preserve">, aby aktywować zabezpieczenia </w:t>
+      </w:r>
+      <w:proofErr w:type="spellStart"/>
+      <w:r>
+        <w:t>antysciągowe</w:t>
+      </w:r>
+      <w:proofErr w:type="spellEnd"/>
+      <w:r>
+        <w:t xml:space="preserve"> w edytorze.</w:t>
       </w:r>
     </w:p>
     <w:p/>
@@ -1472,6 +3132,155 @@
     </w:lvl>
   </w:abstractNum>
   <w:abstractNum w:abstractNumId="1" w15:restartNumberingAfterBreak="0">
+    <w:nsid w:val="10BA75F6"/>
+    <w:multiLevelType w:val="multilevel"/>
+    <w:tmpl w:val="65946A4C"/>
+    <w:lvl w:ilvl="0">
+      <w:start w:val="1"/>
+      <w:numFmt w:val="bullet"/>
+      <w:lvlText w:val=""/>
+      <w:lvlJc w:val="left"/>
+      <w:pPr>
+        <w:tabs>
+          <w:tab w:val="num" w:pos="720"/>
+        </w:tabs>
+        <w:ind w:left="720" w:hanging="360"/>
+      </w:pPr>
+      <w:rPr>
+        <w:rFonts w:ascii="Symbol" w:hAnsi="Symbol" w:hint="default"/>
+        <w:sz w:val="20"/>
+      </w:rPr>
+    </w:lvl>
+    <w:lvl w:ilvl="1" w:tentative="1">
+      <w:start w:val="1"/>
+      <w:numFmt w:val="bullet"/>
+      <w:lvlText w:val="o"/>
+      <w:lvlJc w:val="left"/>
+      <w:pPr>
+        <w:tabs>
+          <w:tab w:val="num" w:pos="1440"/>
+        </w:tabs>
+        <w:ind w:left="1440" w:hanging="360"/>
+      </w:pPr>
+      <w:rPr>
+        <w:rFonts w:ascii="Courier New" w:hAnsi="Courier New" w:hint="default"/>
+        <w:sz w:val="20"/>
+      </w:rPr>
+    </w:lvl>
+    <w:lvl w:ilvl="2" w:tentative="1">
+      <w:start w:val="1"/>
+      <w:numFmt w:val="bullet"/>
+      <w:lvlText w:val=""/>
+      <w:lvlJc w:val="left"/>
+      <w:pPr>
+        <w:tabs>
+          <w:tab w:val="num" w:pos="2160"/>
+        </w:tabs>
+        <w:ind w:left="2160" w:hanging="360"/>
+      </w:pPr>
+      <w:rPr>
+        <w:rFonts w:ascii="Wingdings" w:hAnsi="Wingdings" w:hint="default"/>
+        <w:sz w:val="20"/>
+      </w:rPr>
+    </w:lvl>
+    <w:lvl w:ilvl="3" w:tentative="1">
+      <w:start w:val="1"/>
+      <w:numFmt w:val="bullet"/>
+      <w:lvlText w:val=""/>
+      <w:lvlJc w:val="left"/>
+      <w:pPr>
+        <w:tabs>
+          <w:tab w:val="num" w:pos="2880"/>
+        </w:tabs>
+        <w:ind w:left="2880" w:hanging="360"/>
+      </w:pPr>
+      <w:rPr>
+        <w:rFonts w:ascii="Wingdings" w:hAnsi="Wingdings" w:hint="default"/>
+        <w:sz w:val="20"/>
+      </w:rPr>
+    </w:lvl>
+    <w:lvl w:ilvl="4" w:tentative="1">
+      <w:start w:val="1"/>
+      <w:numFmt w:val="bullet"/>
+      <w:lvlText w:val=""/>
+      <w:lvlJc w:val="left"/>
+      <w:pPr>
+        <w:tabs>
+          <w:tab w:val="num" w:pos="3600"/>
+        </w:tabs>
+        <w:ind w:left="3600" w:hanging="360"/>
+      </w:pPr>
+      <w:rPr>
+        <w:rFonts w:ascii="Wingdings" w:hAnsi="Wingdings" w:hint="default"/>
+        <w:sz w:val="20"/>
+      </w:rPr>
+    </w:lvl>
+    <w:lvl w:ilvl="5" w:tentative="1">
+      <w:start w:val="1"/>
+      <w:numFmt w:val="bullet"/>
+      <w:lvlText w:val=""/>
+      <w:lvlJc w:val="left"/>
+      <w:pPr>
+        <w:tabs>
+          <w:tab w:val="num" w:pos="4320"/>
+        </w:tabs>
+        <w:ind w:left="4320" w:hanging="360"/>
+      </w:pPr>
+      <w:rPr>
+        <w:rFonts w:ascii="Wingdings" w:hAnsi="Wingdings" w:hint="default"/>
+        <w:sz w:val="20"/>
+      </w:rPr>
+    </w:lvl>
+    <w:lvl w:ilvl="6" w:tentative="1">
+      <w:start w:val="1"/>
+      <w:numFmt w:val="bullet"/>
+      <w:lvlText w:val=""/>
+      <w:lvlJc w:val="left"/>
+      <w:pPr>
+        <w:tabs>
+          <w:tab w:val="num" w:pos="5040"/>
+        </w:tabs>
+        <w:ind w:left="5040" w:hanging="360"/>
+      </w:pPr>
+      <w:rPr>
+        <w:rFonts w:ascii="Wingdings" w:hAnsi="Wingdings" w:hint="default"/>
+        <w:sz w:val="20"/>
+      </w:rPr>
+    </w:lvl>
+    <w:lvl w:ilvl="7" w:tentative="1">
+      <w:start w:val="1"/>
+      <w:numFmt w:val="bullet"/>
+      <w:lvlText w:val=""/>
+      <w:lvlJc w:val="left"/>
+      <w:pPr>
+        <w:tabs>
+          <w:tab w:val="num" w:pos="5760"/>
+        </w:tabs>
+        <w:ind w:left="5760" w:hanging="360"/>
+      </w:pPr>
+      <w:rPr>
+        <w:rFonts w:ascii="Wingdings" w:hAnsi="Wingdings" w:hint="default"/>
+        <w:sz w:val="20"/>
+      </w:rPr>
+    </w:lvl>
+    <w:lvl w:ilvl="8" w:tentative="1">
+      <w:start w:val="1"/>
+      <w:numFmt w:val="bullet"/>
+      <w:lvlText w:val=""/>
+      <w:lvlJc w:val="left"/>
+      <w:pPr>
+        <w:tabs>
+          <w:tab w:val="num" w:pos="6480"/>
+        </w:tabs>
+        <w:ind w:left="6480" w:hanging="360"/>
+      </w:pPr>
+      <w:rPr>
+        <w:rFonts w:ascii="Wingdings" w:hAnsi="Wingdings" w:hint="default"/>
+        <w:sz w:val="20"/>
+      </w:rPr>
+    </w:lvl>
+  </w:abstractNum>
+  <w:abstractNum w:abstractNumId="2" w15:restartNumberingAfterBreak="0">
     <w:nsid w:val="264858FA"/>
     <w:multiLevelType w:val="multilevel"/>
     <w:tmpl w:val="87E629E6"/>
@@ -1620,7 +3429,156 @@
       </w:rPr>
     </w:lvl>
   </w:abstractNum>
-  <w:abstractNum w:abstractNumId="2" w15:restartNumberingAfterBreak="0">
+  <w:abstractNum w:abstractNumId="3" w15:restartNumberingAfterBreak="0">
+    <w:nsid w:val="38B42181"/>
+    <w:multiLevelType w:val="multilevel"/>
+    <w:tmpl w:val="EE1C3D1C"/>
+    <w:lvl w:ilvl="0">
+      <w:start w:val="1"/>
+      <w:numFmt w:val="bullet"/>
+      <w:lvlText w:val=""/>
+      <w:lvlJc w:val="left"/>
+      <w:pPr>
+        <w:tabs>
+          <w:tab w:val="num" w:pos="720"/>
+        </w:tabs>
+        <w:ind w:left="720" w:hanging="360"/>
+      </w:pPr>
+      <w:rPr>
+        <w:rFonts w:ascii="Symbol" w:hAnsi="Symbol" w:hint="default"/>
+        <w:sz w:val="20"/>
+      </w:rPr>
+    </w:lvl>
+    <w:lvl w:ilvl="1" w:tentative="1">
+      <w:start w:val="1"/>
+      <w:numFmt w:val="bullet"/>
+      <w:lvlText w:val="o"/>
+      <w:lvlJc w:val="left"/>
+      <w:pPr>
+        <w:tabs>
+          <w:tab w:val="num" w:pos="1440"/>
+        </w:tabs>
+        <w:ind w:left="1440" w:hanging="360"/>
+      </w:pPr>
+      <w:rPr>
+        <w:rFonts w:ascii="Courier New" w:hAnsi="Courier New" w:hint="default"/>
+        <w:sz w:val="20"/>
+      </w:rPr>
+    </w:lvl>
+    <w:lvl w:ilvl="2" w:tentative="1">
+      <w:start w:val="1"/>
+      <w:numFmt w:val="bullet"/>
+      <w:lvlText w:val=""/>
+      <w:lvlJc w:val="left"/>
+      <w:pPr>
+        <w:tabs>
+          <w:tab w:val="num" w:pos="2160"/>
+        </w:tabs>
+        <w:ind w:left="2160" w:hanging="360"/>
+      </w:pPr>
+      <w:rPr>
+        <w:rFonts w:ascii="Wingdings" w:hAnsi="Wingdings" w:hint="default"/>
+        <w:sz w:val="20"/>
+      </w:rPr>
+    </w:lvl>
+    <w:lvl w:ilvl="3" w:tentative="1">
+      <w:start w:val="1"/>
+      <w:numFmt w:val="bullet"/>
+      <w:lvlText w:val=""/>
+      <w:lvlJc w:val="left"/>
+      <w:pPr>
+        <w:tabs>
+          <w:tab w:val="num" w:pos="2880"/>
+        </w:tabs>
+        <w:ind w:left="2880" w:hanging="360"/>
+      </w:pPr>
+      <w:rPr>
+        <w:rFonts w:ascii="Wingdings" w:hAnsi="Wingdings" w:hint="default"/>
+        <w:sz w:val="20"/>
+      </w:rPr>
+    </w:lvl>
+    <w:lvl w:ilvl="4" w:tentative="1">
+      <w:start w:val="1"/>
+      <w:numFmt w:val="bullet"/>
+      <w:lvlText w:val=""/>
+      <w:lvlJc w:val="left"/>
+      <w:pPr>
+        <w:tabs>
+          <w:tab w:val="num" w:pos="3600"/>
+        </w:tabs>
+        <w:ind w:left="3600" w:hanging="360"/>
+      </w:pPr>
+      <w:rPr>
+        <w:rFonts w:ascii="Wingdings" w:hAnsi="Wingdings" w:hint="default"/>
+        <w:sz w:val="20"/>
+      </w:rPr>
+    </w:lvl>
+    <w:lvl w:ilvl="5" w:tentative="1">
+      <w:start w:val="1"/>
+      <w:numFmt w:val="bullet"/>
+      <w:lvlText w:val=""/>
+      <w:lvlJc w:val="left"/>
+      <w:pPr>
+        <w:tabs>
+          <w:tab w:val="num" w:pos="4320"/>
+        </w:tabs>
+        <w:ind w:left="4320" w:hanging="360"/>
+      </w:pPr>
+      <w:rPr>
+        <w:rFonts w:ascii="Wingdings" w:hAnsi="Wingdings" w:hint="default"/>
+        <w:sz w:val="20"/>
+      </w:rPr>
+    </w:lvl>
+    <w:lvl w:ilvl="6" w:tentative="1">
+      <w:start w:val="1"/>
+      <w:numFmt w:val="bullet"/>
+      <w:lvlText w:val=""/>
+      <w:lvlJc w:val="left"/>
+      <w:pPr>
+        <w:tabs>
+          <w:tab w:val="num" w:pos="5040"/>
+        </w:tabs>
+        <w:ind w:left="5040" w:hanging="360"/>
+      </w:pPr>
+      <w:rPr>
+        <w:rFonts w:ascii="Wingdings" w:hAnsi="Wingdings" w:hint="default"/>
+        <w:sz w:val="20"/>
+      </w:rPr>
+    </w:lvl>
+    <w:lvl w:ilvl="7" w:tentative="1">
+      <w:start w:val="1"/>
+      <w:numFmt w:val="bullet"/>
+      <w:lvlText w:val=""/>
+      <w:lvlJc w:val="left"/>
+      <w:pPr>
+        <w:tabs>
+          <w:tab w:val="num" w:pos="5760"/>
+        </w:tabs>
+        <w:ind w:left="5760" w:hanging="360"/>
+      </w:pPr>
+      <w:rPr>
+        <w:rFonts w:ascii="Wingdings" w:hAnsi="Wingdings" w:hint="default"/>
+        <w:sz w:val="20"/>
+      </w:rPr>
+    </w:lvl>
+    <w:lvl w:ilvl="8" w:tentative="1">
+      <w:start w:val="1"/>
+      <w:numFmt w:val="bullet"/>
+      <w:lvlText w:val=""/>
+      <w:lvlJc w:val="left"/>
+      <w:pPr>
+        <w:tabs>
+          <w:tab w:val="num" w:pos="6480"/>
+        </w:tabs>
+        <w:ind w:left="6480" w:hanging="360"/>
+      </w:pPr>
+      <w:rPr>
+        <w:rFonts w:ascii="Wingdings" w:hAnsi="Wingdings" w:hint="default"/>
+        <w:sz w:val="20"/>
+      </w:rPr>
+    </w:lvl>
+  </w:abstractNum>
+  <w:abstractNum w:abstractNumId="4" w15:restartNumberingAfterBreak="0">
     <w:nsid w:val="4D7425C3"/>
     <w:multiLevelType w:val="multilevel"/>
     <w:tmpl w:val="C6206946"/>
@@ -1769,7 +3727,305 @@
       </w:rPr>
     </w:lvl>
   </w:abstractNum>
-  <w:abstractNum w:abstractNumId="3" w15:restartNumberingAfterBreak="0">
+  <w:abstractNum w:abstractNumId="5" w15:restartNumberingAfterBreak="0">
+    <w:nsid w:val="4E78043E"/>
+    <w:multiLevelType w:val="multilevel"/>
+    <w:tmpl w:val="CEE0E0B4"/>
+    <w:lvl w:ilvl="0">
+      <w:start w:val="1"/>
+      <w:numFmt w:val="bullet"/>
+      <w:lvlText w:val=""/>
+      <w:lvlJc w:val="left"/>
+      <w:pPr>
+        <w:tabs>
+          <w:tab w:val="num" w:pos="720"/>
+        </w:tabs>
+        <w:ind w:left="720" w:hanging="360"/>
+      </w:pPr>
+      <w:rPr>
+        <w:rFonts w:ascii="Symbol" w:hAnsi="Symbol" w:hint="default"/>
+        <w:sz w:val="20"/>
+      </w:rPr>
+    </w:lvl>
+    <w:lvl w:ilvl="1" w:tentative="1">
+      <w:start w:val="1"/>
+      <w:numFmt w:val="bullet"/>
+      <w:lvlText w:val="o"/>
+      <w:lvlJc w:val="left"/>
+      <w:pPr>
+        <w:tabs>
+          <w:tab w:val="num" w:pos="1440"/>
+        </w:tabs>
+        <w:ind w:left="1440" w:hanging="360"/>
+      </w:pPr>
+      <w:rPr>
+        <w:rFonts w:ascii="Courier New" w:hAnsi="Courier New" w:hint="default"/>
+        <w:sz w:val="20"/>
+      </w:rPr>
+    </w:lvl>
+    <w:lvl w:ilvl="2" w:tentative="1">
+      <w:start w:val="1"/>
+      <w:numFmt w:val="bullet"/>
+      <w:lvlText w:val=""/>
+      <w:lvlJc w:val="left"/>
+      <w:pPr>
+        <w:tabs>
+          <w:tab w:val="num" w:pos="2160"/>
+        </w:tabs>
+        <w:ind w:left="2160" w:hanging="360"/>
+      </w:pPr>
+      <w:rPr>
+        <w:rFonts w:ascii="Wingdings" w:hAnsi="Wingdings" w:hint="default"/>
+        <w:sz w:val="20"/>
+      </w:rPr>
+    </w:lvl>
+    <w:lvl w:ilvl="3" w:tentative="1">
+      <w:start w:val="1"/>
+      <w:numFmt w:val="bullet"/>
+      <w:lvlText w:val=""/>
+      <w:lvlJc w:val="left"/>
+      <w:pPr>
+        <w:tabs>
+          <w:tab w:val="num" w:pos="2880"/>
+        </w:tabs>
+        <w:ind w:left="2880" w:hanging="360"/>
+      </w:pPr>
+      <w:rPr>
+        <w:rFonts w:ascii="Wingdings" w:hAnsi="Wingdings" w:hint="default"/>
+        <w:sz w:val="20"/>
+      </w:rPr>
+    </w:lvl>
+    <w:lvl w:ilvl="4" w:tentative="1">
+      <w:start w:val="1"/>
+      <w:numFmt w:val="bullet"/>
+      <w:lvlText w:val=""/>
+      <w:lvlJc w:val="left"/>
+      <w:pPr>
+        <w:tabs>
+          <w:tab w:val="num" w:pos="3600"/>
+        </w:tabs>
+        <w:ind w:left="3600" w:hanging="360"/>
+      </w:pPr>
+      <w:rPr>
+        <w:rFonts w:ascii="Wingdings" w:hAnsi="Wingdings" w:hint="default"/>
+        <w:sz w:val="20"/>
+      </w:rPr>
+    </w:lvl>
+    <w:lvl w:ilvl="5" w:tentative="1">
+      <w:start w:val="1"/>
+      <w:numFmt w:val="bullet"/>
+      <w:lvlText w:val=""/>
+      <w:lvlJc w:val="left"/>
+      <w:pPr>
+        <w:tabs>
+          <w:tab w:val="num" w:pos="4320"/>
+        </w:tabs>
+        <w:ind w:left="4320" w:hanging="360"/>
+      </w:pPr>
+      <w:rPr>
+        <w:rFonts w:ascii="Wingdings" w:hAnsi="Wingdings" w:hint="default"/>
+        <w:sz w:val="20"/>
+      </w:rPr>
+    </w:lvl>
+    <w:lvl w:ilvl="6" w:tentative="1">
+      <w:start w:val="1"/>
+      <w:numFmt w:val="bullet"/>
+      <w:lvlText w:val=""/>
+      <w:lvlJc w:val="left"/>
+      <w:pPr>
+        <w:tabs>
+          <w:tab w:val="num" w:pos="5040"/>
+        </w:tabs>
+        <w:ind w:left="5040" w:hanging="360"/>
+      </w:pPr>
+      <w:rPr>
+        <w:rFonts w:ascii="Wingdings" w:hAnsi="Wingdings" w:hint="default"/>
+        <w:sz w:val="20"/>
+      </w:rPr>
+    </w:lvl>
+    <w:lvl w:ilvl="7" w:tentative="1">
+      <w:start w:val="1"/>
+      <w:numFmt w:val="bullet"/>
+      <w:lvlText w:val=""/>
+      <w:lvlJc w:val="left"/>
+      <w:pPr>
+        <w:tabs>
+          <w:tab w:val="num" w:pos="5760"/>
+        </w:tabs>
+        <w:ind w:left="5760" w:hanging="360"/>
+      </w:pPr>
+      <w:rPr>
+        <w:rFonts w:ascii="Wingdings" w:hAnsi="Wingdings" w:hint="default"/>
+        <w:sz w:val="20"/>
+      </w:rPr>
+    </w:lvl>
+    <w:lvl w:ilvl="8" w:tentative="1">
+      <w:start w:val="1"/>
+      <w:numFmt w:val="bullet"/>
+      <w:lvlText w:val=""/>
+      <w:lvlJc w:val="left"/>
+      <w:pPr>
+        <w:tabs>
+          <w:tab w:val="num" w:pos="6480"/>
+        </w:tabs>
+        <w:ind w:left="6480" w:hanging="360"/>
+      </w:pPr>
+      <w:rPr>
+        <w:rFonts w:ascii="Wingdings" w:hAnsi="Wingdings" w:hint="default"/>
+        <w:sz w:val="20"/>
+      </w:rPr>
+    </w:lvl>
+  </w:abstractNum>
+  <w:abstractNum w:abstractNumId="6" w15:restartNumberingAfterBreak="0">
+    <w:nsid w:val="52FA7FCB"/>
+    <w:multiLevelType w:val="multilevel"/>
+    <w:tmpl w:val="B67073F6"/>
+    <w:lvl w:ilvl="0">
+      <w:start w:val="1"/>
+      <w:numFmt w:val="bullet"/>
+      <w:lvlText w:val=""/>
+      <w:lvlJc w:val="left"/>
+      <w:pPr>
+        <w:tabs>
+          <w:tab w:val="num" w:pos="720"/>
+        </w:tabs>
+        <w:ind w:left="720" w:hanging="360"/>
+      </w:pPr>
+      <w:rPr>
+        <w:rFonts w:ascii="Symbol" w:hAnsi="Symbol" w:hint="default"/>
+        <w:sz w:val="20"/>
+      </w:rPr>
+    </w:lvl>
+    <w:lvl w:ilvl="1" w:tentative="1">
+      <w:start w:val="1"/>
+      <w:numFmt w:val="bullet"/>
+      <w:lvlText w:val="o"/>
+      <w:lvlJc w:val="left"/>
+      <w:pPr>
+        <w:tabs>
+          <w:tab w:val="num" w:pos="1440"/>
+        </w:tabs>
+        <w:ind w:left="1440" w:hanging="360"/>
+      </w:pPr>
+      <w:rPr>
+        <w:rFonts w:ascii="Courier New" w:hAnsi="Courier New" w:hint="default"/>
+        <w:sz w:val="20"/>
+      </w:rPr>
+    </w:lvl>
+    <w:lvl w:ilvl="2" w:tentative="1">
+      <w:start w:val="1"/>
+      <w:numFmt w:val="bullet"/>
+      <w:lvlText w:val=""/>
+      <w:lvlJc w:val="left"/>
+      <w:pPr>
+        <w:tabs>
+          <w:tab w:val="num" w:pos="2160"/>
+        </w:tabs>
+        <w:ind w:left="2160" w:hanging="360"/>
+      </w:pPr>
+      <w:rPr>
+        <w:rFonts w:ascii="Wingdings" w:hAnsi="Wingdings" w:hint="default"/>
+        <w:sz w:val="20"/>
+      </w:rPr>
+    </w:lvl>
+    <w:lvl w:ilvl="3" w:tentative="1">
+      <w:start w:val="1"/>
+      <w:numFmt w:val="bullet"/>
+      <w:lvlText w:val=""/>
+      <w:lvlJc w:val="left"/>
+      <w:pPr>
+        <w:tabs>
+          <w:tab w:val="num" w:pos="2880"/>
+        </w:tabs>
+        <w:ind w:left="2880" w:hanging="360"/>
+      </w:pPr>
+      <w:rPr>
+        <w:rFonts w:ascii="Wingdings" w:hAnsi="Wingdings" w:hint="default"/>
+        <w:sz w:val="20"/>
+      </w:rPr>
+    </w:lvl>
+    <w:lvl w:ilvl="4" w:tentative="1">
+      <w:start w:val="1"/>
+      <w:numFmt w:val="bullet"/>
+      <w:lvlText w:val=""/>
+      <w:lvlJc w:val="left"/>
+      <w:pPr>
+        <w:tabs>
+          <w:tab w:val="num" w:pos="3600"/>
+        </w:tabs>
+        <w:ind w:left="3600" w:hanging="360"/>
+      </w:pPr>
+      <w:rPr>
+        <w:rFonts w:ascii="Wingdings" w:hAnsi="Wingdings" w:hint="default"/>
+        <w:sz w:val="20"/>
+      </w:rPr>
+    </w:lvl>
+    <w:lvl w:ilvl="5" w:tentative="1">
+      <w:start w:val="1"/>
+      <w:numFmt w:val="bullet"/>
+      <w:lvlText w:val=""/>
+      <w:lvlJc w:val="left"/>
+      <w:pPr>
+        <w:tabs>
+          <w:tab w:val="num" w:pos="4320"/>
+        </w:tabs>
+        <w:ind w:left="4320" w:hanging="360"/>
+      </w:pPr>
+      <w:rPr>
+        <w:rFonts w:ascii="Wingdings" w:hAnsi="Wingdings" w:hint="default"/>
+        <w:sz w:val="20"/>
+      </w:rPr>
+    </w:lvl>
+    <w:lvl w:ilvl="6" w:tentative="1">
+      <w:start w:val="1"/>
+      <w:numFmt w:val="bullet"/>
+      <w:lvlText w:val=""/>
+      <w:lvlJc w:val="left"/>
+      <w:pPr>
+        <w:tabs>
+          <w:tab w:val="num" w:pos="5040"/>
+        </w:tabs>
+        <w:ind w:left="5040" w:hanging="360"/>
+      </w:pPr>
+      <w:rPr>
+        <w:rFonts w:ascii="Wingdings" w:hAnsi="Wingdings" w:hint="default"/>
+        <w:sz w:val="20"/>
+      </w:rPr>
+    </w:lvl>
+    <w:lvl w:ilvl="7" w:tentative="1">
+      <w:start w:val="1"/>
+      <w:numFmt w:val="bullet"/>
+      <w:lvlText w:val=""/>
+      <w:lvlJc w:val="left"/>
+      <w:pPr>
+        <w:tabs>
+          <w:tab w:val="num" w:pos="5760"/>
+        </w:tabs>
+        <w:ind w:left="5760" w:hanging="360"/>
+      </w:pPr>
+      <w:rPr>
+        <w:rFonts w:ascii="Wingdings" w:hAnsi="Wingdings" w:hint="default"/>
+        <w:sz w:val="20"/>
+      </w:rPr>
+    </w:lvl>
+    <w:lvl w:ilvl="8" w:tentative="1">
+      <w:start w:val="1"/>
+      <w:numFmt w:val="bullet"/>
+      <w:lvlText w:val=""/>
+      <w:lvlJc w:val="left"/>
+      <w:pPr>
+        <w:tabs>
+          <w:tab w:val="num" w:pos="6480"/>
+        </w:tabs>
+        <w:ind w:left="6480" w:hanging="360"/>
+      </w:pPr>
+      <w:rPr>
+        <w:rFonts w:ascii="Wingdings" w:hAnsi="Wingdings" w:hint="default"/>
+        <w:sz w:val="20"/>
+      </w:rPr>
+    </w:lvl>
+  </w:abstractNum>
+  <w:abstractNum w:abstractNumId="7" w15:restartNumberingAfterBreak="0">
     <w:nsid w:val="5B3D7807"/>
     <w:multiLevelType w:val="multilevel"/>
     <w:tmpl w:val="11FC45C6"/>
@@ -1918,7 +4174,7 @@
       </w:rPr>
     </w:lvl>
   </w:abstractNum>
-  <w:abstractNum w:abstractNumId="4" w15:restartNumberingAfterBreak="0">
+  <w:abstractNum w:abstractNumId="8" w15:restartNumberingAfterBreak="0">
     <w:nsid w:val="5B7F59A7"/>
     <w:multiLevelType w:val="multilevel"/>
     <w:tmpl w:val="5EE4D02E"/>
@@ -2067,7 +4323,7 @@
       </w:rPr>
     </w:lvl>
   </w:abstractNum>
-  <w:abstractNum w:abstractNumId="5" w15:restartNumberingAfterBreak="0">
+  <w:abstractNum w:abstractNumId="9" w15:restartNumberingAfterBreak="0">
     <w:nsid w:val="5D93295D"/>
     <w:multiLevelType w:val="multilevel"/>
     <w:tmpl w:val="35D475A6"/>
@@ -2216,22 +4472,338 @@
       </w:rPr>
     </w:lvl>
   </w:abstractNum>
+  <w:abstractNum w:abstractNumId="10" w15:restartNumberingAfterBreak="0">
+    <w:nsid w:val="61D612E1"/>
+    <w:multiLevelType w:val="multilevel"/>
+    <w:tmpl w:val="E918C276"/>
+    <w:lvl w:ilvl="0">
+      <w:start w:val="1"/>
+      <w:numFmt w:val="bullet"/>
+      <w:lvlText w:val=""/>
+      <w:lvlJc w:val="left"/>
+      <w:pPr>
+        <w:tabs>
+          <w:tab w:val="num" w:pos="720"/>
+        </w:tabs>
+        <w:ind w:left="720" w:hanging="360"/>
+      </w:pPr>
+      <w:rPr>
+        <w:rFonts w:ascii="Symbol" w:hAnsi="Symbol" w:hint="default"/>
+        <w:sz w:val="20"/>
+      </w:rPr>
+    </w:lvl>
+    <w:lvl w:ilvl="1" w:tentative="1">
+      <w:start w:val="1"/>
+      <w:numFmt w:val="bullet"/>
+      <w:lvlText w:val="o"/>
+      <w:lvlJc w:val="left"/>
+      <w:pPr>
+        <w:tabs>
+          <w:tab w:val="num" w:pos="1440"/>
+        </w:tabs>
+        <w:ind w:left="1440" w:hanging="360"/>
+      </w:pPr>
+      <w:rPr>
+        <w:rFonts w:ascii="Courier New" w:hAnsi="Courier New" w:hint="default"/>
+        <w:sz w:val="20"/>
+      </w:rPr>
+    </w:lvl>
+    <w:lvl w:ilvl="2" w:tentative="1">
+      <w:start w:val="1"/>
+      <w:numFmt w:val="bullet"/>
+      <w:lvlText w:val=""/>
+      <w:lvlJc w:val="left"/>
+      <w:pPr>
+        <w:tabs>
+          <w:tab w:val="num" w:pos="2160"/>
+        </w:tabs>
+        <w:ind w:left="2160" w:hanging="360"/>
+      </w:pPr>
+      <w:rPr>
+        <w:rFonts w:ascii="Wingdings" w:hAnsi="Wingdings" w:hint="default"/>
+        <w:sz w:val="20"/>
+      </w:rPr>
+    </w:lvl>
+    <w:lvl w:ilvl="3" w:tentative="1">
+      <w:start w:val="1"/>
+      <w:numFmt w:val="bullet"/>
+      <w:lvlText w:val=""/>
+      <w:lvlJc w:val="left"/>
+      <w:pPr>
+        <w:tabs>
+          <w:tab w:val="num" w:pos="2880"/>
+        </w:tabs>
+        <w:ind w:left="2880" w:hanging="360"/>
+      </w:pPr>
+      <w:rPr>
+        <w:rFonts w:ascii="Wingdings" w:hAnsi="Wingdings" w:hint="default"/>
+        <w:sz w:val="20"/>
+      </w:rPr>
+    </w:lvl>
+    <w:lvl w:ilvl="4" w:tentative="1">
+      <w:start w:val="1"/>
+      <w:numFmt w:val="bullet"/>
+      <w:lvlText w:val=""/>
+      <w:lvlJc w:val="left"/>
+      <w:pPr>
+        <w:tabs>
+          <w:tab w:val="num" w:pos="3600"/>
+        </w:tabs>
+        <w:ind w:left="3600" w:hanging="360"/>
+      </w:pPr>
+      <w:rPr>
+        <w:rFonts w:ascii="Wingdings" w:hAnsi="Wingdings" w:hint="default"/>
+        <w:sz w:val="20"/>
+      </w:rPr>
+    </w:lvl>
+    <w:lvl w:ilvl="5" w:tentative="1">
+      <w:start w:val="1"/>
+      <w:numFmt w:val="bullet"/>
+      <w:lvlText w:val=""/>
+      <w:lvlJc w:val="left"/>
+      <w:pPr>
+        <w:tabs>
+          <w:tab w:val="num" w:pos="4320"/>
+        </w:tabs>
+        <w:ind w:left="4320" w:hanging="360"/>
+      </w:pPr>
+      <w:rPr>
+        <w:rFonts w:ascii="Wingdings" w:hAnsi="Wingdings" w:hint="default"/>
+        <w:sz w:val="20"/>
+      </w:rPr>
+    </w:lvl>
+    <w:lvl w:ilvl="6" w:tentative="1">
+      <w:start w:val="1"/>
+      <w:numFmt w:val="bullet"/>
+      <w:lvlText w:val=""/>
+      <w:lvlJc w:val="left"/>
+      <w:pPr>
+        <w:tabs>
+          <w:tab w:val="num" w:pos="5040"/>
+        </w:tabs>
+        <w:ind w:left="5040" w:hanging="360"/>
+      </w:pPr>
+      <w:rPr>
+        <w:rFonts w:ascii="Wingdings" w:hAnsi="Wingdings" w:hint="default"/>
+        <w:sz w:val="20"/>
+      </w:rPr>
+    </w:lvl>
+    <w:lvl w:ilvl="7" w:tentative="1">
+      <w:start w:val="1"/>
+      <w:numFmt w:val="bullet"/>
+      <w:lvlText w:val=""/>
+      <w:lvlJc w:val="left"/>
+      <w:pPr>
+        <w:tabs>
+          <w:tab w:val="num" w:pos="5760"/>
+        </w:tabs>
+        <w:ind w:left="5760" w:hanging="360"/>
+      </w:pPr>
+      <w:rPr>
+        <w:rFonts w:ascii="Wingdings" w:hAnsi="Wingdings" w:hint="default"/>
+        <w:sz w:val="20"/>
+      </w:rPr>
+    </w:lvl>
+    <w:lvl w:ilvl="8" w:tentative="1">
+      <w:start w:val="1"/>
+      <w:numFmt w:val="bullet"/>
+      <w:lvlText w:val=""/>
+      <w:lvlJc w:val="left"/>
+      <w:pPr>
+        <w:tabs>
+          <w:tab w:val="num" w:pos="6480"/>
+        </w:tabs>
+        <w:ind w:left="6480" w:hanging="360"/>
+      </w:pPr>
+      <w:rPr>
+        <w:rFonts w:ascii="Wingdings" w:hAnsi="Wingdings" w:hint="default"/>
+        <w:sz w:val="20"/>
+      </w:rPr>
+    </w:lvl>
+  </w:abstractNum>
+  <w:abstractNum w:abstractNumId="11" w15:restartNumberingAfterBreak="0">
+    <w:nsid w:val="7EE31060"/>
+    <w:multiLevelType w:val="multilevel"/>
+    <w:tmpl w:val="D0784C76"/>
+    <w:lvl w:ilvl="0">
+      <w:start w:val="1"/>
+      <w:numFmt w:val="bullet"/>
+      <w:lvlText w:val=""/>
+      <w:lvlJc w:val="left"/>
+      <w:pPr>
+        <w:tabs>
+          <w:tab w:val="num" w:pos="720"/>
+        </w:tabs>
+        <w:ind w:left="720" w:hanging="360"/>
+      </w:pPr>
+      <w:rPr>
+        <w:rFonts w:ascii="Symbol" w:hAnsi="Symbol" w:hint="default"/>
+        <w:sz w:val="20"/>
+      </w:rPr>
+    </w:lvl>
+    <w:lvl w:ilvl="1" w:tentative="1">
+      <w:start w:val="1"/>
+      <w:numFmt w:val="bullet"/>
+      <w:lvlText w:val="o"/>
+      <w:lvlJc w:val="left"/>
+      <w:pPr>
+        <w:tabs>
+          <w:tab w:val="num" w:pos="1440"/>
+        </w:tabs>
+        <w:ind w:left="1440" w:hanging="360"/>
+      </w:pPr>
+      <w:rPr>
+        <w:rFonts w:ascii="Courier New" w:hAnsi="Courier New" w:hint="default"/>
+        <w:sz w:val="20"/>
+      </w:rPr>
+    </w:lvl>
+    <w:lvl w:ilvl="2" w:tentative="1">
+      <w:start w:val="1"/>
+      <w:numFmt w:val="bullet"/>
+      <w:lvlText w:val=""/>
+      <w:lvlJc w:val="left"/>
+      <w:pPr>
+        <w:tabs>
+          <w:tab w:val="num" w:pos="2160"/>
+        </w:tabs>
+        <w:ind w:left="2160" w:hanging="360"/>
+      </w:pPr>
+      <w:rPr>
+        <w:rFonts w:ascii="Wingdings" w:hAnsi="Wingdings" w:hint="default"/>
+        <w:sz w:val="20"/>
+      </w:rPr>
+    </w:lvl>
+    <w:lvl w:ilvl="3" w:tentative="1">
+      <w:start w:val="1"/>
+      <w:numFmt w:val="bullet"/>
+      <w:lvlText w:val=""/>
+      <w:lvlJc w:val="left"/>
+      <w:pPr>
+        <w:tabs>
+          <w:tab w:val="num" w:pos="2880"/>
+        </w:tabs>
+        <w:ind w:left="2880" w:hanging="360"/>
+      </w:pPr>
+      <w:rPr>
+        <w:rFonts w:ascii="Wingdings" w:hAnsi="Wingdings" w:hint="default"/>
+        <w:sz w:val="20"/>
+      </w:rPr>
+    </w:lvl>
+    <w:lvl w:ilvl="4" w:tentative="1">
+      <w:start w:val="1"/>
+      <w:numFmt w:val="bullet"/>
+      <w:lvlText w:val=""/>
+      <w:lvlJc w:val="left"/>
+      <w:pPr>
+        <w:tabs>
+          <w:tab w:val="num" w:pos="3600"/>
+        </w:tabs>
+        <w:ind w:left="3600" w:hanging="360"/>
+      </w:pPr>
+      <w:rPr>
+        <w:rFonts w:ascii="Wingdings" w:hAnsi="Wingdings" w:hint="default"/>
+        <w:sz w:val="20"/>
+      </w:rPr>
+    </w:lvl>
+    <w:lvl w:ilvl="5" w:tentative="1">
+      <w:start w:val="1"/>
+      <w:numFmt w:val="bullet"/>
+      <w:lvlText w:val=""/>
+      <w:lvlJc w:val="left"/>
+      <w:pPr>
+        <w:tabs>
+          <w:tab w:val="num" w:pos="4320"/>
+        </w:tabs>
+        <w:ind w:left="4320" w:hanging="360"/>
+      </w:pPr>
+      <w:rPr>
+        <w:rFonts w:ascii="Wingdings" w:hAnsi="Wingdings" w:hint="default"/>
+        <w:sz w:val="20"/>
+      </w:rPr>
+    </w:lvl>
+    <w:lvl w:ilvl="6" w:tentative="1">
+      <w:start w:val="1"/>
+      <w:numFmt w:val="bullet"/>
+      <w:lvlText w:val=""/>
+      <w:lvlJc w:val="left"/>
+      <w:pPr>
+        <w:tabs>
+          <w:tab w:val="num" w:pos="5040"/>
+        </w:tabs>
+        <w:ind w:left="5040" w:hanging="360"/>
+      </w:pPr>
+      <w:rPr>
+        <w:rFonts w:ascii="Wingdings" w:hAnsi="Wingdings" w:hint="default"/>
+        <w:sz w:val="20"/>
+      </w:rPr>
+    </w:lvl>
+    <w:lvl w:ilvl="7" w:tentative="1">
+      <w:start w:val="1"/>
+      <w:numFmt w:val="bullet"/>
+      <w:lvlText w:val=""/>
+      <w:lvlJc w:val="left"/>
+      <w:pPr>
+        <w:tabs>
+          <w:tab w:val="num" w:pos="5760"/>
+        </w:tabs>
+        <w:ind w:left="5760" w:hanging="360"/>
+      </w:pPr>
+      <w:rPr>
+        <w:rFonts w:ascii="Wingdings" w:hAnsi="Wingdings" w:hint="default"/>
+        <w:sz w:val="20"/>
+      </w:rPr>
+    </w:lvl>
+    <w:lvl w:ilvl="8" w:tentative="1">
+      <w:start w:val="1"/>
+      <w:numFmt w:val="bullet"/>
+      <w:lvlText w:val=""/>
+      <w:lvlJc w:val="left"/>
+      <w:pPr>
+        <w:tabs>
+          <w:tab w:val="num" w:pos="6480"/>
+        </w:tabs>
+        <w:ind w:left="6480" w:hanging="360"/>
+      </w:pPr>
+      <w:rPr>
+        <w:rFonts w:ascii="Wingdings" w:hAnsi="Wingdings" w:hint="default"/>
+        <w:sz w:val="20"/>
+      </w:rPr>
+    </w:lvl>
+  </w:abstractNum>
   <w:num w:numId="1" w16cid:durableId="2083940673">
-    <w:abstractNumId w:val="2"/>
+    <w:abstractNumId w:val="4"/>
   </w:num>
   <w:num w:numId="2" w16cid:durableId="1369910741">
-    <w:abstractNumId w:val="1"/>
+    <w:abstractNumId w:val="2"/>
   </w:num>
   <w:num w:numId="3" w16cid:durableId="381756520">
     <w:abstractNumId w:val="0"/>
   </w:num>
   <w:num w:numId="4" w16cid:durableId="1619027423">
+    <w:abstractNumId w:val="9"/>
+  </w:num>
+  <w:num w:numId="5" w16cid:durableId="450829248">
+    <w:abstractNumId w:val="8"/>
+  </w:num>
+  <w:num w:numId="6" w16cid:durableId="187841723">
+    <w:abstractNumId w:val="7"/>
+  </w:num>
+  <w:num w:numId="7" w16cid:durableId="1739552729">
+    <w:abstractNumId w:val="10"/>
+  </w:num>
+  <w:num w:numId="8" w16cid:durableId="1347514590">
+    <w:abstractNumId w:val="11"/>
+  </w:num>
+  <w:num w:numId="9" w16cid:durableId="2035842076">
     <w:abstractNumId w:val="5"/>
   </w:num>
-  <w:num w:numId="5" w16cid:durableId="450829248">
-    <w:abstractNumId w:val="4"/>
+  <w:num w:numId="10" w16cid:durableId="633609289">
+    <w:abstractNumId w:val="1"/>
   </w:num>
-  <w:num w:numId="6" w16cid:durableId="187841723">
+  <w:num w:numId="11" w16cid:durableId="318850427">
+    <w:abstractNumId w:val="6"/>
+  </w:num>
+  <w:num w:numId="12" w16cid:durableId="1489319562">
     <w:abstractNumId w:val="3"/>
   </w:num>
 </w:numbering>
@@ -2687,7 +5259,6 @@
     <w:next w:val="Normalny"/>
     <w:link w:val="Nagwek3Znak"/>
     <w:uiPriority w:val="9"/>
-    <w:semiHidden/>
     <w:unhideWhenUsed/>
     <w:qFormat/>
     <w:rsid w:val="00E56B35"/>
@@ -2839,7 +5410,6 @@
   <w:style w:type="character" w:default="1" w:styleId="Domylnaczcionkaakapitu">
     <w:name w:val="Default Paragraph Font"/>
     <w:uiPriority w:val="1"/>
-    <w:semiHidden/>
     <w:unhideWhenUsed/>
   </w:style>
   <w:style w:type="table" w:default="1" w:styleId="Standardowy">
@@ -2894,7 +5464,6 @@
     <w:basedOn w:val="Domylnaczcionkaakapitu"/>
     <w:link w:val="Nagwek3"/>
     <w:uiPriority w:val="9"/>
-    <w:semiHidden/>
     <w:rsid w:val="00E56B35"/>
     <w:rPr>
       <w:rFonts w:eastAsiaTheme="majorEastAsia" w:cstheme="majorBidi"/>
@@ -3468,4 +6037,39 @@
     </a:ext>
   </a:extLst>
 </a:theme>
+</file>
+
+<file path=word/webextensions/taskpanes.xml><?xml version="1.0" encoding="utf-8"?>
+<wetp:taskpanes xmlns:wetp="http://schemas.microsoft.com/office/webextensions/taskpanes/2010/11">
+  <wetp:taskpane dockstate="right" visibility="0" width="525" row="6">
+    <wetp:webextensionref xmlns:r="http://schemas.openxmlformats.org/officeDocument/2006/relationships" r:id="rId1"/>
+  </wetp:taskpane>
+</wetp:taskpanes>
+</file>
+
+<file path=word/webextensions/webextension1.xml><?xml version="1.0" encoding="utf-8"?>
+<we:webextension xmlns:we="http://schemas.microsoft.com/office/webextensions/webextension/2010/11" id="{62FFFD8A-76BF-4602-8867-26CBC97A5C1F}">
+  <we:reference id="wa200000011" version="1.0.1.0" store="pl-PL" storeType="OMEX"/>
+  <we:alternateReferences>
+    <we:reference id="WA200000011" version="1.0.1.0" store="WA200000011" storeType="OMEX"/>
+  </we:alternateReferences>
+  <we:properties>
+    <we:property name="language" value="&quot;Json&quot;"/>
+    <we:property name="theme" value="&quot;A11y Dark&quot;"/>
+  </we:properties>
+  <we:bindings/>
+  <we:snapshot xmlns:r="http://schemas.openxmlformats.org/officeDocument/2006/relationships"/>
+</we:webextension>
+</file>
+
+<file path=customXml/item1.xml><?xml version="1.0" encoding="utf-8"?>
+<b:Sources xmlns:b="http://schemas.openxmlformats.org/officeDocument/2006/bibliography" xmlns="http://schemas.openxmlformats.org/officeDocument/2006/bibliography" SelectedStyle="\APASixthEditionOfficeOnline.xsl" StyleName="APA" Version="6"/>
+</file>
+
+<file path=customXml/itemProps1.xml><?xml version="1.0" encoding="utf-8"?>
+<ds:datastoreItem xmlns:ds="http://schemas.openxmlformats.org/officeDocument/2006/customXml" ds:itemID="{76EB2DC2-D5B1-4333-A3CF-A4B2F1B06A26}">
+  <ds:schemaRefs>
+    <ds:schemaRef ds:uri="http://schemas.openxmlformats.org/officeDocument/2006/bibliography"/>
+  </ds:schemaRefs>
+</ds:datastoreItem>
 </file>
</xml_diff>

<commit_message>
Aktualizacja backendu i dokumentacji z osobnego brancha
</commit_message>
<xml_diff>
--- a/dokumentacja_backend/dokumnetacja_backend.docx
+++ b/dokumentacja_backend/dokumnetacja_backend.docx
@@ -291,11 +291,10 @@
           <w:bCs/>
           <w:noProof/>
         </w:rPr>
-        <w:lastRenderedPageBreak/>
         <w:drawing>
-          <wp:inline distT="0" distB="0" distL="0" distR="0" wp14:anchorId="292AA4E9" wp14:editId="0F0BA498">
-            <wp:extent cx="5760720" cy="3444875"/>
-            <wp:effectExtent l="0" t="0" r="0" b="3175"/>
+          <wp:inline distT="0" distB="0" distL="0" distR="0" wp14:anchorId="292AA4E9" wp14:editId="4D134F4C">
+            <wp:extent cx="5760720" cy="2538410"/>
+            <wp:effectExtent l="0" t="0" r="0" b="0"/>
             <wp:docPr id="83114013" name="Obraz 2"/>
             <wp:cNvGraphicFramePr>
               <a:graphicFrameLocks xmlns:a="http://schemas.openxmlformats.org/drawingml/2006/main" noChangeAspect="1"/>
@@ -304,13 +303,1075 @@
               <a:graphicData uri="http://schemas.openxmlformats.org/drawingml/2006/picture">
                 <pic:pic xmlns:pic="http://schemas.openxmlformats.org/drawingml/2006/picture">
                   <pic:nvPicPr>
-                    <pic:cNvPr id="0" name="Picture 30"/>
+                    <pic:cNvPr id="83114013" name="Obraz 2"/>
                     <pic:cNvPicPr>
                       <a:picLocks noChangeAspect="1" noChangeArrowheads="1"/>
                     </pic:cNvPicPr>
                   </pic:nvPicPr>
                   <pic:blipFill>
-                    <a:blip r:embed="rId5" cstate="print">
+                    <a:blip r:embed="rId6" cstate="print">
+                      <a:extLst>
+                        <a:ext uri="{28A0092B-C50C-407E-A947-70E740481C1C}">
+                          <a14:useLocalDpi xmlns:a14="http://schemas.microsoft.com/office/drawing/2010/main" val="0"/>
+                        </a:ext>
+                      </a:extLst>
+                    </a:blip>
+                    <a:stretch>
+                      <a:fillRect/>
+                    </a:stretch>
+                  </pic:blipFill>
+                  <pic:spPr bwMode="auto">
+                    <a:xfrm>
+                      <a:off x="0" y="0"/>
+                      <a:ext cx="5760720" cy="2538410"/>
+                    </a:xfrm>
+                    <a:prstGeom prst="rect">
+                      <a:avLst/>
+                    </a:prstGeom>
+                    <a:noFill/>
+                    <a:ln>
+                      <a:noFill/>
+                    </a:ln>
+                  </pic:spPr>
+                </pic:pic>
+              </a:graphicData>
+            </a:graphic>
+          </wp:inline>
+        </w:drawing>
+      </w:r>
+    </w:p>
+    <w:p>
+      <w:pPr>
+        <w:rPr>
+          <w:b/>
+          <w:bCs/>
+        </w:rPr>
+      </w:pPr>
+    </w:p>
+    <w:p>
+      <w:pPr>
+        <w:rPr>
+          <w:b/>
+          <w:bCs/>
+        </w:rPr>
+      </w:pPr>
+    </w:p>
+    <w:p>
+      <w:pPr>
+        <w:rPr>
+          <w:b/>
+          <w:bCs/>
+        </w:rPr>
+      </w:pPr>
+      <w:r>
+        <w:rPr>
+          <w:b/>
+          <w:bCs/>
+        </w:rPr>
+        <w:lastRenderedPageBreak/>
+        <w:t>Moduł Autoryzacji i Użytkowników</w:t>
+      </w:r>
+    </w:p>
+    <w:p>
+      <w:pPr>
+        <w:numPr>
+          <w:ilvl w:val="0"/>
+          <w:numId w:val="1"/>
+        </w:numPr>
+      </w:pPr>
+      <w:proofErr w:type="spellStart"/>
+      <w:r>
+        <w:rPr>
+          <w:b/>
+          <w:bCs/>
+        </w:rPr>
+        <w:t>Uzytkownik</w:t>
+      </w:r>
+      <w:proofErr w:type="spellEnd"/>
+      <w:r>
+        <w:rPr>
+          <w:b/>
+          <w:bCs/>
+        </w:rPr>
+        <w:t xml:space="preserve"> (Rozszerzenie </w:t>
+      </w:r>
+      <w:proofErr w:type="spellStart"/>
+      <w:r>
+        <w:rPr>
+          <w:b/>
+          <w:bCs/>
+        </w:rPr>
+        <w:t>AbstractUser</w:t>
+      </w:r>
+      <w:proofErr w:type="spellEnd"/>
+      <w:r>
+        <w:rPr>
+          <w:b/>
+          <w:bCs/>
+        </w:rPr>
+        <w:t>):</w:t>
+      </w:r>
+      <w:r>
+        <w:t xml:space="preserve"> Centralny punkt systemu. Przechowuje podstawowe dane logowania (login, hasło, email) oraz dedykowane pola uczelniane: rola (Student/Profesor), </w:t>
+      </w:r>
+      <w:proofErr w:type="spellStart"/>
+      <w:r>
+        <w:t>numer_indeksu</w:t>
+      </w:r>
+      <w:proofErr w:type="spellEnd"/>
+      <w:r>
+        <w:t xml:space="preserve"> i </w:t>
+      </w:r>
+      <w:proofErr w:type="spellStart"/>
+      <w:r>
+        <w:t>grupa_dziekanska</w:t>
+      </w:r>
+      <w:proofErr w:type="spellEnd"/>
+      <w:r>
+        <w:t>.</w:t>
+      </w:r>
+    </w:p>
+    <w:p>
+      <w:pPr>
+        <w:rPr>
+          <w:b/>
+          <w:bCs/>
+        </w:rPr>
+      </w:pPr>
+      <w:r>
+        <w:rPr>
+          <w:b/>
+          <w:bCs/>
+        </w:rPr>
+        <w:t>Moduł Zadań i Weryfikacji Kodu</w:t>
+      </w:r>
+    </w:p>
+    <w:p>
+      <w:pPr>
+        <w:numPr>
+          <w:ilvl w:val="0"/>
+          <w:numId w:val="2"/>
+        </w:numPr>
+      </w:pPr>
+      <w:proofErr w:type="spellStart"/>
+      <w:r>
+        <w:rPr>
+          <w:b/>
+          <w:bCs/>
+        </w:rPr>
+        <w:t>Snippet</w:t>
+      </w:r>
+      <w:proofErr w:type="spellEnd"/>
+      <w:r>
+        <w:rPr>
+          <w:b/>
+          <w:bCs/>
+        </w:rPr>
+        <w:t>:</w:t>
+      </w:r>
+      <w:r>
+        <w:t xml:space="preserve"> Tabela pełniąca rolę notatnika. Przechowuje luźne kawałki kodu (</w:t>
+      </w:r>
+      <w:proofErr w:type="spellStart"/>
+      <w:r>
+        <w:t>code</w:t>
+      </w:r>
+      <w:proofErr w:type="spellEnd"/>
+      <w:r>
+        <w:t xml:space="preserve">, </w:t>
+      </w:r>
+      <w:proofErr w:type="spellStart"/>
+      <w:r>
+        <w:t>language</w:t>
+      </w:r>
+      <w:proofErr w:type="spellEnd"/>
+      <w:r>
+        <w:t>) tworzone przez użytkowników na "brudno", niezwiązane z żadnym konkretnym zadaniem.</w:t>
+      </w:r>
+    </w:p>
+    <w:p>
+      <w:pPr>
+        <w:numPr>
+          <w:ilvl w:val="0"/>
+          <w:numId w:val="2"/>
+        </w:numPr>
+      </w:pPr>
+      <w:proofErr w:type="spellStart"/>
+      <w:r>
+        <w:rPr>
+          <w:b/>
+          <w:bCs/>
+        </w:rPr>
+        <w:t>Task</w:t>
+      </w:r>
+      <w:proofErr w:type="spellEnd"/>
+      <w:r>
+        <w:rPr>
+          <w:b/>
+          <w:bCs/>
+        </w:rPr>
+        <w:t xml:space="preserve"> (Zadanie):</w:t>
+      </w:r>
+      <w:r>
+        <w:t xml:space="preserve"> Główna tabela z problemami algorytmicznymi. Zawiera tytuł, treść, poziom trudności oraz flagę </w:t>
+      </w:r>
+      <w:proofErr w:type="spellStart"/>
+      <w:r>
+        <w:t>is_public</w:t>
+      </w:r>
+      <w:proofErr w:type="spellEnd"/>
+      <w:r>
+        <w:t xml:space="preserve">. Definiuje też krytyczne ograniczenia dla systemu sprawdzającego: </w:t>
+      </w:r>
+      <w:proofErr w:type="spellStart"/>
+      <w:r>
+        <w:t>time_limit</w:t>
+      </w:r>
+      <w:proofErr w:type="spellEnd"/>
+      <w:r>
+        <w:t xml:space="preserve"> (w ms) oraz </w:t>
+      </w:r>
+      <w:proofErr w:type="spellStart"/>
+      <w:r>
+        <w:t>memory_limit</w:t>
+      </w:r>
+      <w:proofErr w:type="spellEnd"/>
+      <w:r>
+        <w:t xml:space="preserve"> (w MB).</w:t>
+      </w:r>
+    </w:p>
+    <w:p>
+      <w:pPr>
+        <w:numPr>
+          <w:ilvl w:val="0"/>
+          <w:numId w:val="2"/>
+        </w:numPr>
+      </w:pPr>
+      <w:proofErr w:type="spellStart"/>
+      <w:r>
+        <w:rPr>
+          <w:b/>
+          <w:bCs/>
+        </w:rPr>
+        <w:t>TestCase</w:t>
+      </w:r>
+      <w:proofErr w:type="spellEnd"/>
+      <w:r>
+        <w:rPr>
+          <w:b/>
+          <w:bCs/>
+        </w:rPr>
+        <w:t xml:space="preserve"> (Przypadek Testowy):</w:t>
+      </w:r>
+      <w:r>
+        <w:t xml:space="preserve"> Zestawy danych służące do weryfikacji poprawności algorytmów. Każde zadanie posiada wiele testów (relacja Jeden-do-Wielu). Model zawiera dane wejściowe (</w:t>
+      </w:r>
+      <w:proofErr w:type="spellStart"/>
+      <w:r>
+        <w:t>input_data</w:t>
+      </w:r>
+      <w:proofErr w:type="spellEnd"/>
+      <w:r>
+        <w:t>), oczekiwany wynik (</w:t>
+      </w:r>
+      <w:proofErr w:type="spellStart"/>
+      <w:r>
+        <w:t>expected_output</w:t>
+      </w:r>
+      <w:proofErr w:type="spellEnd"/>
+      <w:r>
+        <w:t xml:space="preserve">) oraz flagę </w:t>
+      </w:r>
+      <w:proofErr w:type="spellStart"/>
+      <w:r>
+        <w:t>is_sample</w:t>
+      </w:r>
+      <w:proofErr w:type="spellEnd"/>
+      <w:r>
+        <w:t xml:space="preserve"> decydującą, czy test jest widoczny dla rozwiązującego, czy ukryty.</w:t>
+      </w:r>
+    </w:p>
+    <w:p>
+      <w:pPr>
+        <w:numPr>
+          <w:ilvl w:val="0"/>
+          <w:numId w:val="2"/>
+        </w:numPr>
+      </w:pPr>
+      <w:r>
+        <w:rPr>
+          <w:b/>
+          <w:bCs/>
+        </w:rPr>
+        <w:t>Solution (Rozwiązanie):</w:t>
+      </w:r>
+      <w:r>
+        <w:t xml:space="preserve"> Łącznik pomiędzy Użytkownikiem a Zadaniem. Zapisuje wysłany kod źródłowy, język programowania oraz ewentualny opis (</w:t>
+      </w:r>
+      <w:proofErr w:type="spellStart"/>
+      <w:r>
+        <w:t>Markdown</w:t>
+      </w:r>
+      <w:proofErr w:type="spellEnd"/>
+      <w:r>
+        <w:t>). Baza przechowuje tu również fizyczny czas wykonania i zużytą pamięć podczas ewaluacji oraz ostateczny status (np. Zaakceptowane, Błąd Kompilacji).</w:t>
+      </w:r>
+    </w:p>
+    <w:p>
+      <w:pPr>
+        <w:rPr>
+          <w:b/>
+          <w:bCs/>
+        </w:rPr>
+      </w:pPr>
+      <w:r>
+        <w:rPr>
+          <w:b/>
+          <w:bCs/>
+        </w:rPr>
+        <w:t>Moduł Społeczności</w:t>
+      </w:r>
+    </w:p>
+    <w:p>
+      <w:pPr>
+        <w:numPr>
+          <w:ilvl w:val="0"/>
+          <w:numId w:val="3"/>
+        </w:numPr>
+      </w:pPr>
+      <w:proofErr w:type="spellStart"/>
+      <w:r>
+        <w:rPr>
+          <w:b/>
+          <w:bCs/>
+        </w:rPr>
+        <w:t>CodeGroup</w:t>
+      </w:r>
+      <w:proofErr w:type="spellEnd"/>
+      <w:r>
+        <w:rPr>
+          <w:b/>
+          <w:bCs/>
+        </w:rPr>
+        <w:t xml:space="preserve"> (Grupa):</w:t>
+      </w:r>
+      <w:r>
+        <w:t xml:space="preserve"> Reprezentuje zrzeszenie użytkowników (np. konkretną klasę na uczelni). Definiuje nazwę, opis oraz flagę </w:t>
+      </w:r>
+      <w:proofErr w:type="spellStart"/>
+      <w:r>
+        <w:t>is_open</w:t>
+      </w:r>
+      <w:proofErr w:type="spellEnd"/>
+      <w:r>
+        <w:t>, która określa, czy do grupy można dołączyć z "ulicy".</w:t>
+      </w:r>
+    </w:p>
+    <w:p>
+      <w:pPr>
+        <w:numPr>
+          <w:ilvl w:val="0"/>
+          <w:numId w:val="3"/>
+        </w:numPr>
+      </w:pPr>
+      <w:proofErr w:type="spellStart"/>
+      <w:r>
+        <w:rPr>
+          <w:b/>
+          <w:bCs/>
+        </w:rPr>
+        <w:t>GroupMembership</w:t>
+      </w:r>
+      <w:proofErr w:type="spellEnd"/>
+      <w:r>
+        <w:rPr>
+          <w:b/>
+          <w:bCs/>
+        </w:rPr>
+        <w:t>:</w:t>
+      </w:r>
+      <w:r>
+        <w:t xml:space="preserve"> Tabela pośrednia (</w:t>
+      </w:r>
+      <w:proofErr w:type="spellStart"/>
+      <w:r>
+        <w:t>Many-to-Many</w:t>
+      </w:r>
+      <w:proofErr w:type="spellEnd"/>
+      <w:r>
+        <w:t>) decydująca o tym, kto należy do jakiej grupy. Co ważne, przechowuje również role, pozwalając odróżnić zwykłego członka od Administratora danej grupy.</w:t>
+      </w:r>
+    </w:p>
+    <w:p>
+      <w:pPr>
+        <w:rPr>
+          <w:b/>
+          <w:bCs/>
+        </w:rPr>
+      </w:pPr>
+      <w:r>
+        <w:rPr>
+          <w:b/>
+          <w:bCs/>
+        </w:rPr>
+        <w:t>Moduł Turniejowy (Konkursy)</w:t>
+      </w:r>
+    </w:p>
+    <w:p>
+      <w:pPr>
+        <w:numPr>
+          <w:ilvl w:val="0"/>
+          <w:numId w:val="4"/>
+        </w:numPr>
+      </w:pPr>
+      <w:proofErr w:type="spellStart"/>
+      <w:r>
+        <w:rPr>
+          <w:b/>
+          <w:bCs/>
+        </w:rPr>
+        <w:t>Contest</w:t>
+      </w:r>
+      <w:proofErr w:type="spellEnd"/>
+      <w:r>
+        <w:rPr>
+          <w:b/>
+          <w:bCs/>
+        </w:rPr>
+        <w:t xml:space="preserve"> (Konkurs):</w:t>
+      </w:r>
+      <w:r>
+        <w:t xml:space="preserve"> Organizuje zadania w ograniczone czasowo ramy (</w:t>
+      </w:r>
+      <w:proofErr w:type="spellStart"/>
+      <w:r>
+        <w:t>start_time</w:t>
+      </w:r>
+      <w:proofErr w:type="spellEnd"/>
+      <w:r>
+        <w:t xml:space="preserve">, </w:t>
+      </w:r>
+      <w:proofErr w:type="spellStart"/>
+      <w:r>
+        <w:t>end_time</w:t>
+      </w:r>
+      <w:proofErr w:type="spellEnd"/>
+      <w:r>
+        <w:t xml:space="preserve">). Posiada flagę </w:t>
+      </w:r>
+      <w:proofErr w:type="spellStart"/>
+      <w:r>
+        <w:t>strict_mode</w:t>
+      </w:r>
+      <w:proofErr w:type="spellEnd"/>
+      <w:r>
+        <w:t xml:space="preserve">, która aktywuje na </w:t>
+      </w:r>
+      <w:proofErr w:type="spellStart"/>
+      <w:r>
+        <w:t>frontendzie</w:t>
+      </w:r>
+      <w:proofErr w:type="spellEnd"/>
+      <w:r>
+        <w:t xml:space="preserve"> tryb zabezpieczeń </w:t>
+      </w:r>
+      <w:proofErr w:type="spellStart"/>
+      <w:r>
+        <w:t>antysciągowych</w:t>
+      </w:r>
+      <w:proofErr w:type="spellEnd"/>
+      <w:r>
+        <w:t xml:space="preserve"> (np. blokadę wyjścia z karty przeglądarki).</w:t>
+      </w:r>
+    </w:p>
+    <w:p>
+      <w:pPr>
+        <w:numPr>
+          <w:ilvl w:val="0"/>
+          <w:numId w:val="4"/>
+        </w:numPr>
+      </w:pPr>
+      <w:proofErr w:type="spellStart"/>
+      <w:r>
+        <w:rPr>
+          <w:b/>
+          <w:bCs/>
+        </w:rPr>
+        <w:t>ContestParticipation</w:t>
+      </w:r>
+      <w:proofErr w:type="spellEnd"/>
+      <w:r>
+        <w:rPr>
+          <w:b/>
+          <w:bCs/>
+        </w:rPr>
+        <w:t>:</w:t>
+      </w:r>
+      <w:r>
+        <w:t xml:space="preserve"> Tabela pośrednia łącząca Konkurs z Grupami startującymi. Rejestruje łączny wynik (</w:t>
+      </w:r>
+      <w:proofErr w:type="spellStart"/>
+      <w:r>
+        <w:t>total_score</w:t>
+      </w:r>
+      <w:proofErr w:type="spellEnd"/>
+      <w:r>
+        <w:t>) oraz status ewentualnej dyskwalifikacji (</w:t>
+      </w:r>
+      <w:proofErr w:type="spellStart"/>
+      <w:r>
+        <w:t>is_disqualified</w:t>
+      </w:r>
+      <w:proofErr w:type="spellEnd"/>
+      <w:r>
+        <w:t>).</w:t>
+      </w:r>
+    </w:p>
+    <w:p>
+      <w:pPr>
+        <w:numPr>
+          <w:ilvl w:val="0"/>
+          <w:numId w:val="4"/>
+        </w:numPr>
+      </w:pPr>
+      <w:proofErr w:type="spellStart"/>
+      <w:r>
+        <w:rPr>
+          <w:b/>
+          <w:bCs/>
+        </w:rPr>
+        <w:lastRenderedPageBreak/>
+        <w:t>ContestHost</w:t>
+      </w:r>
+      <w:proofErr w:type="spellEnd"/>
+      <w:r>
+        <w:rPr>
+          <w:b/>
+          <w:bCs/>
+        </w:rPr>
+        <w:t>:</w:t>
+      </w:r>
+      <w:r>
+        <w:t xml:space="preserve"> Tabela delegująca uprawnienia. Pozwala Głównemu Twórcy konkursu przypisać innych użytkowników jako sędziów/pomocników z precyzyjnie określonymi prawami (np. możliwość modyfikacji zadań, wyrzucania grup).</w:t>
+      </w:r>
+    </w:p>
+    <w:p>
+      <w:pPr>
+        <w:rPr>
+          <w:b/>
+          <w:bCs/>
+        </w:rPr>
+      </w:pPr>
+      <w:r>
+        <w:rPr>
+          <w:b/>
+          <w:bCs/>
+        </w:rPr>
+        <w:t>Moduł Zgłoszeń</w:t>
+      </w:r>
+    </w:p>
+    <w:p>
+      <w:pPr>
+        <w:numPr>
+          <w:ilvl w:val="0"/>
+          <w:numId w:val="5"/>
+        </w:numPr>
+      </w:pPr>
+      <w:proofErr w:type="spellStart"/>
+      <w:r>
+        <w:rPr>
+          <w:b/>
+          <w:bCs/>
+        </w:rPr>
+        <w:t>TaskReport</w:t>
+      </w:r>
+      <w:proofErr w:type="spellEnd"/>
+      <w:r>
+        <w:rPr>
+          <w:b/>
+          <w:bCs/>
+        </w:rPr>
+        <w:t xml:space="preserve"> (Zgłoszenie/</w:t>
+      </w:r>
+      <w:proofErr w:type="spellStart"/>
+      <w:r>
+        <w:rPr>
+          <w:b/>
+          <w:bCs/>
+        </w:rPr>
+        <w:t>Ticket</w:t>
+      </w:r>
+      <w:proofErr w:type="spellEnd"/>
+      <w:r>
+        <w:rPr>
+          <w:b/>
+          <w:bCs/>
+        </w:rPr>
+        <w:t>):</w:t>
+      </w:r>
+      <w:r>
+        <w:t xml:space="preserve"> Pozwala użytkownikom zgłaszać problemy z zadaniami (np. błędny test ukryty). Łączy konkretne zadanie z osobą zgłaszającą i udostępnia status rozwiązania problemu (</w:t>
+      </w:r>
+      <w:proofErr w:type="spellStart"/>
+      <w:r>
+        <w:t>is_resolved</w:t>
+      </w:r>
+      <w:proofErr w:type="spellEnd"/>
+      <w:r>
+        <w:t>).</w:t>
+      </w:r>
+    </w:p>
+    <w:p>
+      <w:r>
+        <w:pict w14:anchorId="5F918391">
+          <v:rect id="_x0000_i1026" style="width:0;height:1.5pt" o:hralign="center" o:hrstd="t" o:hr="t" fillcolor="#a0a0a0" stroked="f"/>
+        </w:pict>
+      </w:r>
+    </w:p>
+    <w:p>
+      <w:pPr>
+        <w:pStyle w:val="Nagwek2"/>
+      </w:pPr>
+      <w:r>
+        <w:t>3. Pokrycie Wymagań Biznesowych (Historie Użytkowników - HU)</w:t>
+      </w:r>
+    </w:p>
+    <w:p>
+      <w:r>
+        <w:t>Architektura została ściśle dopasowana do wymagań projektowych. Tabela poniżej przedstawia, jak poszczególne modele realizują założenia HU:</w:t>
+      </w:r>
+    </w:p>
+    <w:p>
+      <w:pPr>
+        <w:numPr>
+          <w:ilvl w:val="0"/>
+          <w:numId w:val="6"/>
+        </w:numPr>
+      </w:pPr>
+      <w:r>
+        <w:rPr>
+          <w:b/>
+          <w:bCs/>
+        </w:rPr>
+        <w:t>Zarządzanie Zadaniami (HU 1.3, 1.4, 1.12):</w:t>
+      </w:r>
+      <w:r>
+        <w:t xml:space="preserve"> Tabela </w:t>
+      </w:r>
+      <w:proofErr w:type="spellStart"/>
+      <w:r>
+        <w:t>Task</w:t>
+      </w:r>
+      <w:proofErr w:type="spellEnd"/>
+      <w:r>
+        <w:t xml:space="preserve"> pozwala na tworzenie zadań prywatnych i publicznych. Obsługę treści zapewnia elastyczne pole </w:t>
+      </w:r>
+      <w:proofErr w:type="spellStart"/>
+      <w:r>
+        <w:t>description</w:t>
+      </w:r>
+      <w:proofErr w:type="spellEnd"/>
+      <w:r>
+        <w:t xml:space="preserve"> (gotowe na </w:t>
+      </w:r>
+      <w:proofErr w:type="spellStart"/>
+      <w:r>
+        <w:t>parsowanie</w:t>
+      </w:r>
+      <w:proofErr w:type="spellEnd"/>
+      <w:r>
+        <w:t xml:space="preserve"> </w:t>
+      </w:r>
+      <w:proofErr w:type="spellStart"/>
+      <w:r>
+        <w:t>Markdown</w:t>
+      </w:r>
+      <w:proofErr w:type="spellEnd"/>
+      <w:r>
+        <w:t xml:space="preserve">). Ograniczenia sprzętowe dla sprawdzarki kodu gwarantują pola </w:t>
+      </w:r>
+      <w:proofErr w:type="spellStart"/>
+      <w:r>
+        <w:t>time_limit</w:t>
+      </w:r>
+      <w:proofErr w:type="spellEnd"/>
+      <w:r>
+        <w:t xml:space="preserve"> oraz </w:t>
+      </w:r>
+      <w:proofErr w:type="spellStart"/>
+      <w:r>
+        <w:t>memory_limit</w:t>
+      </w:r>
+      <w:proofErr w:type="spellEnd"/>
+      <w:r>
+        <w:t>.</w:t>
+      </w:r>
+    </w:p>
+    <w:p>
+      <w:pPr>
+        <w:numPr>
+          <w:ilvl w:val="0"/>
+          <w:numId w:val="6"/>
+        </w:numPr>
+      </w:pPr>
+      <w:r>
+        <w:rPr>
+          <w:b/>
+          <w:bCs/>
+        </w:rPr>
+        <w:t>System Ewaluacji Testowej (HU 1.7, 1.8):</w:t>
+      </w:r>
+      <w:r>
+        <w:t xml:space="preserve"> Rozdzielenie testów jawnych od ukrytych zostało osiągnięte poprzez dedykowany model </w:t>
+      </w:r>
+      <w:proofErr w:type="spellStart"/>
+      <w:r>
+        <w:t>TestCase</w:t>
+      </w:r>
+      <w:proofErr w:type="spellEnd"/>
+      <w:r>
+        <w:t xml:space="preserve"> z flagą </w:t>
+      </w:r>
+      <w:proofErr w:type="spellStart"/>
+      <w:r>
+        <w:t>is_sample</w:t>
+      </w:r>
+      <w:proofErr w:type="spellEnd"/>
+      <w:r>
+        <w:t xml:space="preserve"> i opcją punktacji za każdy pojedynczy test.</w:t>
+      </w:r>
+    </w:p>
+    <w:p>
+      <w:pPr>
+        <w:numPr>
+          <w:ilvl w:val="0"/>
+          <w:numId w:val="6"/>
+        </w:numPr>
+      </w:pPr>
+      <w:r>
+        <w:rPr>
+          <w:b/>
+          <w:bCs/>
+        </w:rPr>
+        <w:t>Zarządzanie Społecznością (HU 2.1, 2.2):</w:t>
+      </w:r>
+      <w:r>
+        <w:t xml:space="preserve"> Tabela </w:t>
+      </w:r>
+      <w:proofErr w:type="spellStart"/>
+      <w:r>
+        <w:t>CodeGroup</w:t>
+      </w:r>
+      <w:proofErr w:type="spellEnd"/>
+      <w:r>
+        <w:t xml:space="preserve"> oraz przypisana do niej relacja </w:t>
+      </w:r>
+      <w:proofErr w:type="spellStart"/>
+      <w:r>
+        <w:t>GroupMembership</w:t>
+      </w:r>
+      <w:proofErr w:type="spellEnd"/>
+      <w:r>
+        <w:t xml:space="preserve"> obsługuje zarówno zróżnicowanie dostępu (grupy otwarte/zamknięte), jak i hierarchię wewnątrz społeczności (role członka i </w:t>
+      </w:r>
+      <w:proofErr w:type="gramStart"/>
+      <w:r>
+        <w:t>admina</w:t>
+      </w:r>
+      <w:proofErr w:type="gramEnd"/>
+      <w:r>
+        <w:t>).</w:t>
+      </w:r>
+    </w:p>
+    <w:p>
+      <w:pPr>
+        <w:numPr>
+          <w:ilvl w:val="0"/>
+          <w:numId w:val="6"/>
+        </w:numPr>
+      </w:pPr>
+      <w:r>
+        <w:rPr>
+          <w:b/>
+          <w:bCs/>
+        </w:rPr>
+        <w:t>Zabezpieczenia i Turnieje (HU 2.3):</w:t>
+      </w:r>
+      <w:r>
+        <w:t xml:space="preserve"> System Konkursów (</w:t>
+      </w:r>
+      <w:proofErr w:type="spellStart"/>
+      <w:r>
+        <w:t>Contest</w:t>
+      </w:r>
+      <w:proofErr w:type="spellEnd"/>
+      <w:r>
+        <w:t xml:space="preserve">) poprzez flagę </w:t>
+      </w:r>
+      <w:proofErr w:type="spellStart"/>
+      <w:r>
+        <w:t>strict_mode</w:t>
+      </w:r>
+      <w:proofErr w:type="spellEnd"/>
+      <w:r>
+        <w:t xml:space="preserve"> natywnie wspiera implementację mechanizmów </w:t>
+      </w:r>
+      <w:proofErr w:type="spellStart"/>
+      <w:r>
+        <w:t>antysciągowych</w:t>
+      </w:r>
+      <w:proofErr w:type="spellEnd"/>
+      <w:r>
+        <w:t>, a zaawansowane tabele pośrednie umożliwiają organizację turniejów międzyszkolnych (wiele grup w jednym konkursie).</w:t>
+      </w:r>
+    </w:p>
+    <w:p>
+      <w:pPr>
+        <w:numPr>
+          <w:ilvl w:val="0"/>
+          <w:numId w:val="6"/>
+        </w:numPr>
+      </w:pPr>
+      <w:r>
+        <w:rPr>
+          <w:b/>
+          <w:bCs/>
+        </w:rPr>
+        <w:t>Utrzymanie Jakości (HU 1.10, 3.3):</w:t>
+      </w:r>
+      <w:r>
+        <w:t xml:space="preserve"> Dedykowany model </w:t>
+      </w:r>
+      <w:proofErr w:type="spellStart"/>
+      <w:r>
+        <w:t>TaskReport</w:t>
+      </w:r>
+      <w:proofErr w:type="spellEnd"/>
+      <w:r>
+        <w:t xml:space="preserve"> implementuje pełnoprawny, śledzony system zgłaszania błędów przez studentów do wykładowców.</w:t>
+      </w:r>
+    </w:p>
+    <w:p>
+      <w:r>
+        <w:pict w14:anchorId="6C7130AF">
+          <v:rect id="_x0000_i1027" style="width:0;height:1.5pt" o:hralign="center" o:hrstd="t" o:hr="t" fillcolor="#a0a0a0" stroked="f"/>
+        </w:pict>
+      </w:r>
+    </w:p>
+    <w:p>
+      <w:pPr>
+        <w:pStyle w:val="Nagwek2"/>
+      </w:pPr>
+      <w:r>
+        <w:t>4. Wizualizacja i Aktualizacja Schematu</w:t>
+      </w:r>
+    </w:p>
+    <w:p>
+      <w:r>
+        <w:t>Zgodnie z zasadą DRY (</w:t>
+      </w:r>
+      <w:proofErr w:type="spellStart"/>
+      <w:r>
+        <w:t>Don't</w:t>
+      </w:r>
+      <w:proofErr w:type="spellEnd"/>
+      <w:r>
+        <w:t xml:space="preserve"> </w:t>
+      </w:r>
+      <w:proofErr w:type="spellStart"/>
+      <w:r>
+        <w:t>Repeat</w:t>
+      </w:r>
+      <w:proofErr w:type="spellEnd"/>
+      <w:r>
+        <w:t xml:space="preserve"> </w:t>
+      </w:r>
+      <w:proofErr w:type="spellStart"/>
+      <w:r>
+        <w:t>Yourself</w:t>
+      </w:r>
+      <w:proofErr w:type="spellEnd"/>
+      <w:r>
+        <w:t>), nie utrzymujemy ręcznie rysowanych schematów bazy danych, ponieważ szybko stają się nieaktualne.</w:t>
+      </w:r>
+    </w:p>
+    <w:p>
+      <w:r>
+        <w:lastRenderedPageBreak/>
+        <w:t xml:space="preserve">Wizualizacja bazy generowana jest </w:t>
+      </w:r>
+      <w:r>
+        <w:rPr>
+          <w:b/>
+          <w:bCs/>
+        </w:rPr>
+        <w:t>automatycznie</w:t>
+      </w:r>
+      <w:r>
+        <w:t xml:space="preserve"> bezpośrednio z kodu źródłowego (models.py). Wykorzystujemy do tego połączenie programu systemowego </w:t>
+      </w:r>
+      <w:proofErr w:type="spellStart"/>
+      <w:r>
+        <w:rPr>
+          <w:b/>
+          <w:bCs/>
+        </w:rPr>
+        <w:t>Graphviz</w:t>
+      </w:r>
+      <w:proofErr w:type="spellEnd"/>
+      <w:r>
+        <w:t xml:space="preserve"> oraz biblioteki </w:t>
+      </w:r>
+      <w:proofErr w:type="spellStart"/>
+      <w:r>
+        <w:t>pythonowej</w:t>
+      </w:r>
+      <w:proofErr w:type="spellEnd"/>
+      <w:r>
+        <w:t xml:space="preserve"> </w:t>
+      </w:r>
+      <w:proofErr w:type="spellStart"/>
+      <w:r>
+        <w:rPr>
+          <w:b/>
+          <w:bCs/>
+        </w:rPr>
+        <w:t>django-extensions</w:t>
+      </w:r>
+      <w:proofErr w:type="spellEnd"/>
+      <w:r>
+        <w:t>.</w:t>
+      </w:r>
+    </w:p>
+    <w:p>
+      <w:r>
+        <w:rPr>
+          <w:b/>
+          <w:bCs/>
+        </w:rPr>
+        <w:t>Instrukcja wygenerowania aktualnego diagramu (ERD):</w:t>
+      </w:r>
+      <w:r>
+        <w:t xml:space="preserve"> Aby pobrać najświeższy schemat relacji między tabelami, w głównym katalogu projektu uruchom poniższą komendę w terminalu:</w:t>
+      </w:r>
+    </w:p>
+    <w:p>
+      <w:pPr>
+        <w:rPr>
+          <w:lang w:val="en-US"/>
+        </w:rPr>
+      </w:pPr>
+      <w:r>
+        <w:rPr>
+          <w:lang w:val="en-US"/>
+        </w:rPr>
+        <w:t>Bash</w:t>
+      </w:r>
+    </w:p>
+    <w:p>
+      <w:pPr>
+        <w:shd w:val="clear" w:color="auto" w:fill="2B2B2B"/>
+        <w:rPr>
+          <w:lang w:val="en-US"/>
+        </w:rPr>
+      </w:pPr>
+      <w:r>
+        <w:rPr>
+          <w:lang w:val="en-US"/>
+        </w:rPr>
+        <w:t xml:space="preserve">docker-compose exec web python manage.py </w:t>
+      </w:r>
+      <w:proofErr w:type="spellStart"/>
+      <w:r>
+        <w:rPr>
+          <w:lang w:val="en-US"/>
+        </w:rPr>
+        <w:t>graph_models</w:t>
+      </w:r>
+      <w:proofErr w:type="spellEnd"/>
+      <w:r>
+        <w:rPr>
+          <w:lang w:val="en-US"/>
+        </w:rPr>
+        <w:t xml:space="preserve"> -a -o diagram_bazy_danych.png</w:t>
+      </w:r>
+    </w:p>
+    <w:p>
+      <w:pPr>
+        <w:rPr>
+          <w:lang w:val="en-US"/>
+        </w:rPr>
+      </w:pPr>
+    </w:p>
+    <w:p>
+      <w:pPr>
+        <w:rPr>
+          <w:lang w:val="en-US"/>
+        </w:rPr>
+      </w:pPr>
+    </w:p>
+    <w:p>
+      <w:r>
+        <w:t>Wygenerowany plik diagram_bazy_danych.png pojawi się w folderze roboczym i będzie zawierał wszystkie bieżące tabele, relacje (Klucze Obce) oraz typy danych.</w:t>
+      </w:r>
+    </w:p>
+    <w:p/>
+    <w:p/>
+    <w:p/>
+    <w:p/>
+    <w:p/>
+    <w:p/>
+    <w:p/>
+    <w:p>
+      <w:pPr>
+        <w:pStyle w:val="Nagwek1"/>
+      </w:pPr>
+      <w:proofErr w:type="spellStart"/>
+      <w:r>
+        <w:t>Endpointy</w:t>
+      </w:r>
+      <w:proofErr w:type="spellEnd"/>
+      <w:r>
+        <w:t xml:space="preserve"> w API</w:t>
+      </w:r>
+    </w:p>
+    <w:p>
+      <w:pPr>
+        <w:pStyle w:val="Nagwek2"/>
+      </w:pPr>
+      <w:r>
+        <w:t xml:space="preserve">Diagram </w:t>
+      </w:r>
+      <w:proofErr w:type="spellStart"/>
+      <w:r>
+        <w:t>endpoinów</w:t>
+      </w:r>
+      <w:proofErr w:type="spellEnd"/>
+      <w:r>
+        <w:t>:</w:t>
+      </w:r>
+    </w:p>
+    <w:p>
+      <w:r>
+        <w:drawing>
+          <wp:inline distT="0" distB="0" distL="0" distR="0" wp14:anchorId="159C42D1" wp14:editId="4B86F268">
+            <wp:extent cx="5760720" cy="2033270"/>
+            <wp:effectExtent l="0" t="0" r="0" b="5080"/>
+            <wp:docPr id="341320927" name="Obraz 2"/>
+            <wp:cNvGraphicFramePr>
+              <a:graphicFrameLocks xmlns:a="http://schemas.openxmlformats.org/drawingml/2006/main" noChangeAspect="1"/>
+            </wp:cNvGraphicFramePr>
+            <a:graphic xmlns:a="http://schemas.openxmlformats.org/drawingml/2006/main">
+              <a:graphicData uri="http://schemas.openxmlformats.org/drawingml/2006/picture">
+                <pic:pic xmlns:pic="http://schemas.openxmlformats.org/drawingml/2006/picture">
+                  <pic:nvPicPr>
+                    <pic:cNvPr id="0" name="Picture 9"/>
+                    <pic:cNvPicPr>
+                      <a:picLocks noChangeAspect="1" noChangeArrowheads="1"/>
+                    </pic:cNvPicPr>
+                  </pic:nvPicPr>
+                  <pic:blipFill>
+                    <a:blip r:embed="rId7" cstate="print">
                       <a:extLst>
                         <a:ext uri="{28A0092B-C50C-407E-A947-70E740481C1C}">
                           <a14:useLocalDpi xmlns:a14="http://schemas.microsoft.com/office/drawing/2010/main" val="0"/>
@@ -325,7 +1386,7 @@
                   <pic:spPr bwMode="auto">
                     <a:xfrm>
                       <a:off x="0" y="0"/>
-                      <a:ext cx="5760720" cy="3444875"/>
+                      <a:ext cx="5760720" cy="2033270"/>
                     </a:xfrm>
                     <a:prstGeom prst="rect">
                       <a:avLst/>
@@ -342,261 +1403,545 @@
         </w:drawing>
       </w:r>
     </w:p>
-    <w:p>
-      <w:pPr>
-        <w:rPr>
-          <w:b/>
-          <w:bCs/>
-        </w:rPr>
-      </w:pPr>
-    </w:p>
-    <w:p>
-      <w:pPr>
-        <w:rPr>
-          <w:b/>
-          <w:bCs/>
-        </w:rPr>
-      </w:pPr>
-    </w:p>
-    <w:p>
-      <w:pPr>
-        <w:rPr>
-          <w:b/>
-          <w:bCs/>
-        </w:rPr>
-      </w:pPr>
-      <w:r>
-        <w:rPr>
-          <w:b/>
-          <w:bCs/>
-        </w:rPr>
-        <w:t>Moduł Autoryzacji i Użytkowników</w:t>
+    <w:p/>
+    <w:p>
+      <w:pPr>
+        <w:pStyle w:val="Nagwek2"/>
+      </w:pPr>
+      <w:r>
+        <w:t xml:space="preserve">1. Zrealizowane </w:t>
+      </w:r>
+      <w:proofErr w:type="spellStart"/>
+      <w:r>
+        <w:t>Endpointy</w:t>
+      </w:r>
+      <w:proofErr w:type="spellEnd"/>
+      <w:r>
+        <w:t xml:space="preserve"> (Działające)</w:t>
+      </w:r>
+    </w:p>
+    <w:p>
+      <w:r>
+        <w:t>P</w:t>
+      </w:r>
+      <w:r>
+        <w:t xml:space="preserve">osiadamy w pełni funkcjonalny moduł autoryzacji i uwierzytelniania oparty na </w:t>
+      </w:r>
+      <w:proofErr w:type="spellStart"/>
+      <w:r>
+        <w:t>tokenach</w:t>
+      </w:r>
+      <w:proofErr w:type="spellEnd"/>
+      <w:r>
+        <w:t xml:space="preserve"> (</w:t>
+      </w:r>
+      <w:proofErr w:type="spellStart"/>
+      <w:r>
+        <w:t>Token</w:t>
+      </w:r>
+      <w:proofErr w:type="spellEnd"/>
+      <w:r>
+        <w:t xml:space="preserve"> </w:t>
+      </w:r>
+      <w:proofErr w:type="spellStart"/>
+      <w:r>
+        <w:t>Authentication</w:t>
+      </w:r>
+      <w:proofErr w:type="spellEnd"/>
+      <w:r>
+        <w:t xml:space="preserve"> z </w:t>
+      </w:r>
+      <w:proofErr w:type="spellStart"/>
+      <w:r>
+        <w:t>Django</w:t>
+      </w:r>
+      <w:proofErr w:type="spellEnd"/>
+      <w:r>
+        <w:t xml:space="preserve"> REST Framework).</w:t>
+      </w:r>
+    </w:p>
+    <w:p>
+      <w:pPr>
+        <w:pStyle w:val="Nagwek3"/>
+      </w:pPr>
+      <w:r>
+        <w:t>1.1 Rejestracja Użytkownika</w:t>
       </w:r>
     </w:p>
     <w:p>
       <w:pPr>
         <w:numPr>
           <w:ilvl w:val="0"/>
-          <w:numId w:val="1"/>
+          <w:numId w:val="7"/>
         </w:numPr>
       </w:pPr>
-      <w:proofErr w:type="spellStart"/>
-      <w:r>
-        <w:rPr>
-          <w:b/>
-          <w:bCs/>
-        </w:rPr>
-        <w:t>Uzytkownik</w:t>
-      </w:r>
-      <w:proofErr w:type="spellEnd"/>
-      <w:r>
-        <w:rPr>
-          <w:b/>
-          <w:bCs/>
-        </w:rPr>
-        <w:t xml:space="preserve"> (Rozszerzenie </w:t>
-      </w:r>
-      <w:proofErr w:type="spellStart"/>
-      <w:r>
-        <w:rPr>
-          <w:b/>
-          <w:bCs/>
-        </w:rPr>
-        <w:t>AbstractUser</w:t>
-      </w:r>
-      <w:proofErr w:type="spellEnd"/>
-      <w:r>
-        <w:rPr>
-          <w:b/>
-          <w:bCs/>
-        </w:rPr>
-        <w:t>):</w:t>
-      </w:r>
-      <w:r>
-        <w:t xml:space="preserve"> Centralny punkt systemu. Przechowuje podstawowe dane logowania (login, hasło, email) oraz dedykowane pola uczelniane: rola (Student/Profesor), </w:t>
-      </w:r>
-      <w:proofErr w:type="spellStart"/>
-      <w:r>
-        <w:t>numer_indeksu</w:t>
-      </w:r>
-      <w:proofErr w:type="spellEnd"/>
-      <w:r>
-        <w:t xml:space="preserve"> i </w:t>
-      </w:r>
-      <w:proofErr w:type="spellStart"/>
-      <w:r>
-        <w:t>grupa_dziekanska</w:t>
-      </w:r>
-      <w:proofErr w:type="spellEnd"/>
-      <w:r>
-        <w:t>.</w:t>
-      </w:r>
-    </w:p>
-    <w:p>
-      <w:pPr>
-        <w:rPr>
-          <w:b/>
-          <w:bCs/>
-        </w:rPr>
-      </w:pPr>
-      <w:r>
-        <w:rPr>
-          <w:b/>
-          <w:bCs/>
-        </w:rPr>
-        <w:t>Moduł Zadań i Weryfikacji Kodu</w:t>
+      <w:r>
+        <w:rPr>
+          <w:b/>
+          <w:bCs/>
+        </w:rPr>
+        <w:t>Adres URL:</w:t>
+      </w:r>
+      <w:r>
+        <w:t xml:space="preserve"> POST /</w:t>
+      </w:r>
+      <w:proofErr w:type="spellStart"/>
+      <w:r>
+        <w:t>api</w:t>
+      </w:r>
+      <w:proofErr w:type="spellEnd"/>
+      <w:r>
+        <w:t>/rejestracja/</w:t>
       </w:r>
     </w:p>
     <w:p>
       <w:pPr>
         <w:numPr>
           <w:ilvl w:val="0"/>
-          <w:numId w:val="2"/>
+          <w:numId w:val="7"/>
         </w:numPr>
       </w:pPr>
-      <w:proofErr w:type="spellStart"/>
-      <w:r>
-        <w:rPr>
-          <w:b/>
-          <w:bCs/>
-        </w:rPr>
-        <w:t>Snippet</w:t>
-      </w:r>
-      <w:proofErr w:type="spellEnd"/>
-      <w:r>
-        <w:rPr>
-          <w:b/>
-          <w:bCs/>
-        </w:rPr>
-        <w:t>:</w:t>
-      </w:r>
-      <w:r>
-        <w:t xml:space="preserve"> Tabela pełniąca rolę notatnika. Przechowuje luźne kawałki kodu (</w:t>
-      </w:r>
-      <w:proofErr w:type="spellStart"/>
-      <w:r>
-        <w:t>code</w:t>
-      </w:r>
-      <w:proofErr w:type="spellEnd"/>
-      <w:r>
-        <w:t xml:space="preserve">, </w:t>
-      </w:r>
-      <w:proofErr w:type="spellStart"/>
-      <w:r>
-        <w:t>language</w:t>
-      </w:r>
-      <w:proofErr w:type="spellEnd"/>
-      <w:r>
-        <w:t>) tworzone przez użytkowników na "brudno", niezwiązane z żadnym konkretnym zadaniem.</w:t>
+      <w:r>
+        <w:rPr>
+          <w:b/>
+          <w:bCs/>
+        </w:rPr>
+        <w:t>Kto ma dostęp:</w:t>
+      </w:r>
+      <w:r>
+        <w:t xml:space="preserve"> Każdy (Brak kłódki / </w:t>
+      </w:r>
+      <w:proofErr w:type="spellStart"/>
+      <w:r>
+        <w:t>AllowAny</w:t>
+      </w:r>
+      <w:proofErr w:type="spellEnd"/>
+      <w:r>
+        <w:t>)</w:t>
       </w:r>
     </w:p>
     <w:p>
       <w:pPr>
         <w:numPr>
           <w:ilvl w:val="0"/>
-          <w:numId w:val="2"/>
+          <w:numId w:val="7"/>
         </w:numPr>
       </w:pPr>
-      <w:proofErr w:type="spellStart"/>
-      <w:r>
-        <w:rPr>
-          <w:b/>
-          <w:bCs/>
-        </w:rPr>
-        <w:t>Task</w:t>
-      </w:r>
-      <w:proofErr w:type="spellEnd"/>
-      <w:r>
-        <w:rPr>
-          <w:b/>
-          <w:bCs/>
-        </w:rPr>
-        <w:t xml:space="preserve"> (Zadanie):</w:t>
-      </w:r>
-      <w:r>
-        <w:t xml:space="preserve"> Główna tabela z problemami algorytmicznymi. Zawiera tytuł, treść, poziom trudności oraz flagę </w:t>
-      </w:r>
-      <w:proofErr w:type="spellStart"/>
-      <w:r>
-        <w:t>is_public</w:t>
-      </w:r>
-      <w:proofErr w:type="spellEnd"/>
-      <w:r>
-        <w:t xml:space="preserve">. Definiuje też krytyczne ograniczenia dla systemu sprawdzającego: </w:t>
-      </w:r>
-      <w:proofErr w:type="spellStart"/>
-      <w:r>
-        <w:t>time_limit</w:t>
-      </w:r>
-      <w:proofErr w:type="spellEnd"/>
-      <w:r>
-        <w:t xml:space="preserve"> (w ms) oraz </w:t>
-      </w:r>
-      <w:proofErr w:type="spellStart"/>
-      <w:r>
-        <w:t>memory_limit</w:t>
-      </w:r>
-      <w:proofErr w:type="spellEnd"/>
-      <w:r>
-        <w:t xml:space="preserve"> (w MB).</w:t>
+      <w:r>
+        <w:rPr>
+          <w:b/>
+          <w:bCs/>
+        </w:rPr>
+        <w:t xml:space="preserve">Działanie z </w:t>
+      </w:r>
+      <w:proofErr w:type="spellStart"/>
+      <w:r>
+        <w:rPr>
+          <w:b/>
+          <w:bCs/>
+        </w:rPr>
+        <w:t>frontendem</w:t>
+      </w:r>
+      <w:proofErr w:type="spellEnd"/>
+      <w:r>
+        <w:rPr>
+          <w:b/>
+          <w:bCs/>
+        </w:rPr>
+        <w:t>:</w:t>
+      </w:r>
+      <w:r>
+        <w:t xml:space="preserve"> </w:t>
+      </w:r>
+      <w:proofErr w:type="spellStart"/>
+      <w:r>
+        <w:t>Frontend</w:t>
+      </w:r>
+      <w:proofErr w:type="spellEnd"/>
+      <w:r>
+        <w:t xml:space="preserve"> wysyła obiekt JSON z danymi z formularza. </w:t>
+      </w:r>
+      <w:proofErr w:type="spellStart"/>
+      <w:r>
+        <w:t>Backend</w:t>
+      </w:r>
+      <w:proofErr w:type="spellEnd"/>
+      <w:r>
+        <w:t xml:space="preserve"> waliduje dane (sprawdza unikalność maila, poprawność ról, wymogi uczelniane). Jeśli dane są błędne, </w:t>
+      </w:r>
+      <w:proofErr w:type="spellStart"/>
+      <w:r>
+        <w:t>backend</w:t>
+      </w:r>
+      <w:proofErr w:type="spellEnd"/>
+      <w:r>
+        <w:t xml:space="preserve"> zwraca status 400 Bad </w:t>
+      </w:r>
+      <w:proofErr w:type="spellStart"/>
+      <w:r>
+        <w:t>Request</w:t>
+      </w:r>
+      <w:proofErr w:type="spellEnd"/>
+      <w:r>
+        <w:t xml:space="preserve"> wraz z obiektem zawierającym tablice błędów dla konkretnych pól (co </w:t>
+      </w:r>
+      <w:proofErr w:type="spellStart"/>
+      <w:r>
+        <w:t>frontend</w:t>
+      </w:r>
+      <w:proofErr w:type="spellEnd"/>
+      <w:r>
+        <w:t xml:space="preserve"> teraz poprawnie łapie i wyświetla w czerwonej belce).</w:t>
       </w:r>
     </w:p>
     <w:p>
       <w:pPr>
         <w:numPr>
           <w:ilvl w:val="0"/>
-          <w:numId w:val="2"/>
+          <w:numId w:val="7"/>
         </w:numPr>
       </w:pPr>
-      <w:proofErr w:type="spellStart"/>
-      <w:r>
-        <w:rPr>
-          <w:b/>
-          <w:bCs/>
-        </w:rPr>
-        <w:t>TestCase</w:t>
-      </w:r>
-      <w:proofErr w:type="spellEnd"/>
-      <w:r>
-        <w:rPr>
-          <w:b/>
-          <w:bCs/>
-        </w:rPr>
-        <w:t xml:space="preserve"> (Przypadek Testowy):</w:t>
-      </w:r>
-      <w:r>
-        <w:t xml:space="preserve"> Zestawy danych służące do weryfikacji poprawności algorytmów. Każde zadanie posiada wiele testów (relacja Jeden-do-Wielu). Model zawiera dane wejściowe (</w:t>
-      </w:r>
-      <w:proofErr w:type="spellStart"/>
-      <w:r>
-        <w:t>input_data</w:t>
-      </w:r>
-      <w:proofErr w:type="spellEnd"/>
-      <w:r>
-        <w:t>), oczekiwany wynik (</w:t>
-      </w:r>
-      <w:proofErr w:type="spellStart"/>
-      <w:r>
-        <w:t>expected_output</w:t>
-      </w:r>
-      <w:proofErr w:type="spellEnd"/>
-      <w:r>
-        <w:t xml:space="preserve">) oraz flagę </w:t>
-      </w:r>
-      <w:proofErr w:type="spellStart"/>
-      <w:r>
-        <w:t>is_sample</w:t>
-      </w:r>
-      <w:proofErr w:type="spellEnd"/>
-      <w:r>
-        <w:t xml:space="preserve"> decydującą, czy test jest widoczny dla rozwiązującego, czy ukryty.</w:t>
+      <w:r>
+        <w:rPr>
+          <w:b/>
+          <w:bCs/>
+        </w:rPr>
+        <w:t xml:space="preserve">Oczekiwany </w:t>
+      </w:r>
+      <w:proofErr w:type="spellStart"/>
+      <w:r>
+        <w:rPr>
+          <w:b/>
+          <w:bCs/>
+        </w:rPr>
+        <w:t>Payload</w:t>
+      </w:r>
+      <w:proofErr w:type="spellEnd"/>
+      <w:r>
+        <w:rPr>
+          <w:b/>
+          <w:bCs/>
+        </w:rPr>
+        <w:t xml:space="preserve"> (JSON):</w:t>
+      </w:r>
+    </w:p>
+    <w:p>
+      <w:r>
+        <w:t>JSON</w:t>
+      </w:r>
+    </w:p>
+    <w:p>
+      <w:pPr>
+        <w:shd w:val="clear" w:color="auto" w:fill="2B2B2B"/>
+        <w:rPr>
+          <w:lang w:val="en-US"/>
+        </w:rPr>
+      </w:pPr>
+      <w:r>
+        <w:rPr>
+          <w:rFonts w:ascii="Courier New" w:hAnsi="Courier New" w:cs="Courier New"/>
+          <w:color w:val="F8F8F2"/>
+          <w:lang w:val="en-US"/>
+        </w:rPr>
+        <w:t>{</w:t>
+      </w:r>
+      <w:r>
+        <w:rPr>
+          <w:rFonts w:ascii="Courier New" w:hAnsi="Courier New" w:cs="Courier New"/>
+          <w:color w:val="F8F8F2"/>
+          <w:lang w:val="en-US"/>
+        </w:rPr>
+        <w:br/>
+        <w:t xml:space="preserve">  "username": </w:t>
+      </w:r>
+      <w:r>
+        <w:rPr>
+          <w:rFonts w:ascii="Courier New" w:hAnsi="Courier New" w:cs="Courier New"/>
+          <w:color w:val="ABE338"/>
+          <w:lang w:val="en-US"/>
+        </w:rPr>
+        <w:t>"igor22"</w:t>
+      </w:r>
+      <w:r>
+        <w:rPr>
+          <w:rFonts w:ascii="Courier New" w:hAnsi="Courier New" w:cs="Courier New"/>
+          <w:color w:val="F8F8F2"/>
+          <w:lang w:val="en-US"/>
+        </w:rPr>
+        <w:t>,</w:t>
+      </w:r>
+      <w:r>
+        <w:rPr>
+          <w:rFonts w:ascii="Courier New" w:hAnsi="Courier New" w:cs="Courier New"/>
+          <w:color w:val="F8F8F2"/>
+          <w:lang w:val="en-US"/>
+        </w:rPr>
+        <w:br/>
+        <w:t xml:space="preserve">  "email": </w:t>
+      </w:r>
+      <w:r>
+        <w:rPr>
+          <w:rFonts w:ascii="Courier New" w:hAnsi="Courier New" w:cs="Courier New"/>
+          <w:color w:val="ABE338"/>
+          <w:lang w:val="en-US"/>
+        </w:rPr>
+        <w:t>"k12345@student.wat.edu.pl"</w:t>
+      </w:r>
+      <w:r>
+        <w:rPr>
+          <w:rFonts w:ascii="Courier New" w:hAnsi="Courier New" w:cs="Courier New"/>
+          <w:color w:val="F8F8F2"/>
+          <w:lang w:val="en-US"/>
+        </w:rPr>
+        <w:t>,</w:t>
+      </w:r>
+      <w:r>
+        <w:rPr>
+          <w:rFonts w:ascii="Courier New" w:hAnsi="Courier New" w:cs="Courier New"/>
+          <w:color w:val="F8F8F2"/>
+          <w:lang w:val="en-US"/>
+        </w:rPr>
+        <w:br/>
+        <w:t xml:space="preserve">  "password": </w:t>
+      </w:r>
+      <w:r>
+        <w:rPr>
+          <w:rFonts w:ascii="Courier New" w:hAnsi="Courier New" w:cs="Courier New"/>
+          <w:color w:val="ABE338"/>
+          <w:lang w:val="en-US"/>
+        </w:rPr>
+        <w:t>"SuperTajneHaslo123#"</w:t>
+      </w:r>
+      <w:r>
+        <w:rPr>
+          <w:rFonts w:ascii="Courier New" w:hAnsi="Courier New" w:cs="Courier New"/>
+          <w:color w:val="F8F8F2"/>
+          <w:lang w:val="en-US"/>
+        </w:rPr>
+        <w:t>,</w:t>
+      </w:r>
+      <w:r>
+        <w:rPr>
+          <w:rFonts w:ascii="Courier New" w:hAnsi="Courier New" w:cs="Courier New"/>
+          <w:color w:val="F8F8F2"/>
+          <w:lang w:val="en-US"/>
+        </w:rPr>
+        <w:br/>
+        <w:t xml:space="preserve">  "</w:t>
+      </w:r>
+      <w:proofErr w:type="spellStart"/>
+      <w:r>
+        <w:rPr>
+          <w:rFonts w:ascii="Courier New" w:hAnsi="Courier New" w:cs="Courier New"/>
+          <w:color w:val="F8F8F2"/>
+          <w:lang w:val="en-US"/>
+        </w:rPr>
+        <w:t>first_name</w:t>
+      </w:r>
+      <w:proofErr w:type="spellEnd"/>
+      <w:r>
+        <w:rPr>
+          <w:rFonts w:ascii="Courier New" w:hAnsi="Courier New" w:cs="Courier New"/>
+          <w:color w:val="F8F8F2"/>
+          <w:lang w:val="en-US"/>
+        </w:rPr>
+        <w:t xml:space="preserve">": </w:t>
+      </w:r>
+      <w:r>
+        <w:rPr>
+          <w:rFonts w:ascii="Courier New" w:hAnsi="Courier New" w:cs="Courier New"/>
+          <w:color w:val="ABE338"/>
+          <w:lang w:val="en-US"/>
+        </w:rPr>
+        <w:t>"Igor"</w:t>
+      </w:r>
+      <w:r>
+        <w:rPr>
+          <w:rFonts w:ascii="Courier New" w:hAnsi="Courier New" w:cs="Courier New"/>
+          <w:color w:val="F8F8F2"/>
+          <w:lang w:val="en-US"/>
+        </w:rPr>
+        <w:t>,</w:t>
+      </w:r>
+      <w:r>
+        <w:rPr>
+          <w:rFonts w:ascii="Courier New" w:hAnsi="Courier New" w:cs="Courier New"/>
+          <w:color w:val="F8F8F2"/>
+          <w:lang w:val="en-US"/>
+        </w:rPr>
+        <w:br/>
+        <w:t xml:space="preserve">  "</w:t>
+      </w:r>
+      <w:proofErr w:type="spellStart"/>
+      <w:r>
+        <w:rPr>
+          <w:rFonts w:ascii="Courier New" w:hAnsi="Courier New" w:cs="Courier New"/>
+          <w:color w:val="F8F8F2"/>
+          <w:lang w:val="en-US"/>
+        </w:rPr>
+        <w:t>last_name</w:t>
+      </w:r>
+      <w:proofErr w:type="spellEnd"/>
+      <w:r>
+        <w:rPr>
+          <w:rFonts w:ascii="Courier New" w:hAnsi="Courier New" w:cs="Courier New"/>
+          <w:color w:val="F8F8F2"/>
+          <w:lang w:val="en-US"/>
+        </w:rPr>
+        <w:t xml:space="preserve">": </w:t>
+      </w:r>
+      <w:r>
+        <w:rPr>
+          <w:rFonts w:ascii="Courier New" w:hAnsi="Courier New" w:cs="Courier New"/>
+          <w:color w:val="ABE338"/>
+          <w:lang w:val="en-US"/>
+        </w:rPr>
+        <w:t>"Filipiak"</w:t>
+      </w:r>
+      <w:r>
+        <w:rPr>
+          <w:rFonts w:ascii="Courier New" w:hAnsi="Courier New" w:cs="Courier New"/>
+          <w:color w:val="F8F8F2"/>
+          <w:lang w:val="en-US"/>
+        </w:rPr>
+        <w:t>,</w:t>
+      </w:r>
+      <w:r>
+        <w:rPr>
+          <w:rFonts w:ascii="Courier New" w:hAnsi="Courier New" w:cs="Courier New"/>
+          <w:color w:val="F8F8F2"/>
+          <w:lang w:val="en-US"/>
+        </w:rPr>
+        <w:br/>
+        <w:t xml:space="preserve">  "</w:t>
+      </w:r>
+      <w:proofErr w:type="spellStart"/>
+      <w:r>
+        <w:rPr>
+          <w:rFonts w:ascii="Courier New" w:hAnsi="Courier New" w:cs="Courier New"/>
+          <w:color w:val="F8F8F2"/>
+          <w:lang w:val="en-US"/>
+        </w:rPr>
+        <w:t>rola</w:t>
+      </w:r>
+      <w:proofErr w:type="spellEnd"/>
+      <w:r>
+        <w:rPr>
+          <w:rFonts w:ascii="Courier New" w:hAnsi="Courier New" w:cs="Courier New"/>
+          <w:color w:val="F8F8F2"/>
+          <w:lang w:val="en-US"/>
+        </w:rPr>
+        <w:t xml:space="preserve">": </w:t>
+      </w:r>
+      <w:r>
+        <w:rPr>
+          <w:rFonts w:ascii="Courier New" w:hAnsi="Courier New" w:cs="Courier New"/>
+          <w:color w:val="ABE338"/>
+          <w:lang w:val="en-US"/>
+        </w:rPr>
+        <w:t>"student"</w:t>
+      </w:r>
+      <w:r>
+        <w:rPr>
+          <w:rFonts w:ascii="Courier New" w:hAnsi="Courier New" w:cs="Courier New"/>
+          <w:color w:val="F8F8F2"/>
+          <w:lang w:val="en-US"/>
+        </w:rPr>
+        <w:t>,</w:t>
+      </w:r>
+      <w:r>
+        <w:rPr>
+          <w:rFonts w:ascii="Courier New" w:hAnsi="Courier New" w:cs="Courier New"/>
+          <w:color w:val="F8F8F2"/>
+          <w:lang w:val="en-US"/>
+        </w:rPr>
+        <w:br/>
+        <w:t xml:space="preserve">  "</w:t>
+      </w:r>
+      <w:proofErr w:type="spellStart"/>
+      <w:r>
+        <w:rPr>
+          <w:rFonts w:ascii="Courier New" w:hAnsi="Courier New" w:cs="Courier New"/>
+          <w:color w:val="F8F8F2"/>
+          <w:lang w:val="en-US"/>
+        </w:rPr>
+        <w:t>grupa_dziekanska</w:t>
+      </w:r>
+      <w:proofErr w:type="spellEnd"/>
+      <w:r>
+        <w:rPr>
+          <w:rFonts w:ascii="Courier New" w:hAnsi="Courier New" w:cs="Courier New"/>
+          <w:color w:val="F8F8F2"/>
+          <w:lang w:val="en-US"/>
+        </w:rPr>
+        <w:t xml:space="preserve">": </w:t>
+      </w:r>
+      <w:r>
+        <w:rPr>
+          <w:rFonts w:ascii="Courier New" w:hAnsi="Courier New" w:cs="Courier New"/>
+          <w:color w:val="ABE338"/>
+          <w:lang w:val="en-US"/>
+        </w:rPr>
+        <w:t>"WCY24KY2S1"</w:t>
+      </w:r>
+      <w:r>
+        <w:rPr>
+          <w:rFonts w:ascii="Courier New" w:hAnsi="Courier New" w:cs="Courier New"/>
+          <w:color w:val="F8F8F2"/>
+          <w:lang w:val="en-US"/>
+        </w:rPr>
+        <w:t>,</w:t>
+      </w:r>
+      <w:r>
+        <w:rPr>
+          <w:rFonts w:ascii="Courier New" w:hAnsi="Courier New" w:cs="Courier New"/>
+          <w:color w:val="F8F8F2"/>
+          <w:lang w:val="en-US"/>
+        </w:rPr>
+        <w:br/>
+        <w:t xml:space="preserve">  "</w:t>
+      </w:r>
+      <w:proofErr w:type="spellStart"/>
+      <w:r>
+        <w:rPr>
+          <w:rFonts w:ascii="Courier New" w:hAnsi="Courier New" w:cs="Courier New"/>
+          <w:color w:val="F8F8F2"/>
+          <w:lang w:val="en-US"/>
+        </w:rPr>
+        <w:t>numer_indeksu</w:t>
+      </w:r>
+      <w:proofErr w:type="spellEnd"/>
+      <w:r>
+        <w:rPr>
+          <w:rFonts w:ascii="Courier New" w:hAnsi="Courier New" w:cs="Courier New"/>
+          <w:color w:val="F8F8F2"/>
+          <w:lang w:val="en-US"/>
+        </w:rPr>
+        <w:t xml:space="preserve">": </w:t>
+      </w:r>
+      <w:r>
+        <w:rPr>
+          <w:rFonts w:ascii="Courier New" w:hAnsi="Courier New" w:cs="Courier New"/>
+          <w:color w:val="ABE338"/>
+          <w:lang w:val="en-US"/>
+        </w:rPr>
+        <w:t>"11111"</w:t>
+      </w:r>
+      <w:r>
+        <w:rPr>
+          <w:rFonts w:ascii="Courier New" w:hAnsi="Courier New" w:cs="Courier New"/>
+          <w:color w:val="F8F8F2"/>
+          <w:lang w:val="en-US"/>
+        </w:rPr>
+        <w:br/>
+        <w:t>}</w:t>
       </w:r>
     </w:p>
     <w:p>
       <w:pPr>
         <w:numPr>
           <w:ilvl w:val="0"/>
-          <w:numId w:val="2"/>
+          <w:numId w:val="7"/>
         </w:numPr>
       </w:pPr>
       <w:r>
@@ -604,352 +1949,532 @@
           <w:b/>
           <w:bCs/>
         </w:rPr>
-        <w:t>Solution (Rozwiązanie):</w:t>
-      </w:r>
-      <w:r>
-        <w:t xml:space="preserve"> Łącznik pomiędzy Użytkownikiem a Zadaniem. Zapisuje wysłany kod źródłowy, język programowania oraz ewentualny opis (</w:t>
-      </w:r>
-      <w:proofErr w:type="spellStart"/>
-      <w:r>
-        <w:t>Markdown</w:t>
-      </w:r>
-      <w:proofErr w:type="spellEnd"/>
-      <w:r>
-        <w:t xml:space="preserve">). </w:t>
-      </w:r>
-      <w:r>
-        <w:lastRenderedPageBreak/>
-        <w:t>Baza przechowuje tu również fizyczny czas wykonania i zużytą pamięć podczas ewaluacji oraz ostateczny status (np. Zaakceptowane, Błąd Kompilacji).</w:t>
-      </w:r>
-    </w:p>
-    <w:p>
-      <w:pPr>
-        <w:rPr>
-          <w:b/>
-          <w:bCs/>
-        </w:rPr>
-      </w:pPr>
-      <w:r>
-        <w:rPr>
-          <w:b/>
-          <w:bCs/>
-        </w:rPr>
-        <w:t>Moduł Społeczności</w:t>
-      </w:r>
+        <w:t>Poprawna Odpowiedź:</w:t>
+      </w:r>
+      <w:r>
+        <w:t xml:space="preserve"> Status 201 </w:t>
+      </w:r>
+      <w:proofErr w:type="spellStart"/>
+      <w:r>
+        <w:t>Created</w:t>
+      </w:r>
+      <w:proofErr w:type="spellEnd"/>
+    </w:p>
+    <w:p>
+      <w:pPr>
+        <w:pStyle w:val="Nagwek3"/>
+      </w:pPr>
+      <w:r>
+        <w:t xml:space="preserve">1.2 Logowanie i Pobieranie </w:t>
+      </w:r>
+      <w:proofErr w:type="spellStart"/>
+      <w:r>
+        <w:t>Tokenu</w:t>
+      </w:r>
+      <w:proofErr w:type="spellEnd"/>
     </w:p>
     <w:p>
       <w:pPr>
         <w:numPr>
           <w:ilvl w:val="0"/>
-          <w:numId w:val="3"/>
+          <w:numId w:val="8"/>
         </w:numPr>
       </w:pPr>
-      <w:proofErr w:type="spellStart"/>
-      <w:r>
-        <w:rPr>
-          <w:b/>
-          <w:bCs/>
-        </w:rPr>
-        <w:t>CodeGroup</w:t>
-      </w:r>
-      <w:proofErr w:type="spellEnd"/>
-      <w:r>
-        <w:rPr>
-          <w:b/>
-          <w:bCs/>
-        </w:rPr>
-        <w:t xml:space="preserve"> (Grupa):</w:t>
-      </w:r>
-      <w:r>
-        <w:t xml:space="preserve"> Reprezentuje zrzeszenie użytkowników (np. konkretną klasę na uczelni). Definiuje nazwę, opis oraz flagę </w:t>
-      </w:r>
-      <w:proofErr w:type="spellStart"/>
-      <w:r>
-        <w:t>is_open</w:t>
-      </w:r>
-      <w:proofErr w:type="spellEnd"/>
-      <w:r>
-        <w:t>, która określa, czy do grupy można dołączyć z "ulicy".</w:t>
+      <w:r>
+        <w:rPr>
+          <w:b/>
+          <w:bCs/>
+        </w:rPr>
+        <w:t>Adres URL:</w:t>
+      </w:r>
+      <w:r>
+        <w:t xml:space="preserve"> POST /</w:t>
+      </w:r>
+      <w:proofErr w:type="spellStart"/>
+      <w:r>
+        <w:t>api</w:t>
+      </w:r>
+      <w:proofErr w:type="spellEnd"/>
+      <w:r>
+        <w:t>/log</w:t>
+      </w:r>
+      <w:r>
+        <w:t>owanie</w:t>
+      </w:r>
+      <w:r>
+        <w:t>/ (lub odpowiednik zdefiniowany w urls.py)</w:t>
       </w:r>
     </w:p>
     <w:p>
       <w:pPr>
         <w:numPr>
           <w:ilvl w:val="0"/>
-          <w:numId w:val="3"/>
+          <w:numId w:val="8"/>
         </w:numPr>
       </w:pPr>
-      <w:proofErr w:type="spellStart"/>
-      <w:r>
-        <w:rPr>
-          <w:b/>
-          <w:bCs/>
-        </w:rPr>
-        <w:t>GroupMembership</w:t>
-      </w:r>
-      <w:proofErr w:type="spellEnd"/>
-      <w:r>
-        <w:rPr>
-          <w:b/>
-          <w:bCs/>
-        </w:rPr>
-        <w:t>:</w:t>
-      </w:r>
-      <w:r>
-        <w:t xml:space="preserve"> Tabela pośrednia (</w:t>
-      </w:r>
-      <w:proofErr w:type="spellStart"/>
-      <w:r>
-        <w:t>Many-to-Many</w:t>
-      </w:r>
-      <w:proofErr w:type="spellEnd"/>
-      <w:r>
-        <w:t>) decydująca o tym, kto należy do jakiej grupy. Co ważne, przechowuje również role, pozwalając odróżnić zwykłego członka od Administratora danej grupy.</w:t>
-      </w:r>
-    </w:p>
-    <w:p>
-      <w:pPr>
-        <w:rPr>
-          <w:b/>
-          <w:bCs/>
-        </w:rPr>
-      </w:pPr>
-      <w:r>
-        <w:rPr>
-          <w:b/>
-          <w:bCs/>
-        </w:rPr>
-        <w:t>Moduł Turniejowy (Konkursy)</w:t>
+      <w:r>
+        <w:rPr>
+          <w:b/>
+          <w:bCs/>
+        </w:rPr>
+        <w:t>Kto ma dostęp:</w:t>
+      </w:r>
+      <w:r>
+        <w:t xml:space="preserve"> Każdy</w:t>
       </w:r>
     </w:p>
     <w:p>
       <w:pPr>
         <w:numPr>
           <w:ilvl w:val="0"/>
-          <w:numId w:val="4"/>
+          <w:numId w:val="8"/>
         </w:numPr>
       </w:pPr>
-      <w:proofErr w:type="spellStart"/>
-      <w:r>
-        <w:rPr>
-          <w:b/>
-          <w:bCs/>
-        </w:rPr>
-        <w:t>Contest</w:t>
-      </w:r>
-      <w:proofErr w:type="spellEnd"/>
-      <w:r>
-        <w:rPr>
-          <w:b/>
-          <w:bCs/>
-        </w:rPr>
-        <w:t xml:space="preserve"> (Konkurs):</w:t>
-      </w:r>
-      <w:r>
-        <w:t xml:space="preserve"> Organizuje zadania w ograniczone czasowo ramy (</w:t>
-      </w:r>
-      <w:proofErr w:type="spellStart"/>
-      <w:r>
-        <w:t>start_time</w:t>
-      </w:r>
-      <w:proofErr w:type="spellEnd"/>
-      <w:r>
-        <w:t xml:space="preserve">, </w:t>
-      </w:r>
-      <w:proofErr w:type="spellStart"/>
-      <w:r>
-        <w:t>end_time</w:t>
-      </w:r>
-      <w:proofErr w:type="spellEnd"/>
-      <w:r>
-        <w:t xml:space="preserve">). Posiada flagę </w:t>
-      </w:r>
-      <w:proofErr w:type="spellStart"/>
-      <w:r>
-        <w:t>strict_mode</w:t>
-      </w:r>
-      <w:proofErr w:type="spellEnd"/>
-      <w:r>
-        <w:t xml:space="preserve">, która aktywuje na </w:t>
-      </w:r>
-      <w:proofErr w:type="spellStart"/>
-      <w:r>
-        <w:t>frontendzie</w:t>
-      </w:r>
-      <w:proofErr w:type="spellEnd"/>
-      <w:r>
-        <w:t xml:space="preserve"> tryb zabezpieczeń </w:t>
-      </w:r>
-      <w:proofErr w:type="spellStart"/>
-      <w:r>
-        <w:t>antysciągowych</w:t>
-      </w:r>
-      <w:proofErr w:type="spellEnd"/>
-      <w:r>
-        <w:t xml:space="preserve"> (np. blokadę wyjścia z karty przeglądarki).</w:t>
+      <w:r>
+        <w:rPr>
+          <w:b/>
+          <w:bCs/>
+        </w:rPr>
+        <w:t xml:space="preserve">Działanie z </w:t>
+      </w:r>
+      <w:proofErr w:type="spellStart"/>
+      <w:r>
+        <w:rPr>
+          <w:b/>
+          <w:bCs/>
+        </w:rPr>
+        <w:t>frontendem</w:t>
+      </w:r>
+      <w:proofErr w:type="spellEnd"/>
+      <w:r>
+        <w:rPr>
+          <w:b/>
+          <w:bCs/>
+        </w:rPr>
+        <w:t>:</w:t>
+      </w:r>
+      <w:r>
+        <w:t xml:space="preserve"> </w:t>
+      </w:r>
+      <w:proofErr w:type="spellStart"/>
+      <w:r>
+        <w:t>Frontend</w:t>
+      </w:r>
+      <w:proofErr w:type="spellEnd"/>
+      <w:r>
+        <w:t xml:space="preserve"> wysyła poświadczenia logowania. Jeśli są poprawne, </w:t>
+      </w:r>
+      <w:proofErr w:type="spellStart"/>
+      <w:r>
+        <w:t>Django</w:t>
+      </w:r>
+      <w:proofErr w:type="spellEnd"/>
+      <w:r>
+        <w:t xml:space="preserve"> nie zwraca ciasteczek sesyjnych, lecz generuje unikalny </w:t>
+      </w:r>
+      <w:proofErr w:type="spellStart"/>
+      <w:r>
+        <w:rPr>
+          <w:b/>
+          <w:bCs/>
+        </w:rPr>
+        <w:t>Token</w:t>
+      </w:r>
+      <w:proofErr w:type="spellEnd"/>
+      <w:r>
+        <w:t xml:space="preserve"> (widoczny w naszej bazie jako </w:t>
+      </w:r>
+      <w:proofErr w:type="spellStart"/>
+      <w:r>
+        <w:t>TokenProxy</w:t>
+      </w:r>
+      <w:proofErr w:type="spellEnd"/>
+      <w:r>
+        <w:t xml:space="preserve">). </w:t>
+      </w:r>
+      <w:proofErr w:type="spellStart"/>
+      <w:r>
+        <w:t>Frontend</w:t>
+      </w:r>
+      <w:proofErr w:type="spellEnd"/>
+      <w:r>
+        <w:t xml:space="preserve"> musi przechwycić ten </w:t>
+      </w:r>
+      <w:proofErr w:type="spellStart"/>
+      <w:r>
+        <w:t>token</w:t>
+      </w:r>
+      <w:proofErr w:type="spellEnd"/>
+      <w:r>
+        <w:t xml:space="preserve"> i zapisać go u siebie (najlepiej w </w:t>
+      </w:r>
+      <w:proofErr w:type="spellStart"/>
+      <w:r>
+        <w:t>localStorage</w:t>
+      </w:r>
+      <w:proofErr w:type="spellEnd"/>
+      <w:r>
+        <w:t xml:space="preserve"> lub </w:t>
+      </w:r>
+      <w:proofErr w:type="spellStart"/>
+      <w:r>
+        <w:t>sessionStorage</w:t>
+      </w:r>
+      <w:proofErr w:type="spellEnd"/>
+      <w:r>
+        <w:t xml:space="preserve">). Od tego momentu przy </w:t>
+      </w:r>
+      <w:r>
+        <w:rPr>
+          <w:b/>
+          <w:bCs/>
+        </w:rPr>
+        <w:t>każdym</w:t>
+      </w:r>
+      <w:r>
+        <w:t xml:space="preserve"> kolejnym zapytaniu (np. o listę zadań), </w:t>
+      </w:r>
+      <w:proofErr w:type="spellStart"/>
+      <w:r>
+        <w:t>React</w:t>
+      </w:r>
+      <w:proofErr w:type="spellEnd"/>
+      <w:r>
+        <w:t xml:space="preserve"> musi doklejać ten </w:t>
+      </w:r>
+      <w:proofErr w:type="spellStart"/>
+      <w:r>
+        <w:t>token</w:t>
+      </w:r>
+      <w:proofErr w:type="spellEnd"/>
+      <w:r>
+        <w:t xml:space="preserve"> do nagłówków HTTP: </w:t>
+      </w:r>
+      <w:proofErr w:type="spellStart"/>
+      <w:r>
+        <w:t>Authorization</w:t>
+      </w:r>
+      <w:proofErr w:type="spellEnd"/>
+      <w:r>
+        <w:t xml:space="preserve">: </w:t>
+      </w:r>
+      <w:proofErr w:type="spellStart"/>
+      <w:r>
+        <w:t>Token</w:t>
+      </w:r>
+      <w:proofErr w:type="spellEnd"/>
+      <w:r>
+        <w:t xml:space="preserve"> &lt;</w:t>
+      </w:r>
+      <w:proofErr w:type="spellStart"/>
+      <w:r>
+        <w:t>twój_ciag_znakow</w:t>
+      </w:r>
+      <w:proofErr w:type="spellEnd"/>
+      <w:r>
+        <w:t>&gt;.</w:t>
       </w:r>
     </w:p>
     <w:p>
       <w:pPr>
         <w:numPr>
           <w:ilvl w:val="0"/>
-          <w:numId w:val="4"/>
+          <w:numId w:val="8"/>
         </w:numPr>
       </w:pPr>
-      <w:proofErr w:type="spellStart"/>
-      <w:r>
-        <w:rPr>
-          <w:b/>
-          <w:bCs/>
-        </w:rPr>
-        <w:t>ContestParticipation</w:t>
-      </w:r>
-      <w:proofErr w:type="spellEnd"/>
-      <w:r>
-        <w:rPr>
-          <w:b/>
-          <w:bCs/>
-        </w:rPr>
-        <w:t>:</w:t>
-      </w:r>
-      <w:r>
-        <w:t xml:space="preserve"> Tabela pośrednia łącząca Konkurs z Grupami startującymi. Rejestruje łączny wynik (</w:t>
-      </w:r>
-      <w:proofErr w:type="spellStart"/>
-      <w:r>
-        <w:t>total_score</w:t>
-      </w:r>
-      <w:proofErr w:type="spellEnd"/>
-      <w:r>
-        <w:t>) oraz status ewentualnej dyskwalifikacji (</w:t>
-      </w:r>
-      <w:proofErr w:type="spellStart"/>
-      <w:r>
-        <w:t>is_disqualified</w:t>
-      </w:r>
-      <w:proofErr w:type="spellEnd"/>
-      <w:r>
-        <w:t>).</w:t>
-      </w:r>
-    </w:p>
+      <w:r>
+        <w:rPr>
+          <w:b/>
+          <w:bCs/>
+        </w:rPr>
+        <w:lastRenderedPageBreak/>
+        <w:t xml:space="preserve">Oczekiwany </w:t>
+      </w:r>
+      <w:proofErr w:type="spellStart"/>
+      <w:r>
+        <w:rPr>
+          <w:b/>
+          <w:bCs/>
+        </w:rPr>
+        <w:t>Payload</w:t>
+      </w:r>
+      <w:proofErr w:type="spellEnd"/>
+      <w:r>
+        <w:rPr>
+          <w:b/>
+          <w:bCs/>
+        </w:rPr>
+        <w:t xml:space="preserve"> (JSON):</w:t>
+      </w:r>
+    </w:p>
+    <w:p>
+      <w:r>
+        <w:t>JSON</w:t>
+      </w:r>
+    </w:p>
+    <w:p>
+      <w:pPr>
+        <w:shd w:val="clear" w:color="auto" w:fill="2B2B2B"/>
+      </w:pPr>
+      <w:r>
+        <w:rPr>
+          <w:rFonts w:ascii="Courier New" w:hAnsi="Courier New" w:cs="Courier New"/>
+          <w:color w:val="F8F8F2"/>
+        </w:rPr>
+        <w:t>{</w:t>
+      </w:r>
+      <w:r>
+        <w:rPr>
+          <w:rFonts w:ascii="Courier New" w:hAnsi="Courier New" w:cs="Courier New"/>
+          <w:color w:val="F8F8F2"/>
+        </w:rPr>
+        <w:br/>
+        <w:t xml:space="preserve">  "</w:t>
+      </w:r>
+      <w:proofErr w:type="spellStart"/>
+      <w:r>
+        <w:rPr>
+          <w:rFonts w:ascii="Courier New" w:hAnsi="Courier New" w:cs="Courier New"/>
+          <w:color w:val="F8F8F2"/>
+        </w:rPr>
+        <w:t>username</w:t>
+      </w:r>
+      <w:proofErr w:type="spellEnd"/>
+      <w:r>
+        <w:rPr>
+          <w:rFonts w:ascii="Courier New" w:hAnsi="Courier New" w:cs="Courier New"/>
+          <w:color w:val="F8F8F2"/>
+        </w:rPr>
+        <w:t xml:space="preserve">": </w:t>
+      </w:r>
+      <w:r>
+        <w:rPr>
+          <w:rFonts w:ascii="Courier New" w:hAnsi="Courier New" w:cs="Courier New"/>
+          <w:color w:val="ABE338"/>
+        </w:rPr>
+        <w:t>"igor22"</w:t>
+      </w:r>
+      <w:r>
+        <w:rPr>
+          <w:rFonts w:ascii="Courier New" w:hAnsi="Courier New" w:cs="Courier New"/>
+          <w:color w:val="F8F8F2"/>
+        </w:rPr>
+        <w:t>,</w:t>
+      </w:r>
+      <w:r>
+        <w:rPr>
+          <w:rFonts w:ascii="Courier New" w:hAnsi="Courier New" w:cs="Courier New"/>
+          <w:color w:val="F8F8F2"/>
+        </w:rPr>
+        <w:br/>
+        <w:t xml:space="preserve">  "</w:t>
+      </w:r>
+      <w:proofErr w:type="spellStart"/>
+      <w:r>
+        <w:rPr>
+          <w:rFonts w:ascii="Courier New" w:hAnsi="Courier New" w:cs="Courier New"/>
+          <w:color w:val="F8F8F2"/>
+        </w:rPr>
+        <w:t>password</w:t>
+      </w:r>
+      <w:proofErr w:type="spellEnd"/>
+      <w:r>
+        <w:rPr>
+          <w:rFonts w:ascii="Courier New" w:hAnsi="Courier New" w:cs="Courier New"/>
+          <w:color w:val="F8F8F2"/>
+        </w:rPr>
+        <w:t xml:space="preserve">": </w:t>
+      </w:r>
+      <w:r>
+        <w:rPr>
+          <w:rFonts w:ascii="Courier New" w:hAnsi="Courier New" w:cs="Courier New"/>
+          <w:color w:val="ABE338"/>
+        </w:rPr>
+        <w:t>"SuperTajneHaslo123#"</w:t>
+      </w:r>
+      <w:r>
+        <w:rPr>
+          <w:rFonts w:ascii="Courier New" w:hAnsi="Courier New" w:cs="Courier New"/>
+          <w:color w:val="F8F8F2"/>
+        </w:rPr>
+        <w:br/>
+        <w:t>}</w:t>
+      </w:r>
+    </w:p>
+    <w:p/>
     <w:p>
       <w:pPr>
         <w:numPr>
           <w:ilvl w:val="0"/>
-          <w:numId w:val="4"/>
+          <w:numId w:val="8"/>
         </w:numPr>
       </w:pPr>
-      <w:proofErr w:type="spellStart"/>
-      <w:r>
-        <w:rPr>
-          <w:b/>
-          <w:bCs/>
-        </w:rPr>
-        <w:t>ContestHost</w:t>
-      </w:r>
-      <w:proofErr w:type="spellEnd"/>
-      <w:r>
-        <w:rPr>
-          <w:b/>
-          <w:bCs/>
-        </w:rPr>
+      <w:r>
+        <w:rPr>
+          <w:b/>
+          <w:bCs/>
+        </w:rPr>
+        <w:t>Poprawna Odpowiedź:</w:t>
+      </w:r>
+      <w:r>
+        <w:t xml:space="preserve"> Status 200 OK</w:t>
+      </w:r>
+    </w:p>
+    <w:p>
+      <w:r>
+        <w:t>JSON</w:t>
+      </w:r>
+    </w:p>
+    <w:p>
+      <w:pPr>
+        <w:shd w:val="clear" w:color="auto" w:fill="2B2B2B"/>
+      </w:pPr>
+      <w:r>
+        <w:rPr>
+          <w:rFonts w:ascii="Courier New" w:hAnsi="Courier New" w:cs="Courier New"/>
+          <w:color w:val="F8F8F2"/>
+        </w:rPr>
+        <w:t>{</w:t>
+      </w:r>
+      <w:r>
+        <w:rPr>
+          <w:rFonts w:ascii="Courier New" w:hAnsi="Courier New" w:cs="Courier New"/>
+          <w:color w:val="F8F8F2"/>
+        </w:rPr>
+        <w:br/>
+        <w:t xml:space="preserve">  "token": </w:t>
+      </w:r>
+      <w:r>
+        <w:rPr>
+          <w:rFonts w:ascii="Courier New" w:hAnsi="Courier New" w:cs="Courier New"/>
+          <w:color w:val="ABE338"/>
+        </w:rPr>
+        <w:t>"9944b09199c62bcf9418ad846dd0e4bbdfc6ee4b"</w:t>
+      </w:r>
+      <w:r>
+        <w:rPr>
+          <w:rFonts w:ascii="Courier New" w:hAnsi="Courier New" w:cs="Courier New"/>
+          <w:color w:val="F8F8F2"/>
+        </w:rPr>
+        <w:br/>
+        <w:t>}</w:t>
+      </w:r>
+    </w:p>
+    <w:p/>
+    <w:p>
+      <w:pPr>
+        <w:pStyle w:val="Nagwek2"/>
+      </w:pPr>
+      <w:r>
+        <w:t xml:space="preserve">2. Następne Wymagane </w:t>
+      </w:r>
+      <w:proofErr w:type="spellStart"/>
+      <w:r>
+        <w:t>Endpointy</w:t>
+      </w:r>
+      <w:proofErr w:type="spellEnd"/>
+    </w:p>
+    <w:p>
+      <w:r>
+        <w:t xml:space="preserve">Mając gotową bazę danych i system logowania, musimy teraz stworzyć "okna" na resztę naszego systemu. Zgodnie z naszą architekturą (models.py) i historyjkami użytkownika, w najbliższym czasie będziemy musieli napisać w views.py następujące </w:t>
+      </w:r>
+      <w:proofErr w:type="spellStart"/>
+      <w:r>
+        <w:t>endpointy</w:t>
+      </w:r>
+      <w:proofErr w:type="spellEnd"/>
+      <w:r>
         <w:t>:</w:t>
       </w:r>
-      <w:r>
-        <w:t xml:space="preserve"> Tabela delegująca uprawnienia. Pozwala Głównemu Twórcy konkursu przypisać innych użytkowników jako sędziów/pomocników z precyzyjnie określonymi prawami (np. możliwość modyfikacji zadań, wyrzucania grup).</w:t>
-      </w:r>
-    </w:p>
-    <w:p>
-      <w:pPr>
-        <w:rPr>
-          <w:b/>
-          <w:bCs/>
-        </w:rPr>
-      </w:pPr>
-      <w:r>
-        <w:rPr>
-          <w:b/>
-          <w:bCs/>
-        </w:rPr>
-        <w:t>Moduł Zgłoszeń</w:t>
+    </w:p>
+    <w:p>
+      <w:pPr>
+        <w:rPr>
+          <w:b/>
+          <w:bCs/>
+        </w:rPr>
+      </w:pPr>
+      <w:r>
+        <w:rPr>
+          <w:b/>
+          <w:bCs/>
+        </w:rPr>
+        <w:t>Moduł Zadań (Priorytet)</w:t>
+      </w:r>
+    </w:p>
+    <w:p>
+      <w:proofErr w:type="spellStart"/>
+      <w:r>
+        <w:t>Frontend</w:t>
+      </w:r>
+      <w:proofErr w:type="spellEnd"/>
+      <w:r>
+        <w:t xml:space="preserve"> nie ma obecnie czego wyświetlać po zalogowaniu. Musimy wystawić zadania.</w:t>
       </w:r>
     </w:p>
     <w:p>
       <w:pPr>
         <w:numPr>
           <w:ilvl w:val="0"/>
-          <w:numId w:val="5"/>
+          <w:numId w:val="9"/>
         </w:numPr>
       </w:pPr>
-      <w:proofErr w:type="spellStart"/>
-      <w:r>
-        <w:rPr>
-          <w:b/>
-          <w:bCs/>
-        </w:rPr>
-        <w:t>TaskReport</w:t>
-      </w:r>
-      <w:proofErr w:type="spellEnd"/>
-      <w:r>
-        <w:rPr>
-          <w:b/>
-          <w:bCs/>
-        </w:rPr>
-        <w:t xml:space="preserve"> (Zgłoszenie/</w:t>
-      </w:r>
-      <w:proofErr w:type="spellStart"/>
-      <w:r>
-        <w:rPr>
-          <w:b/>
-          <w:bCs/>
-        </w:rPr>
-        <w:t>Ticket</w:t>
-      </w:r>
-      <w:proofErr w:type="spellEnd"/>
-      <w:r>
-        <w:rPr>
-          <w:b/>
-          <w:bCs/>
-        </w:rPr>
-        <w:t>):</w:t>
-      </w:r>
-      <w:r>
-        <w:t xml:space="preserve"> Pozwala użytkownikom zgłaszać problemy z zadaniami (np. błędny test ukryty). Łączy konkretne zadanie z osobą zgłaszającą i udostępnia status rozwiązania problemu (</w:t>
-      </w:r>
-      <w:proofErr w:type="spellStart"/>
-      <w:r>
-        <w:t>is_resolved</w:t>
-      </w:r>
-      <w:proofErr w:type="spellEnd"/>
-      <w:r>
-        <w:t>).</w:t>
-      </w:r>
-    </w:p>
-    <w:p>
-      <w:r>
-        <w:pict w14:anchorId="5F918391">
-          <v:rect id="_x0000_i1026" style="width:0;height:1.5pt" o:hralign="center" o:hrstd="t" o:hr="t" fillcolor="#a0a0a0" stroked="f"/>
-        </w:pict>
-      </w:r>
-    </w:p>
-    <w:p>
-      <w:pPr>
-        <w:pStyle w:val="Nagwek2"/>
-      </w:pPr>
-      <w:r>
-        <w:t>3. Pokrycie Wymagań Biznesowych (Historie Użytkowników - HU)</w:t>
-      </w:r>
-    </w:p>
-    <w:p>
-      <w:r>
-        <w:t>Architektura została ściśle dopasowana do wymagań projektowych. Tabela poniżej przedstawia, jak poszczególne modele realizują założenia HU:</w:t>
+      <w:r>
+        <w:rPr>
+          <w:b/>
+          <w:bCs/>
+        </w:rPr>
+        <w:t>GET /</w:t>
+      </w:r>
+      <w:proofErr w:type="spellStart"/>
+      <w:r>
+        <w:rPr>
+          <w:b/>
+          <w:bCs/>
+        </w:rPr>
+        <w:t>api</w:t>
+      </w:r>
+      <w:proofErr w:type="spellEnd"/>
+      <w:r>
+        <w:rPr>
+          <w:b/>
+          <w:bCs/>
+        </w:rPr>
+        <w:t>/</w:t>
+      </w:r>
+      <w:proofErr w:type="spellStart"/>
+      <w:r>
+        <w:rPr>
+          <w:b/>
+          <w:bCs/>
+        </w:rPr>
+        <w:t>tasks</w:t>
+      </w:r>
+      <w:proofErr w:type="spellEnd"/>
+      <w:r>
+        <w:rPr>
+          <w:b/>
+          <w:bCs/>
+        </w:rPr>
+        <w:t>/</w:t>
+      </w:r>
+      <w:r>
+        <w:t xml:space="preserve"> – Pobiera listę dostępnych zadań (tylko te z </w:t>
+      </w:r>
+      <w:proofErr w:type="spellStart"/>
+      <w:r>
+        <w:t>is_public</w:t>
+      </w:r>
+      <w:proofErr w:type="spellEnd"/>
+      <w:r>
+        <w:t>=True oraz zadania z grup, do których należy użytkownik).</w:t>
       </w:r>
     </w:p>
     <w:p>
       <w:pPr>
         <w:numPr>
           <w:ilvl w:val="0"/>
-          <w:numId w:val="6"/>
+          <w:numId w:val="9"/>
         </w:numPr>
       </w:pPr>
       <w:r>
@@ -957,34 +2482,42 @@
           <w:b/>
           <w:bCs/>
         </w:rPr>
-        <w:t>Zarządzanie Zadaniami (HU 1.3, 1.4, 1.12):</w:t>
-      </w:r>
-      <w:r>
-        <w:t xml:space="preserve"> Tabela </w:t>
-      </w:r>
-      <w:proofErr w:type="spellStart"/>
-      <w:r>
-        <w:t>Task</w:t>
-      </w:r>
-      <w:proofErr w:type="spellEnd"/>
-      <w:r>
-        <w:t xml:space="preserve"> pozwala na tworzenie zadań prywatnych i publicznych. Obsługę treści zapewnia elastyczne pole </w:t>
-      </w:r>
-      <w:proofErr w:type="spellStart"/>
-      <w:r>
-        <w:t>description</w:t>
-      </w:r>
-      <w:proofErr w:type="spellEnd"/>
-      <w:r>
-        <w:t xml:space="preserve"> (gotowe na </w:t>
-      </w:r>
-      <w:proofErr w:type="spellStart"/>
-      <w:r>
-        <w:t>parsowanie</w:t>
-      </w:r>
-      <w:proofErr w:type="spellEnd"/>
-      <w:r>
-        <w:t xml:space="preserve"> </w:t>
+        <w:t>GET /</w:t>
+      </w:r>
+      <w:proofErr w:type="spellStart"/>
+      <w:r>
+        <w:rPr>
+          <w:b/>
+          <w:bCs/>
+        </w:rPr>
+        <w:t>api</w:t>
+      </w:r>
+      <w:proofErr w:type="spellEnd"/>
+      <w:r>
+        <w:rPr>
+          <w:b/>
+          <w:bCs/>
+        </w:rPr>
+        <w:t>/</w:t>
+      </w:r>
+      <w:proofErr w:type="spellStart"/>
+      <w:r>
+        <w:rPr>
+          <w:b/>
+          <w:bCs/>
+        </w:rPr>
+        <w:t>tasks</w:t>
+      </w:r>
+      <w:proofErr w:type="spellEnd"/>
+      <w:r>
+        <w:rPr>
+          <w:b/>
+          <w:bCs/>
+        </w:rPr>
+        <w:t>/&lt;id&gt;/</w:t>
+      </w:r>
+      <w:r>
+        <w:t xml:space="preserve"> – Zwraca pełne szczegóły pojedynczego zadania (treść </w:t>
       </w:r>
       <w:proofErr w:type="spellStart"/>
       <w:r>
@@ -992,30 +2525,14 @@
       </w:r>
       <w:proofErr w:type="spellEnd"/>
       <w:r>
-        <w:t xml:space="preserve">). Ograniczenia sprzętowe dla sprawdzarki kodu gwarantują pola </w:t>
-      </w:r>
-      <w:proofErr w:type="spellStart"/>
-      <w:r>
-        <w:t>time_limit</w:t>
-      </w:r>
-      <w:proofErr w:type="spellEnd"/>
-      <w:r>
-        <w:t xml:space="preserve"> oraz </w:t>
-      </w:r>
-      <w:proofErr w:type="spellStart"/>
-      <w:r>
-        <w:t>memory_limit</w:t>
-      </w:r>
-      <w:proofErr w:type="spellEnd"/>
-      <w:r>
-        <w:t>.</w:t>
+        <w:t>, limity czasowe).</w:t>
       </w:r>
     </w:p>
     <w:p>
       <w:pPr>
         <w:numPr>
           <w:ilvl w:val="0"/>
-          <w:numId w:val="6"/>
+          <w:numId w:val="9"/>
         </w:numPr>
       </w:pPr>
       <w:r>
@@ -1023,33 +2540,69 @@
           <w:b/>
           <w:bCs/>
         </w:rPr>
-        <w:t>System Ewaluacji Testowej (HU 1.7, 1.8):</w:t>
-      </w:r>
-      <w:r>
-        <w:t xml:space="preserve"> Rozdzielenie testów jawnych od ukrytych zostało osiągnięte poprzez dedykowany model </w:t>
-      </w:r>
-      <w:proofErr w:type="spellStart"/>
-      <w:r>
-        <w:t>TestCase</w:t>
-      </w:r>
-      <w:proofErr w:type="spellEnd"/>
-      <w:r>
-        <w:t xml:space="preserve"> z flagą </w:t>
-      </w:r>
-      <w:proofErr w:type="spellStart"/>
-      <w:r>
-        <w:t>is_sample</w:t>
-      </w:r>
-      <w:proofErr w:type="spellEnd"/>
-      <w:r>
-        <w:t xml:space="preserve"> i opcją punktacji za każdy pojedynczy test.</w:t>
+        <w:t>POST /</w:t>
+      </w:r>
+      <w:proofErr w:type="spellStart"/>
+      <w:r>
+        <w:rPr>
+          <w:b/>
+          <w:bCs/>
+        </w:rPr>
+        <w:t>api</w:t>
+      </w:r>
+      <w:proofErr w:type="spellEnd"/>
+      <w:r>
+        <w:rPr>
+          <w:b/>
+          <w:bCs/>
+        </w:rPr>
+        <w:t>/</w:t>
+      </w:r>
+      <w:proofErr w:type="spellStart"/>
+      <w:r>
+        <w:rPr>
+          <w:b/>
+          <w:bCs/>
+        </w:rPr>
+        <w:t>tasks</w:t>
+      </w:r>
+      <w:proofErr w:type="spellEnd"/>
+      <w:r>
+        <w:rPr>
+          <w:b/>
+          <w:bCs/>
+        </w:rPr>
+        <w:t>/</w:t>
+      </w:r>
+      <w:r>
+        <w:t xml:space="preserve"> – Pozwala użytkownikom z uprawnieniami (lub pracownikom) dodać nowe zadanie do bazy.</w:t>
+      </w:r>
+    </w:p>
+    <w:p>
+      <w:pPr>
+        <w:rPr>
+          <w:b/>
+          <w:bCs/>
+        </w:rPr>
+      </w:pPr>
+      <w:r>
+        <w:rPr>
+          <w:b/>
+          <w:bCs/>
+        </w:rPr>
+        <w:t>Moduł Rozwiązań (Silnik Platformy)</w:t>
+      </w:r>
+    </w:p>
+    <w:p>
+      <w:r>
+        <w:t>Użytkownik musi mieć gdzie wysłać swój kod do sprawdzenia.</w:t>
       </w:r>
     </w:p>
     <w:p>
       <w:pPr>
         <w:numPr>
           <w:ilvl w:val="0"/>
-          <w:numId w:val="6"/>
+          <w:numId w:val="10"/>
         </w:numPr>
       </w:pPr>
       <w:r>
@@ -1057,42 +2610,65 @@
           <w:b/>
           <w:bCs/>
         </w:rPr>
-        <w:lastRenderedPageBreak/>
-        <w:t>Zarządzanie Społecznością (HU 2.1, 2.2):</w:t>
-      </w:r>
-      <w:r>
-        <w:t xml:space="preserve"> Tabela </w:t>
-      </w:r>
-      <w:proofErr w:type="spellStart"/>
-      <w:r>
-        <w:t>CodeGroup</w:t>
-      </w:r>
-      <w:proofErr w:type="spellEnd"/>
-      <w:r>
-        <w:t xml:space="preserve"> oraz przypisana do niej relacja </w:t>
-      </w:r>
-      <w:proofErr w:type="spellStart"/>
-      <w:r>
-        <w:t>GroupMembership</w:t>
-      </w:r>
-      <w:proofErr w:type="spellEnd"/>
-      <w:r>
-        <w:t xml:space="preserve"> obsługuje zarówno zróżnicowanie dostępu (grupy otwarte/zamknięte), jak i hierarchię wewnątrz społeczności (role członka i </w:t>
-      </w:r>
-      <w:proofErr w:type="gramStart"/>
-      <w:r>
-        <w:t>admina</w:t>
-      </w:r>
-      <w:proofErr w:type="gramEnd"/>
-      <w:r>
-        <w:t>).</w:t>
+        <w:t>POST /</w:t>
+      </w:r>
+      <w:proofErr w:type="spellStart"/>
+      <w:r>
+        <w:rPr>
+          <w:b/>
+          <w:bCs/>
+        </w:rPr>
+        <w:t>api</w:t>
+      </w:r>
+      <w:proofErr w:type="spellEnd"/>
+      <w:r>
+        <w:rPr>
+          <w:b/>
+          <w:bCs/>
+        </w:rPr>
+        <w:t>/</w:t>
+      </w:r>
+      <w:proofErr w:type="spellStart"/>
+      <w:r>
+        <w:rPr>
+          <w:b/>
+          <w:bCs/>
+        </w:rPr>
+        <w:t>solutions</w:t>
+      </w:r>
+      <w:proofErr w:type="spellEnd"/>
+      <w:r>
+        <w:rPr>
+          <w:b/>
+          <w:bCs/>
+        </w:rPr>
+        <w:t>/</w:t>
+      </w:r>
+      <w:r>
+        <w:t xml:space="preserve"> – </w:t>
+      </w:r>
+      <w:proofErr w:type="spellStart"/>
+      <w:r>
+        <w:t>Endpoint</w:t>
+      </w:r>
+      <w:proofErr w:type="spellEnd"/>
+      <w:r>
+        <w:t xml:space="preserve"> przyjmujący kod napisany w edytorze na froncie. Zapisuje go do bazy ze statusem </w:t>
+      </w:r>
+      <w:proofErr w:type="spellStart"/>
+      <w:r>
+        <w:t>pending</w:t>
+      </w:r>
+      <w:proofErr w:type="spellEnd"/>
+      <w:r>
+        <w:t xml:space="preserve"> (Oczekujące) i przygotowuje do weryfikacji.</w:t>
       </w:r>
     </w:p>
     <w:p>
       <w:pPr>
         <w:numPr>
           <w:ilvl w:val="0"/>
-          <w:numId w:val="6"/>
+          <w:numId w:val="10"/>
         </w:numPr>
       </w:pPr>
       <w:r>
@@ -1100,41 +2676,70 @@
           <w:b/>
           <w:bCs/>
         </w:rPr>
-        <w:t>Zabezpieczenia i Turnieje (HU 2.3):</w:t>
-      </w:r>
-      <w:r>
-        <w:t xml:space="preserve"> System Konkursów (</w:t>
-      </w:r>
-      <w:proofErr w:type="spellStart"/>
-      <w:r>
-        <w:t>Contest</w:t>
-      </w:r>
-      <w:proofErr w:type="spellEnd"/>
-      <w:r>
-        <w:t xml:space="preserve">) poprzez flagę </w:t>
-      </w:r>
-      <w:proofErr w:type="spellStart"/>
-      <w:r>
-        <w:t>strict_mode</w:t>
-      </w:r>
-      <w:proofErr w:type="spellEnd"/>
-      <w:r>
-        <w:t xml:space="preserve"> natywnie wspiera implementację mechanizmów </w:t>
-      </w:r>
-      <w:proofErr w:type="spellStart"/>
-      <w:r>
-        <w:t>antysciągowych</w:t>
-      </w:r>
-      <w:proofErr w:type="spellEnd"/>
-      <w:r>
-        <w:t>, a zaawansowane tabele pośrednie umożliwiają organizację turniejów międzyszkolnych (wiele grup w jednym konkursie).</w:t>
+        <w:t>GET /</w:t>
+      </w:r>
+      <w:proofErr w:type="spellStart"/>
+      <w:r>
+        <w:rPr>
+          <w:b/>
+          <w:bCs/>
+        </w:rPr>
+        <w:t>api</w:t>
+      </w:r>
+      <w:proofErr w:type="spellEnd"/>
+      <w:r>
+        <w:rPr>
+          <w:b/>
+          <w:bCs/>
+        </w:rPr>
+        <w:t>/</w:t>
+      </w:r>
+      <w:proofErr w:type="spellStart"/>
+      <w:r>
+        <w:rPr>
+          <w:b/>
+          <w:bCs/>
+        </w:rPr>
+        <w:t>solutions</w:t>
+      </w:r>
+      <w:proofErr w:type="spellEnd"/>
+      <w:r>
+        <w:rPr>
+          <w:b/>
+          <w:bCs/>
+        </w:rPr>
+        <w:t>/</w:t>
+      </w:r>
+      <w:r>
+        <w:t xml:space="preserve"> – Zwraca historię rozwiązań zalogowanego użytkownika (aby mógł zobaczyć, które zadania już zaliczył).</w:t>
+      </w:r>
+    </w:p>
+    <w:p>
+      <w:pPr>
+        <w:rPr>
+          <w:b/>
+          <w:bCs/>
+        </w:rPr>
+      </w:pPr>
+      <w:r>
+        <w:rPr>
+          <w:b/>
+          <w:bCs/>
+        </w:rPr>
+        <w:lastRenderedPageBreak/>
+        <w:t>Moduł Społeczności i Grup</w:t>
+      </w:r>
+    </w:p>
+    <w:p>
+      <w:r>
+        <w:t>Aby działały funkcje socjalne i ograniczenia dostępności.</w:t>
       </w:r>
     </w:p>
     <w:p>
       <w:pPr>
         <w:numPr>
           <w:ilvl w:val="0"/>
-          <w:numId w:val="6"/>
+          <w:numId w:val="11"/>
         </w:numPr>
       </w:pPr>
       <w:r>
@@ -1142,105 +2747,128 @@
           <w:b/>
           <w:bCs/>
         </w:rPr>
-        <w:t>Utrzymanie Jakości (HU 1.10, 3.3):</w:t>
-      </w:r>
-      <w:r>
-        <w:t xml:space="preserve"> Dedykowany model </w:t>
-      </w:r>
-      <w:proofErr w:type="spellStart"/>
-      <w:r>
-        <w:t>TaskReport</w:t>
-      </w:r>
-      <w:proofErr w:type="spellEnd"/>
-      <w:r>
-        <w:t xml:space="preserve"> implementuje pełnoprawny, śledzony system zgłaszania błędów przez studentów do wykładowców.</w:t>
-      </w:r>
-    </w:p>
-    <w:p>
-      <w:r>
-        <w:pict w14:anchorId="6C7130AF">
-          <v:rect id="_x0000_i1027" style="width:0;height:1.5pt" o:hralign="center" o:hrstd="t" o:hr="t" fillcolor="#a0a0a0" stroked="f"/>
-        </w:pict>
-      </w:r>
-    </w:p>
-    <w:p>
-      <w:pPr>
-        <w:pStyle w:val="Nagwek2"/>
-      </w:pPr>
-      <w:r>
-        <w:t>4. Wizualizacja i Aktualizacja Schematu</w:t>
-      </w:r>
-    </w:p>
-    <w:p>
-      <w:r>
-        <w:t>Zgodnie z zasadą DRY (</w:t>
-      </w:r>
-      <w:proofErr w:type="spellStart"/>
-      <w:r>
-        <w:t>Don't</w:t>
-      </w:r>
-      <w:proofErr w:type="spellEnd"/>
-      <w:r>
-        <w:t xml:space="preserve"> </w:t>
-      </w:r>
-      <w:proofErr w:type="spellStart"/>
-      <w:r>
-        <w:t>Repeat</w:t>
-      </w:r>
-      <w:proofErr w:type="spellEnd"/>
-      <w:r>
-        <w:t xml:space="preserve"> </w:t>
-      </w:r>
-      <w:proofErr w:type="spellStart"/>
-      <w:r>
-        <w:t>Yourself</w:t>
-      </w:r>
-      <w:proofErr w:type="spellEnd"/>
-      <w:r>
-        <w:t>), nie utrzymujemy ręcznie rysowanych schematów bazy danych, ponieważ szybko stają się nieaktualne.</w:t>
-      </w:r>
-    </w:p>
-    <w:p>
-      <w:r>
-        <w:t xml:space="preserve">Wizualizacja bazy generowana jest </w:t>
-      </w:r>
-      <w:r>
-        <w:rPr>
-          <w:b/>
-          <w:bCs/>
-        </w:rPr>
-        <w:t>automatycznie</w:t>
-      </w:r>
-      <w:r>
-        <w:t xml:space="preserve"> bezpośrednio z kodu źródłowego (models.py). Wykorzystujemy do tego połączenie programu systemowego </w:t>
-      </w:r>
-      <w:proofErr w:type="spellStart"/>
-      <w:r>
-        <w:rPr>
-          <w:b/>
-          <w:bCs/>
-        </w:rPr>
-        <w:t>Graphviz</w:t>
-      </w:r>
-      <w:proofErr w:type="spellEnd"/>
-      <w:r>
-        <w:t xml:space="preserve"> oraz biblioteki </w:t>
-      </w:r>
-      <w:proofErr w:type="spellStart"/>
-      <w:r>
-        <w:t>pythonowej</w:t>
-      </w:r>
-      <w:proofErr w:type="spellEnd"/>
-      <w:r>
-        <w:t xml:space="preserve"> </w:t>
-      </w:r>
-      <w:proofErr w:type="spellStart"/>
-      <w:r>
-        <w:rPr>
-          <w:b/>
-          <w:bCs/>
-        </w:rPr>
-        <w:t>django-extensions</w:t>
+        <w:t>GET /</w:t>
+      </w:r>
+      <w:proofErr w:type="spellStart"/>
+      <w:r>
+        <w:rPr>
+          <w:b/>
+          <w:bCs/>
+        </w:rPr>
+        <w:t>api</w:t>
+      </w:r>
+      <w:proofErr w:type="spellEnd"/>
+      <w:r>
+        <w:rPr>
+          <w:b/>
+          <w:bCs/>
+        </w:rPr>
+        <w:t>/</w:t>
+      </w:r>
+      <w:proofErr w:type="spellStart"/>
+      <w:r>
+        <w:rPr>
+          <w:b/>
+          <w:bCs/>
+        </w:rPr>
+        <w:t>groups</w:t>
+      </w:r>
+      <w:proofErr w:type="spellEnd"/>
+      <w:r>
+        <w:rPr>
+          <w:b/>
+          <w:bCs/>
+        </w:rPr>
+        <w:t>/</w:t>
+      </w:r>
+      <w:r>
+        <w:t xml:space="preserve"> – Zwraca listę otwartych grup (</w:t>
+      </w:r>
+      <w:proofErr w:type="spellStart"/>
+      <w:r>
+        <w:t>is_open</w:t>
+      </w:r>
+      <w:proofErr w:type="spellEnd"/>
+      <w:r>
+        <w:t>=True), do których można dołączyć.</w:t>
+      </w:r>
+    </w:p>
+    <w:p>
+      <w:pPr>
+        <w:numPr>
+          <w:ilvl w:val="0"/>
+          <w:numId w:val="11"/>
+        </w:numPr>
+      </w:pPr>
+      <w:r>
+        <w:rPr>
+          <w:b/>
+          <w:bCs/>
+        </w:rPr>
+        <w:t>POST /</w:t>
+      </w:r>
+      <w:proofErr w:type="spellStart"/>
+      <w:r>
+        <w:rPr>
+          <w:b/>
+          <w:bCs/>
+        </w:rPr>
+        <w:t>api</w:t>
+      </w:r>
+      <w:proofErr w:type="spellEnd"/>
+      <w:r>
+        <w:rPr>
+          <w:b/>
+          <w:bCs/>
+        </w:rPr>
+        <w:t>/</w:t>
+      </w:r>
+      <w:proofErr w:type="spellStart"/>
+      <w:r>
+        <w:rPr>
+          <w:b/>
+          <w:bCs/>
+        </w:rPr>
+        <w:t>groups</w:t>
+      </w:r>
+      <w:proofErr w:type="spellEnd"/>
+      <w:r>
+        <w:rPr>
+          <w:b/>
+          <w:bCs/>
+        </w:rPr>
+        <w:t>/&lt;id&gt;/</w:t>
+      </w:r>
+      <w:proofErr w:type="spellStart"/>
+      <w:r>
+        <w:rPr>
+          <w:b/>
+          <w:bCs/>
+        </w:rPr>
+        <w:t>join</w:t>
+      </w:r>
+      <w:proofErr w:type="spellEnd"/>
+      <w:r>
+        <w:rPr>
+          <w:b/>
+          <w:bCs/>
+        </w:rPr>
+        <w:t>/</w:t>
+      </w:r>
+      <w:r>
+        <w:t xml:space="preserve"> – </w:t>
+      </w:r>
+      <w:proofErr w:type="spellStart"/>
+      <w:r>
+        <w:t>Endpoint</w:t>
+      </w:r>
+      <w:proofErr w:type="spellEnd"/>
+      <w:r>
+        <w:t xml:space="preserve"> podpinany pod przycisk "Dołącz" na froncie, dodający użytkownika do </w:t>
+      </w:r>
+      <w:proofErr w:type="spellStart"/>
+      <w:r>
+        <w:t>GroupMembership</w:t>
       </w:r>
       <w:proofErr w:type="spellEnd"/>
       <w:r>
@@ -1248,60 +2876,92 @@
       </w:r>
     </w:p>
     <w:p>
-      <w:r>
-        <w:rPr>
-          <w:b/>
-          <w:bCs/>
-        </w:rPr>
-        <w:t>Instrukcja wygenerowania aktualnego diagramu (ERD):</w:t>
-      </w:r>
-      <w:r>
-        <w:t xml:space="preserve"> Aby pobrać najświeższy schemat relacji między tabelami, w głównym katalogu projektu uruchom poniższą komendę w terminalu:</w:t>
-      </w:r>
-    </w:p>
-    <w:p>
-      <w:pPr>
-        <w:rPr>
-          <w:lang w:val="en-US"/>
-        </w:rPr>
-      </w:pPr>
-      <w:r>
-        <w:rPr>
-          <w:lang w:val="en-US"/>
-        </w:rPr>
-        <w:t>Bash</w:t>
-      </w:r>
-    </w:p>
-    <w:p>
-      <w:pPr>
-        <w:rPr>
-          <w:lang w:val="en-US"/>
-        </w:rPr>
-      </w:pPr>
-      <w:r>
-        <w:rPr>
-          <w:lang w:val="en-US"/>
-        </w:rPr>
-        <w:t xml:space="preserve">docker-compose exec web python manage.py </w:t>
-      </w:r>
-      <w:proofErr w:type="spellStart"/>
-      <w:r>
-        <w:rPr>
-          <w:lang w:val="en-US"/>
-        </w:rPr>
-        <w:t>graph_models</w:t>
-      </w:r>
-      <w:proofErr w:type="spellEnd"/>
-      <w:r>
-        <w:rPr>
-          <w:lang w:val="en-US"/>
-        </w:rPr>
-        <w:t xml:space="preserve"> -a -o diagram_bazy_danych.png</w:t>
-      </w:r>
-    </w:p>
-    <w:p>
-      <w:r>
-        <w:t>Wygenerowany plik diagram_bazy_danych.png pojawi się w folderze roboczym i będzie zawierał wszystkie bieżące tabele, relacje (Klucze Obce) oraz typy danych.</w:t>
+      <w:pPr>
+        <w:rPr>
+          <w:b/>
+          <w:bCs/>
+        </w:rPr>
+      </w:pPr>
+      <w:r>
+        <w:rPr>
+          <w:b/>
+          <w:bCs/>
+        </w:rPr>
+        <w:t>Moduł Konkursów (Opcjonalnie, w późniejszym etapie)</w:t>
+      </w:r>
+    </w:p>
+    <w:p>
+      <w:pPr>
+        <w:numPr>
+          <w:ilvl w:val="0"/>
+          <w:numId w:val="12"/>
+        </w:numPr>
+      </w:pPr>
+      <w:r>
+        <w:rPr>
+          <w:b/>
+          <w:bCs/>
+        </w:rPr>
+        <w:t>GET /</w:t>
+      </w:r>
+      <w:proofErr w:type="spellStart"/>
+      <w:r>
+        <w:rPr>
+          <w:b/>
+          <w:bCs/>
+        </w:rPr>
+        <w:t>api</w:t>
+      </w:r>
+      <w:proofErr w:type="spellEnd"/>
+      <w:r>
+        <w:rPr>
+          <w:b/>
+          <w:bCs/>
+        </w:rPr>
+        <w:t>/</w:t>
+      </w:r>
+      <w:proofErr w:type="spellStart"/>
+      <w:r>
+        <w:rPr>
+          <w:b/>
+          <w:bCs/>
+        </w:rPr>
+        <w:t>contests</w:t>
+      </w:r>
+      <w:proofErr w:type="spellEnd"/>
+      <w:r>
+        <w:rPr>
+          <w:b/>
+          <w:bCs/>
+        </w:rPr>
+        <w:t>/</w:t>
+      </w:r>
+      <w:r>
+        <w:t xml:space="preserve"> – Wyświetlanie aktywnych i nadchodzących konkursów przypisanych do grup użytkownika. To tutaj </w:t>
+      </w:r>
+      <w:proofErr w:type="spellStart"/>
+      <w:r>
+        <w:t>frontend</w:t>
+      </w:r>
+      <w:proofErr w:type="spellEnd"/>
+      <w:r>
+        <w:t xml:space="preserve"> będzie odczytywał flagę </w:t>
+      </w:r>
+      <w:proofErr w:type="spellStart"/>
+      <w:r>
+        <w:t>strict_mode</w:t>
+      </w:r>
+      <w:proofErr w:type="spellEnd"/>
+      <w:r>
+        <w:t xml:space="preserve">, aby aktywować zabezpieczenia </w:t>
+      </w:r>
+      <w:proofErr w:type="spellStart"/>
+      <w:r>
+        <w:t>antysciągowe</w:t>
+      </w:r>
+      <w:proofErr w:type="spellEnd"/>
+      <w:r>
+        <w:t xml:space="preserve"> w edytorze.</w:t>
       </w:r>
     </w:p>
     <w:p/>
@@ -1472,6 +3132,155 @@
     </w:lvl>
   </w:abstractNum>
   <w:abstractNum w:abstractNumId="1" w15:restartNumberingAfterBreak="0">
+    <w:nsid w:val="10BA75F6"/>
+    <w:multiLevelType w:val="multilevel"/>
+    <w:tmpl w:val="65946A4C"/>
+    <w:lvl w:ilvl="0">
+      <w:start w:val="1"/>
+      <w:numFmt w:val="bullet"/>
+      <w:lvlText w:val=""/>
+      <w:lvlJc w:val="left"/>
+      <w:pPr>
+        <w:tabs>
+          <w:tab w:val="num" w:pos="720"/>
+        </w:tabs>
+        <w:ind w:left="720" w:hanging="360"/>
+      </w:pPr>
+      <w:rPr>
+        <w:rFonts w:ascii="Symbol" w:hAnsi="Symbol" w:hint="default"/>
+        <w:sz w:val="20"/>
+      </w:rPr>
+    </w:lvl>
+    <w:lvl w:ilvl="1" w:tentative="1">
+      <w:start w:val="1"/>
+      <w:numFmt w:val="bullet"/>
+      <w:lvlText w:val="o"/>
+      <w:lvlJc w:val="left"/>
+      <w:pPr>
+        <w:tabs>
+          <w:tab w:val="num" w:pos="1440"/>
+        </w:tabs>
+        <w:ind w:left="1440" w:hanging="360"/>
+      </w:pPr>
+      <w:rPr>
+        <w:rFonts w:ascii="Courier New" w:hAnsi="Courier New" w:hint="default"/>
+        <w:sz w:val="20"/>
+      </w:rPr>
+    </w:lvl>
+    <w:lvl w:ilvl="2" w:tentative="1">
+      <w:start w:val="1"/>
+      <w:numFmt w:val="bullet"/>
+      <w:lvlText w:val=""/>
+      <w:lvlJc w:val="left"/>
+      <w:pPr>
+        <w:tabs>
+          <w:tab w:val="num" w:pos="2160"/>
+        </w:tabs>
+        <w:ind w:left="2160" w:hanging="360"/>
+      </w:pPr>
+      <w:rPr>
+        <w:rFonts w:ascii="Wingdings" w:hAnsi="Wingdings" w:hint="default"/>
+        <w:sz w:val="20"/>
+      </w:rPr>
+    </w:lvl>
+    <w:lvl w:ilvl="3" w:tentative="1">
+      <w:start w:val="1"/>
+      <w:numFmt w:val="bullet"/>
+      <w:lvlText w:val=""/>
+      <w:lvlJc w:val="left"/>
+      <w:pPr>
+        <w:tabs>
+          <w:tab w:val="num" w:pos="2880"/>
+        </w:tabs>
+        <w:ind w:left="2880" w:hanging="360"/>
+      </w:pPr>
+      <w:rPr>
+        <w:rFonts w:ascii="Wingdings" w:hAnsi="Wingdings" w:hint="default"/>
+        <w:sz w:val="20"/>
+      </w:rPr>
+    </w:lvl>
+    <w:lvl w:ilvl="4" w:tentative="1">
+      <w:start w:val="1"/>
+      <w:numFmt w:val="bullet"/>
+      <w:lvlText w:val=""/>
+      <w:lvlJc w:val="left"/>
+      <w:pPr>
+        <w:tabs>
+          <w:tab w:val="num" w:pos="3600"/>
+        </w:tabs>
+        <w:ind w:left="3600" w:hanging="360"/>
+      </w:pPr>
+      <w:rPr>
+        <w:rFonts w:ascii="Wingdings" w:hAnsi="Wingdings" w:hint="default"/>
+        <w:sz w:val="20"/>
+      </w:rPr>
+    </w:lvl>
+    <w:lvl w:ilvl="5" w:tentative="1">
+      <w:start w:val="1"/>
+      <w:numFmt w:val="bullet"/>
+      <w:lvlText w:val=""/>
+      <w:lvlJc w:val="left"/>
+      <w:pPr>
+        <w:tabs>
+          <w:tab w:val="num" w:pos="4320"/>
+        </w:tabs>
+        <w:ind w:left="4320" w:hanging="360"/>
+      </w:pPr>
+      <w:rPr>
+        <w:rFonts w:ascii="Wingdings" w:hAnsi="Wingdings" w:hint="default"/>
+        <w:sz w:val="20"/>
+      </w:rPr>
+    </w:lvl>
+    <w:lvl w:ilvl="6" w:tentative="1">
+      <w:start w:val="1"/>
+      <w:numFmt w:val="bullet"/>
+      <w:lvlText w:val=""/>
+      <w:lvlJc w:val="left"/>
+      <w:pPr>
+        <w:tabs>
+          <w:tab w:val="num" w:pos="5040"/>
+        </w:tabs>
+        <w:ind w:left="5040" w:hanging="360"/>
+      </w:pPr>
+      <w:rPr>
+        <w:rFonts w:ascii="Wingdings" w:hAnsi="Wingdings" w:hint="default"/>
+        <w:sz w:val="20"/>
+      </w:rPr>
+    </w:lvl>
+    <w:lvl w:ilvl="7" w:tentative="1">
+      <w:start w:val="1"/>
+      <w:numFmt w:val="bullet"/>
+      <w:lvlText w:val=""/>
+      <w:lvlJc w:val="left"/>
+      <w:pPr>
+        <w:tabs>
+          <w:tab w:val="num" w:pos="5760"/>
+        </w:tabs>
+        <w:ind w:left="5760" w:hanging="360"/>
+      </w:pPr>
+      <w:rPr>
+        <w:rFonts w:ascii="Wingdings" w:hAnsi="Wingdings" w:hint="default"/>
+        <w:sz w:val="20"/>
+      </w:rPr>
+    </w:lvl>
+    <w:lvl w:ilvl="8" w:tentative="1">
+      <w:start w:val="1"/>
+      <w:numFmt w:val="bullet"/>
+      <w:lvlText w:val=""/>
+      <w:lvlJc w:val="left"/>
+      <w:pPr>
+        <w:tabs>
+          <w:tab w:val="num" w:pos="6480"/>
+        </w:tabs>
+        <w:ind w:left="6480" w:hanging="360"/>
+      </w:pPr>
+      <w:rPr>
+        <w:rFonts w:ascii="Wingdings" w:hAnsi="Wingdings" w:hint="default"/>
+        <w:sz w:val="20"/>
+      </w:rPr>
+    </w:lvl>
+  </w:abstractNum>
+  <w:abstractNum w:abstractNumId="2" w15:restartNumberingAfterBreak="0">
     <w:nsid w:val="264858FA"/>
     <w:multiLevelType w:val="multilevel"/>
     <w:tmpl w:val="87E629E6"/>
@@ -1620,7 +3429,156 @@
       </w:rPr>
     </w:lvl>
   </w:abstractNum>
-  <w:abstractNum w:abstractNumId="2" w15:restartNumberingAfterBreak="0">
+  <w:abstractNum w:abstractNumId="3" w15:restartNumberingAfterBreak="0">
+    <w:nsid w:val="38B42181"/>
+    <w:multiLevelType w:val="multilevel"/>
+    <w:tmpl w:val="EE1C3D1C"/>
+    <w:lvl w:ilvl="0">
+      <w:start w:val="1"/>
+      <w:numFmt w:val="bullet"/>
+      <w:lvlText w:val=""/>
+      <w:lvlJc w:val="left"/>
+      <w:pPr>
+        <w:tabs>
+          <w:tab w:val="num" w:pos="720"/>
+        </w:tabs>
+        <w:ind w:left="720" w:hanging="360"/>
+      </w:pPr>
+      <w:rPr>
+        <w:rFonts w:ascii="Symbol" w:hAnsi="Symbol" w:hint="default"/>
+        <w:sz w:val="20"/>
+      </w:rPr>
+    </w:lvl>
+    <w:lvl w:ilvl="1" w:tentative="1">
+      <w:start w:val="1"/>
+      <w:numFmt w:val="bullet"/>
+      <w:lvlText w:val="o"/>
+      <w:lvlJc w:val="left"/>
+      <w:pPr>
+        <w:tabs>
+          <w:tab w:val="num" w:pos="1440"/>
+        </w:tabs>
+        <w:ind w:left="1440" w:hanging="360"/>
+      </w:pPr>
+      <w:rPr>
+        <w:rFonts w:ascii="Courier New" w:hAnsi="Courier New" w:hint="default"/>
+        <w:sz w:val="20"/>
+      </w:rPr>
+    </w:lvl>
+    <w:lvl w:ilvl="2" w:tentative="1">
+      <w:start w:val="1"/>
+      <w:numFmt w:val="bullet"/>
+      <w:lvlText w:val=""/>
+      <w:lvlJc w:val="left"/>
+      <w:pPr>
+        <w:tabs>
+          <w:tab w:val="num" w:pos="2160"/>
+        </w:tabs>
+        <w:ind w:left="2160" w:hanging="360"/>
+      </w:pPr>
+      <w:rPr>
+        <w:rFonts w:ascii="Wingdings" w:hAnsi="Wingdings" w:hint="default"/>
+        <w:sz w:val="20"/>
+      </w:rPr>
+    </w:lvl>
+    <w:lvl w:ilvl="3" w:tentative="1">
+      <w:start w:val="1"/>
+      <w:numFmt w:val="bullet"/>
+      <w:lvlText w:val=""/>
+      <w:lvlJc w:val="left"/>
+      <w:pPr>
+        <w:tabs>
+          <w:tab w:val="num" w:pos="2880"/>
+        </w:tabs>
+        <w:ind w:left="2880" w:hanging="360"/>
+      </w:pPr>
+      <w:rPr>
+        <w:rFonts w:ascii="Wingdings" w:hAnsi="Wingdings" w:hint="default"/>
+        <w:sz w:val="20"/>
+      </w:rPr>
+    </w:lvl>
+    <w:lvl w:ilvl="4" w:tentative="1">
+      <w:start w:val="1"/>
+      <w:numFmt w:val="bullet"/>
+      <w:lvlText w:val=""/>
+      <w:lvlJc w:val="left"/>
+      <w:pPr>
+        <w:tabs>
+          <w:tab w:val="num" w:pos="3600"/>
+        </w:tabs>
+        <w:ind w:left="3600" w:hanging="360"/>
+      </w:pPr>
+      <w:rPr>
+        <w:rFonts w:ascii="Wingdings" w:hAnsi="Wingdings" w:hint="default"/>
+        <w:sz w:val="20"/>
+      </w:rPr>
+    </w:lvl>
+    <w:lvl w:ilvl="5" w:tentative="1">
+      <w:start w:val="1"/>
+      <w:numFmt w:val="bullet"/>
+      <w:lvlText w:val=""/>
+      <w:lvlJc w:val="left"/>
+      <w:pPr>
+        <w:tabs>
+          <w:tab w:val="num" w:pos="4320"/>
+        </w:tabs>
+        <w:ind w:left="4320" w:hanging="360"/>
+      </w:pPr>
+      <w:rPr>
+        <w:rFonts w:ascii="Wingdings" w:hAnsi="Wingdings" w:hint="default"/>
+        <w:sz w:val="20"/>
+      </w:rPr>
+    </w:lvl>
+    <w:lvl w:ilvl="6" w:tentative="1">
+      <w:start w:val="1"/>
+      <w:numFmt w:val="bullet"/>
+      <w:lvlText w:val=""/>
+      <w:lvlJc w:val="left"/>
+      <w:pPr>
+        <w:tabs>
+          <w:tab w:val="num" w:pos="5040"/>
+        </w:tabs>
+        <w:ind w:left="5040" w:hanging="360"/>
+      </w:pPr>
+      <w:rPr>
+        <w:rFonts w:ascii="Wingdings" w:hAnsi="Wingdings" w:hint="default"/>
+        <w:sz w:val="20"/>
+      </w:rPr>
+    </w:lvl>
+    <w:lvl w:ilvl="7" w:tentative="1">
+      <w:start w:val="1"/>
+      <w:numFmt w:val="bullet"/>
+      <w:lvlText w:val=""/>
+      <w:lvlJc w:val="left"/>
+      <w:pPr>
+        <w:tabs>
+          <w:tab w:val="num" w:pos="5760"/>
+        </w:tabs>
+        <w:ind w:left="5760" w:hanging="360"/>
+      </w:pPr>
+      <w:rPr>
+        <w:rFonts w:ascii="Wingdings" w:hAnsi="Wingdings" w:hint="default"/>
+        <w:sz w:val="20"/>
+      </w:rPr>
+    </w:lvl>
+    <w:lvl w:ilvl="8" w:tentative="1">
+      <w:start w:val="1"/>
+      <w:numFmt w:val="bullet"/>
+      <w:lvlText w:val=""/>
+      <w:lvlJc w:val="left"/>
+      <w:pPr>
+        <w:tabs>
+          <w:tab w:val="num" w:pos="6480"/>
+        </w:tabs>
+        <w:ind w:left="6480" w:hanging="360"/>
+      </w:pPr>
+      <w:rPr>
+        <w:rFonts w:ascii="Wingdings" w:hAnsi="Wingdings" w:hint="default"/>
+        <w:sz w:val="20"/>
+      </w:rPr>
+    </w:lvl>
+  </w:abstractNum>
+  <w:abstractNum w:abstractNumId="4" w15:restartNumberingAfterBreak="0">
     <w:nsid w:val="4D7425C3"/>
     <w:multiLevelType w:val="multilevel"/>
     <w:tmpl w:val="C6206946"/>
@@ -1769,7 +3727,305 @@
       </w:rPr>
     </w:lvl>
   </w:abstractNum>
-  <w:abstractNum w:abstractNumId="3" w15:restartNumberingAfterBreak="0">
+  <w:abstractNum w:abstractNumId="5" w15:restartNumberingAfterBreak="0">
+    <w:nsid w:val="4E78043E"/>
+    <w:multiLevelType w:val="multilevel"/>
+    <w:tmpl w:val="CEE0E0B4"/>
+    <w:lvl w:ilvl="0">
+      <w:start w:val="1"/>
+      <w:numFmt w:val="bullet"/>
+      <w:lvlText w:val=""/>
+      <w:lvlJc w:val="left"/>
+      <w:pPr>
+        <w:tabs>
+          <w:tab w:val="num" w:pos="720"/>
+        </w:tabs>
+        <w:ind w:left="720" w:hanging="360"/>
+      </w:pPr>
+      <w:rPr>
+        <w:rFonts w:ascii="Symbol" w:hAnsi="Symbol" w:hint="default"/>
+        <w:sz w:val="20"/>
+      </w:rPr>
+    </w:lvl>
+    <w:lvl w:ilvl="1" w:tentative="1">
+      <w:start w:val="1"/>
+      <w:numFmt w:val="bullet"/>
+      <w:lvlText w:val="o"/>
+      <w:lvlJc w:val="left"/>
+      <w:pPr>
+        <w:tabs>
+          <w:tab w:val="num" w:pos="1440"/>
+        </w:tabs>
+        <w:ind w:left="1440" w:hanging="360"/>
+      </w:pPr>
+      <w:rPr>
+        <w:rFonts w:ascii="Courier New" w:hAnsi="Courier New" w:hint="default"/>
+        <w:sz w:val="20"/>
+      </w:rPr>
+    </w:lvl>
+    <w:lvl w:ilvl="2" w:tentative="1">
+      <w:start w:val="1"/>
+      <w:numFmt w:val="bullet"/>
+      <w:lvlText w:val=""/>
+      <w:lvlJc w:val="left"/>
+      <w:pPr>
+        <w:tabs>
+          <w:tab w:val="num" w:pos="2160"/>
+        </w:tabs>
+        <w:ind w:left="2160" w:hanging="360"/>
+      </w:pPr>
+      <w:rPr>
+        <w:rFonts w:ascii="Wingdings" w:hAnsi="Wingdings" w:hint="default"/>
+        <w:sz w:val="20"/>
+      </w:rPr>
+    </w:lvl>
+    <w:lvl w:ilvl="3" w:tentative="1">
+      <w:start w:val="1"/>
+      <w:numFmt w:val="bullet"/>
+      <w:lvlText w:val=""/>
+      <w:lvlJc w:val="left"/>
+      <w:pPr>
+        <w:tabs>
+          <w:tab w:val="num" w:pos="2880"/>
+        </w:tabs>
+        <w:ind w:left="2880" w:hanging="360"/>
+      </w:pPr>
+      <w:rPr>
+        <w:rFonts w:ascii="Wingdings" w:hAnsi="Wingdings" w:hint="default"/>
+        <w:sz w:val="20"/>
+      </w:rPr>
+    </w:lvl>
+    <w:lvl w:ilvl="4" w:tentative="1">
+      <w:start w:val="1"/>
+      <w:numFmt w:val="bullet"/>
+      <w:lvlText w:val=""/>
+      <w:lvlJc w:val="left"/>
+      <w:pPr>
+        <w:tabs>
+          <w:tab w:val="num" w:pos="3600"/>
+        </w:tabs>
+        <w:ind w:left="3600" w:hanging="360"/>
+      </w:pPr>
+      <w:rPr>
+        <w:rFonts w:ascii="Wingdings" w:hAnsi="Wingdings" w:hint="default"/>
+        <w:sz w:val="20"/>
+      </w:rPr>
+    </w:lvl>
+    <w:lvl w:ilvl="5" w:tentative="1">
+      <w:start w:val="1"/>
+      <w:numFmt w:val="bullet"/>
+      <w:lvlText w:val=""/>
+      <w:lvlJc w:val="left"/>
+      <w:pPr>
+        <w:tabs>
+          <w:tab w:val="num" w:pos="4320"/>
+        </w:tabs>
+        <w:ind w:left="4320" w:hanging="360"/>
+      </w:pPr>
+      <w:rPr>
+        <w:rFonts w:ascii="Wingdings" w:hAnsi="Wingdings" w:hint="default"/>
+        <w:sz w:val="20"/>
+      </w:rPr>
+    </w:lvl>
+    <w:lvl w:ilvl="6" w:tentative="1">
+      <w:start w:val="1"/>
+      <w:numFmt w:val="bullet"/>
+      <w:lvlText w:val=""/>
+      <w:lvlJc w:val="left"/>
+      <w:pPr>
+        <w:tabs>
+          <w:tab w:val="num" w:pos="5040"/>
+        </w:tabs>
+        <w:ind w:left="5040" w:hanging="360"/>
+      </w:pPr>
+      <w:rPr>
+        <w:rFonts w:ascii="Wingdings" w:hAnsi="Wingdings" w:hint="default"/>
+        <w:sz w:val="20"/>
+      </w:rPr>
+    </w:lvl>
+    <w:lvl w:ilvl="7" w:tentative="1">
+      <w:start w:val="1"/>
+      <w:numFmt w:val="bullet"/>
+      <w:lvlText w:val=""/>
+      <w:lvlJc w:val="left"/>
+      <w:pPr>
+        <w:tabs>
+          <w:tab w:val="num" w:pos="5760"/>
+        </w:tabs>
+        <w:ind w:left="5760" w:hanging="360"/>
+      </w:pPr>
+      <w:rPr>
+        <w:rFonts w:ascii="Wingdings" w:hAnsi="Wingdings" w:hint="default"/>
+        <w:sz w:val="20"/>
+      </w:rPr>
+    </w:lvl>
+    <w:lvl w:ilvl="8" w:tentative="1">
+      <w:start w:val="1"/>
+      <w:numFmt w:val="bullet"/>
+      <w:lvlText w:val=""/>
+      <w:lvlJc w:val="left"/>
+      <w:pPr>
+        <w:tabs>
+          <w:tab w:val="num" w:pos="6480"/>
+        </w:tabs>
+        <w:ind w:left="6480" w:hanging="360"/>
+      </w:pPr>
+      <w:rPr>
+        <w:rFonts w:ascii="Wingdings" w:hAnsi="Wingdings" w:hint="default"/>
+        <w:sz w:val="20"/>
+      </w:rPr>
+    </w:lvl>
+  </w:abstractNum>
+  <w:abstractNum w:abstractNumId="6" w15:restartNumberingAfterBreak="0">
+    <w:nsid w:val="52FA7FCB"/>
+    <w:multiLevelType w:val="multilevel"/>
+    <w:tmpl w:val="B67073F6"/>
+    <w:lvl w:ilvl="0">
+      <w:start w:val="1"/>
+      <w:numFmt w:val="bullet"/>
+      <w:lvlText w:val=""/>
+      <w:lvlJc w:val="left"/>
+      <w:pPr>
+        <w:tabs>
+          <w:tab w:val="num" w:pos="720"/>
+        </w:tabs>
+        <w:ind w:left="720" w:hanging="360"/>
+      </w:pPr>
+      <w:rPr>
+        <w:rFonts w:ascii="Symbol" w:hAnsi="Symbol" w:hint="default"/>
+        <w:sz w:val="20"/>
+      </w:rPr>
+    </w:lvl>
+    <w:lvl w:ilvl="1" w:tentative="1">
+      <w:start w:val="1"/>
+      <w:numFmt w:val="bullet"/>
+      <w:lvlText w:val="o"/>
+      <w:lvlJc w:val="left"/>
+      <w:pPr>
+        <w:tabs>
+          <w:tab w:val="num" w:pos="1440"/>
+        </w:tabs>
+        <w:ind w:left="1440" w:hanging="360"/>
+      </w:pPr>
+      <w:rPr>
+        <w:rFonts w:ascii="Courier New" w:hAnsi="Courier New" w:hint="default"/>
+        <w:sz w:val="20"/>
+      </w:rPr>
+    </w:lvl>
+    <w:lvl w:ilvl="2" w:tentative="1">
+      <w:start w:val="1"/>
+      <w:numFmt w:val="bullet"/>
+      <w:lvlText w:val=""/>
+      <w:lvlJc w:val="left"/>
+      <w:pPr>
+        <w:tabs>
+          <w:tab w:val="num" w:pos="2160"/>
+        </w:tabs>
+        <w:ind w:left="2160" w:hanging="360"/>
+      </w:pPr>
+      <w:rPr>
+        <w:rFonts w:ascii="Wingdings" w:hAnsi="Wingdings" w:hint="default"/>
+        <w:sz w:val="20"/>
+      </w:rPr>
+    </w:lvl>
+    <w:lvl w:ilvl="3" w:tentative="1">
+      <w:start w:val="1"/>
+      <w:numFmt w:val="bullet"/>
+      <w:lvlText w:val=""/>
+      <w:lvlJc w:val="left"/>
+      <w:pPr>
+        <w:tabs>
+          <w:tab w:val="num" w:pos="2880"/>
+        </w:tabs>
+        <w:ind w:left="2880" w:hanging="360"/>
+      </w:pPr>
+      <w:rPr>
+        <w:rFonts w:ascii="Wingdings" w:hAnsi="Wingdings" w:hint="default"/>
+        <w:sz w:val="20"/>
+      </w:rPr>
+    </w:lvl>
+    <w:lvl w:ilvl="4" w:tentative="1">
+      <w:start w:val="1"/>
+      <w:numFmt w:val="bullet"/>
+      <w:lvlText w:val=""/>
+      <w:lvlJc w:val="left"/>
+      <w:pPr>
+        <w:tabs>
+          <w:tab w:val="num" w:pos="3600"/>
+        </w:tabs>
+        <w:ind w:left="3600" w:hanging="360"/>
+      </w:pPr>
+      <w:rPr>
+        <w:rFonts w:ascii="Wingdings" w:hAnsi="Wingdings" w:hint="default"/>
+        <w:sz w:val="20"/>
+      </w:rPr>
+    </w:lvl>
+    <w:lvl w:ilvl="5" w:tentative="1">
+      <w:start w:val="1"/>
+      <w:numFmt w:val="bullet"/>
+      <w:lvlText w:val=""/>
+      <w:lvlJc w:val="left"/>
+      <w:pPr>
+        <w:tabs>
+          <w:tab w:val="num" w:pos="4320"/>
+        </w:tabs>
+        <w:ind w:left="4320" w:hanging="360"/>
+      </w:pPr>
+      <w:rPr>
+        <w:rFonts w:ascii="Wingdings" w:hAnsi="Wingdings" w:hint="default"/>
+        <w:sz w:val="20"/>
+      </w:rPr>
+    </w:lvl>
+    <w:lvl w:ilvl="6" w:tentative="1">
+      <w:start w:val="1"/>
+      <w:numFmt w:val="bullet"/>
+      <w:lvlText w:val=""/>
+      <w:lvlJc w:val="left"/>
+      <w:pPr>
+        <w:tabs>
+          <w:tab w:val="num" w:pos="5040"/>
+        </w:tabs>
+        <w:ind w:left="5040" w:hanging="360"/>
+      </w:pPr>
+      <w:rPr>
+        <w:rFonts w:ascii="Wingdings" w:hAnsi="Wingdings" w:hint="default"/>
+        <w:sz w:val="20"/>
+      </w:rPr>
+    </w:lvl>
+    <w:lvl w:ilvl="7" w:tentative="1">
+      <w:start w:val="1"/>
+      <w:numFmt w:val="bullet"/>
+      <w:lvlText w:val=""/>
+      <w:lvlJc w:val="left"/>
+      <w:pPr>
+        <w:tabs>
+          <w:tab w:val="num" w:pos="5760"/>
+        </w:tabs>
+        <w:ind w:left="5760" w:hanging="360"/>
+      </w:pPr>
+      <w:rPr>
+        <w:rFonts w:ascii="Wingdings" w:hAnsi="Wingdings" w:hint="default"/>
+        <w:sz w:val="20"/>
+      </w:rPr>
+    </w:lvl>
+    <w:lvl w:ilvl="8" w:tentative="1">
+      <w:start w:val="1"/>
+      <w:numFmt w:val="bullet"/>
+      <w:lvlText w:val=""/>
+      <w:lvlJc w:val="left"/>
+      <w:pPr>
+        <w:tabs>
+          <w:tab w:val="num" w:pos="6480"/>
+        </w:tabs>
+        <w:ind w:left="6480" w:hanging="360"/>
+      </w:pPr>
+      <w:rPr>
+        <w:rFonts w:ascii="Wingdings" w:hAnsi="Wingdings" w:hint="default"/>
+        <w:sz w:val="20"/>
+      </w:rPr>
+    </w:lvl>
+  </w:abstractNum>
+  <w:abstractNum w:abstractNumId="7" w15:restartNumberingAfterBreak="0">
     <w:nsid w:val="5B3D7807"/>
     <w:multiLevelType w:val="multilevel"/>
     <w:tmpl w:val="11FC45C6"/>
@@ -1918,7 +4174,7 @@
       </w:rPr>
     </w:lvl>
   </w:abstractNum>
-  <w:abstractNum w:abstractNumId="4" w15:restartNumberingAfterBreak="0">
+  <w:abstractNum w:abstractNumId="8" w15:restartNumberingAfterBreak="0">
     <w:nsid w:val="5B7F59A7"/>
     <w:multiLevelType w:val="multilevel"/>
     <w:tmpl w:val="5EE4D02E"/>
@@ -2067,7 +4323,7 @@
       </w:rPr>
     </w:lvl>
   </w:abstractNum>
-  <w:abstractNum w:abstractNumId="5" w15:restartNumberingAfterBreak="0">
+  <w:abstractNum w:abstractNumId="9" w15:restartNumberingAfterBreak="0">
     <w:nsid w:val="5D93295D"/>
     <w:multiLevelType w:val="multilevel"/>
     <w:tmpl w:val="35D475A6"/>
@@ -2216,22 +4472,338 @@
       </w:rPr>
     </w:lvl>
   </w:abstractNum>
+  <w:abstractNum w:abstractNumId="10" w15:restartNumberingAfterBreak="0">
+    <w:nsid w:val="61D612E1"/>
+    <w:multiLevelType w:val="multilevel"/>
+    <w:tmpl w:val="E918C276"/>
+    <w:lvl w:ilvl="0">
+      <w:start w:val="1"/>
+      <w:numFmt w:val="bullet"/>
+      <w:lvlText w:val=""/>
+      <w:lvlJc w:val="left"/>
+      <w:pPr>
+        <w:tabs>
+          <w:tab w:val="num" w:pos="720"/>
+        </w:tabs>
+        <w:ind w:left="720" w:hanging="360"/>
+      </w:pPr>
+      <w:rPr>
+        <w:rFonts w:ascii="Symbol" w:hAnsi="Symbol" w:hint="default"/>
+        <w:sz w:val="20"/>
+      </w:rPr>
+    </w:lvl>
+    <w:lvl w:ilvl="1" w:tentative="1">
+      <w:start w:val="1"/>
+      <w:numFmt w:val="bullet"/>
+      <w:lvlText w:val="o"/>
+      <w:lvlJc w:val="left"/>
+      <w:pPr>
+        <w:tabs>
+          <w:tab w:val="num" w:pos="1440"/>
+        </w:tabs>
+        <w:ind w:left="1440" w:hanging="360"/>
+      </w:pPr>
+      <w:rPr>
+        <w:rFonts w:ascii="Courier New" w:hAnsi="Courier New" w:hint="default"/>
+        <w:sz w:val="20"/>
+      </w:rPr>
+    </w:lvl>
+    <w:lvl w:ilvl="2" w:tentative="1">
+      <w:start w:val="1"/>
+      <w:numFmt w:val="bullet"/>
+      <w:lvlText w:val=""/>
+      <w:lvlJc w:val="left"/>
+      <w:pPr>
+        <w:tabs>
+          <w:tab w:val="num" w:pos="2160"/>
+        </w:tabs>
+        <w:ind w:left="2160" w:hanging="360"/>
+      </w:pPr>
+      <w:rPr>
+        <w:rFonts w:ascii="Wingdings" w:hAnsi="Wingdings" w:hint="default"/>
+        <w:sz w:val="20"/>
+      </w:rPr>
+    </w:lvl>
+    <w:lvl w:ilvl="3" w:tentative="1">
+      <w:start w:val="1"/>
+      <w:numFmt w:val="bullet"/>
+      <w:lvlText w:val=""/>
+      <w:lvlJc w:val="left"/>
+      <w:pPr>
+        <w:tabs>
+          <w:tab w:val="num" w:pos="2880"/>
+        </w:tabs>
+        <w:ind w:left="2880" w:hanging="360"/>
+      </w:pPr>
+      <w:rPr>
+        <w:rFonts w:ascii="Wingdings" w:hAnsi="Wingdings" w:hint="default"/>
+        <w:sz w:val="20"/>
+      </w:rPr>
+    </w:lvl>
+    <w:lvl w:ilvl="4" w:tentative="1">
+      <w:start w:val="1"/>
+      <w:numFmt w:val="bullet"/>
+      <w:lvlText w:val=""/>
+      <w:lvlJc w:val="left"/>
+      <w:pPr>
+        <w:tabs>
+          <w:tab w:val="num" w:pos="3600"/>
+        </w:tabs>
+        <w:ind w:left="3600" w:hanging="360"/>
+      </w:pPr>
+      <w:rPr>
+        <w:rFonts w:ascii="Wingdings" w:hAnsi="Wingdings" w:hint="default"/>
+        <w:sz w:val="20"/>
+      </w:rPr>
+    </w:lvl>
+    <w:lvl w:ilvl="5" w:tentative="1">
+      <w:start w:val="1"/>
+      <w:numFmt w:val="bullet"/>
+      <w:lvlText w:val=""/>
+      <w:lvlJc w:val="left"/>
+      <w:pPr>
+        <w:tabs>
+          <w:tab w:val="num" w:pos="4320"/>
+        </w:tabs>
+        <w:ind w:left="4320" w:hanging="360"/>
+      </w:pPr>
+      <w:rPr>
+        <w:rFonts w:ascii="Wingdings" w:hAnsi="Wingdings" w:hint="default"/>
+        <w:sz w:val="20"/>
+      </w:rPr>
+    </w:lvl>
+    <w:lvl w:ilvl="6" w:tentative="1">
+      <w:start w:val="1"/>
+      <w:numFmt w:val="bullet"/>
+      <w:lvlText w:val=""/>
+      <w:lvlJc w:val="left"/>
+      <w:pPr>
+        <w:tabs>
+          <w:tab w:val="num" w:pos="5040"/>
+        </w:tabs>
+        <w:ind w:left="5040" w:hanging="360"/>
+      </w:pPr>
+      <w:rPr>
+        <w:rFonts w:ascii="Wingdings" w:hAnsi="Wingdings" w:hint="default"/>
+        <w:sz w:val="20"/>
+      </w:rPr>
+    </w:lvl>
+    <w:lvl w:ilvl="7" w:tentative="1">
+      <w:start w:val="1"/>
+      <w:numFmt w:val="bullet"/>
+      <w:lvlText w:val=""/>
+      <w:lvlJc w:val="left"/>
+      <w:pPr>
+        <w:tabs>
+          <w:tab w:val="num" w:pos="5760"/>
+        </w:tabs>
+        <w:ind w:left="5760" w:hanging="360"/>
+      </w:pPr>
+      <w:rPr>
+        <w:rFonts w:ascii="Wingdings" w:hAnsi="Wingdings" w:hint="default"/>
+        <w:sz w:val="20"/>
+      </w:rPr>
+    </w:lvl>
+    <w:lvl w:ilvl="8" w:tentative="1">
+      <w:start w:val="1"/>
+      <w:numFmt w:val="bullet"/>
+      <w:lvlText w:val=""/>
+      <w:lvlJc w:val="left"/>
+      <w:pPr>
+        <w:tabs>
+          <w:tab w:val="num" w:pos="6480"/>
+        </w:tabs>
+        <w:ind w:left="6480" w:hanging="360"/>
+      </w:pPr>
+      <w:rPr>
+        <w:rFonts w:ascii="Wingdings" w:hAnsi="Wingdings" w:hint="default"/>
+        <w:sz w:val="20"/>
+      </w:rPr>
+    </w:lvl>
+  </w:abstractNum>
+  <w:abstractNum w:abstractNumId="11" w15:restartNumberingAfterBreak="0">
+    <w:nsid w:val="7EE31060"/>
+    <w:multiLevelType w:val="multilevel"/>
+    <w:tmpl w:val="D0784C76"/>
+    <w:lvl w:ilvl="0">
+      <w:start w:val="1"/>
+      <w:numFmt w:val="bullet"/>
+      <w:lvlText w:val=""/>
+      <w:lvlJc w:val="left"/>
+      <w:pPr>
+        <w:tabs>
+          <w:tab w:val="num" w:pos="720"/>
+        </w:tabs>
+        <w:ind w:left="720" w:hanging="360"/>
+      </w:pPr>
+      <w:rPr>
+        <w:rFonts w:ascii="Symbol" w:hAnsi="Symbol" w:hint="default"/>
+        <w:sz w:val="20"/>
+      </w:rPr>
+    </w:lvl>
+    <w:lvl w:ilvl="1" w:tentative="1">
+      <w:start w:val="1"/>
+      <w:numFmt w:val="bullet"/>
+      <w:lvlText w:val="o"/>
+      <w:lvlJc w:val="left"/>
+      <w:pPr>
+        <w:tabs>
+          <w:tab w:val="num" w:pos="1440"/>
+        </w:tabs>
+        <w:ind w:left="1440" w:hanging="360"/>
+      </w:pPr>
+      <w:rPr>
+        <w:rFonts w:ascii="Courier New" w:hAnsi="Courier New" w:hint="default"/>
+        <w:sz w:val="20"/>
+      </w:rPr>
+    </w:lvl>
+    <w:lvl w:ilvl="2" w:tentative="1">
+      <w:start w:val="1"/>
+      <w:numFmt w:val="bullet"/>
+      <w:lvlText w:val=""/>
+      <w:lvlJc w:val="left"/>
+      <w:pPr>
+        <w:tabs>
+          <w:tab w:val="num" w:pos="2160"/>
+        </w:tabs>
+        <w:ind w:left="2160" w:hanging="360"/>
+      </w:pPr>
+      <w:rPr>
+        <w:rFonts w:ascii="Wingdings" w:hAnsi="Wingdings" w:hint="default"/>
+        <w:sz w:val="20"/>
+      </w:rPr>
+    </w:lvl>
+    <w:lvl w:ilvl="3" w:tentative="1">
+      <w:start w:val="1"/>
+      <w:numFmt w:val="bullet"/>
+      <w:lvlText w:val=""/>
+      <w:lvlJc w:val="left"/>
+      <w:pPr>
+        <w:tabs>
+          <w:tab w:val="num" w:pos="2880"/>
+        </w:tabs>
+        <w:ind w:left="2880" w:hanging="360"/>
+      </w:pPr>
+      <w:rPr>
+        <w:rFonts w:ascii="Wingdings" w:hAnsi="Wingdings" w:hint="default"/>
+        <w:sz w:val="20"/>
+      </w:rPr>
+    </w:lvl>
+    <w:lvl w:ilvl="4" w:tentative="1">
+      <w:start w:val="1"/>
+      <w:numFmt w:val="bullet"/>
+      <w:lvlText w:val=""/>
+      <w:lvlJc w:val="left"/>
+      <w:pPr>
+        <w:tabs>
+          <w:tab w:val="num" w:pos="3600"/>
+        </w:tabs>
+        <w:ind w:left="3600" w:hanging="360"/>
+      </w:pPr>
+      <w:rPr>
+        <w:rFonts w:ascii="Wingdings" w:hAnsi="Wingdings" w:hint="default"/>
+        <w:sz w:val="20"/>
+      </w:rPr>
+    </w:lvl>
+    <w:lvl w:ilvl="5" w:tentative="1">
+      <w:start w:val="1"/>
+      <w:numFmt w:val="bullet"/>
+      <w:lvlText w:val=""/>
+      <w:lvlJc w:val="left"/>
+      <w:pPr>
+        <w:tabs>
+          <w:tab w:val="num" w:pos="4320"/>
+        </w:tabs>
+        <w:ind w:left="4320" w:hanging="360"/>
+      </w:pPr>
+      <w:rPr>
+        <w:rFonts w:ascii="Wingdings" w:hAnsi="Wingdings" w:hint="default"/>
+        <w:sz w:val="20"/>
+      </w:rPr>
+    </w:lvl>
+    <w:lvl w:ilvl="6" w:tentative="1">
+      <w:start w:val="1"/>
+      <w:numFmt w:val="bullet"/>
+      <w:lvlText w:val=""/>
+      <w:lvlJc w:val="left"/>
+      <w:pPr>
+        <w:tabs>
+          <w:tab w:val="num" w:pos="5040"/>
+        </w:tabs>
+        <w:ind w:left="5040" w:hanging="360"/>
+      </w:pPr>
+      <w:rPr>
+        <w:rFonts w:ascii="Wingdings" w:hAnsi="Wingdings" w:hint="default"/>
+        <w:sz w:val="20"/>
+      </w:rPr>
+    </w:lvl>
+    <w:lvl w:ilvl="7" w:tentative="1">
+      <w:start w:val="1"/>
+      <w:numFmt w:val="bullet"/>
+      <w:lvlText w:val=""/>
+      <w:lvlJc w:val="left"/>
+      <w:pPr>
+        <w:tabs>
+          <w:tab w:val="num" w:pos="5760"/>
+        </w:tabs>
+        <w:ind w:left="5760" w:hanging="360"/>
+      </w:pPr>
+      <w:rPr>
+        <w:rFonts w:ascii="Wingdings" w:hAnsi="Wingdings" w:hint="default"/>
+        <w:sz w:val="20"/>
+      </w:rPr>
+    </w:lvl>
+    <w:lvl w:ilvl="8" w:tentative="1">
+      <w:start w:val="1"/>
+      <w:numFmt w:val="bullet"/>
+      <w:lvlText w:val=""/>
+      <w:lvlJc w:val="left"/>
+      <w:pPr>
+        <w:tabs>
+          <w:tab w:val="num" w:pos="6480"/>
+        </w:tabs>
+        <w:ind w:left="6480" w:hanging="360"/>
+      </w:pPr>
+      <w:rPr>
+        <w:rFonts w:ascii="Wingdings" w:hAnsi="Wingdings" w:hint="default"/>
+        <w:sz w:val="20"/>
+      </w:rPr>
+    </w:lvl>
+  </w:abstractNum>
   <w:num w:numId="1" w16cid:durableId="2083940673">
-    <w:abstractNumId w:val="2"/>
+    <w:abstractNumId w:val="4"/>
   </w:num>
   <w:num w:numId="2" w16cid:durableId="1369910741">
-    <w:abstractNumId w:val="1"/>
+    <w:abstractNumId w:val="2"/>
   </w:num>
   <w:num w:numId="3" w16cid:durableId="381756520">
     <w:abstractNumId w:val="0"/>
   </w:num>
   <w:num w:numId="4" w16cid:durableId="1619027423">
+    <w:abstractNumId w:val="9"/>
+  </w:num>
+  <w:num w:numId="5" w16cid:durableId="450829248">
+    <w:abstractNumId w:val="8"/>
+  </w:num>
+  <w:num w:numId="6" w16cid:durableId="187841723">
+    <w:abstractNumId w:val="7"/>
+  </w:num>
+  <w:num w:numId="7" w16cid:durableId="1739552729">
+    <w:abstractNumId w:val="10"/>
+  </w:num>
+  <w:num w:numId="8" w16cid:durableId="1347514590">
+    <w:abstractNumId w:val="11"/>
+  </w:num>
+  <w:num w:numId="9" w16cid:durableId="2035842076">
     <w:abstractNumId w:val="5"/>
   </w:num>
-  <w:num w:numId="5" w16cid:durableId="450829248">
-    <w:abstractNumId w:val="4"/>
+  <w:num w:numId="10" w16cid:durableId="633609289">
+    <w:abstractNumId w:val="1"/>
   </w:num>
-  <w:num w:numId="6" w16cid:durableId="187841723">
+  <w:num w:numId="11" w16cid:durableId="318850427">
+    <w:abstractNumId w:val="6"/>
+  </w:num>
+  <w:num w:numId="12" w16cid:durableId="1489319562">
     <w:abstractNumId w:val="3"/>
   </w:num>
 </w:numbering>
@@ -2687,7 +5259,6 @@
     <w:next w:val="Normalny"/>
     <w:link w:val="Nagwek3Znak"/>
     <w:uiPriority w:val="9"/>
-    <w:semiHidden/>
     <w:unhideWhenUsed/>
     <w:qFormat/>
     <w:rsid w:val="00E56B35"/>
@@ -2839,7 +5410,6 @@
   <w:style w:type="character" w:default="1" w:styleId="Domylnaczcionkaakapitu">
     <w:name w:val="Default Paragraph Font"/>
     <w:uiPriority w:val="1"/>
-    <w:semiHidden/>
     <w:unhideWhenUsed/>
   </w:style>
   <w:style w:type="table" w:default="1" w:styleId="Standardowy">
@@ -2894,7 +5464,6 @@
     <w:basedOn w:val="Domylnaczcionkaakapitu"/>
     <w:link w:val="Nagwek3"/>
     <w:uiPriority w:val="9"/>
-    <w:semiHidden/>
     <w:rsid w:val="00E56B35"/>
     <w:rPr>
       <w:rFonts w:eastAsiaTheme="majorEastAsia" w:cstheme="majorBidi"/>
@@ -3468,4 +6037,39 @@
     </a:ext>
   </a:extLst>
 </a:theme>
+</file>
+
+<file path=word/webextensions/taskpanes.xml><?xml version="1.0" encoding="utf-8"?>
+<wetp:taskpanes xmlns:wetp="http://schemas.microsoft.com/office/webextensions/taskpanes/2010/11">
+  <wetp:taskpane dockstate="right" visibility="0" width="525" row="6">
+    <wetp:webextensionref xmlns:r="http://schemas.openxmlformats.org/officeDocument/2006/relationships" r:id="rId1"/>
+  </wetp:taskpane>
+</wetp:taskpanes>
+</file>
+
+<file path=word/webextensions/webextension1.xml><?xml version="1.0" encoding="utf-8"?>
+<we:webextension xmlns:we="http://schemas.microsoft.com/office/webextensions/webextension/2010/11" id="{62FFFD8A-76BF-4602-8867-26CBC97A5C1F}">
+  <we:reference id="wa200000011" version="1.0.1.0" store="pl-PL" storeType="OMEX"/>
+  <we:alternateReferences>
+    <we:reference id="WA200000011" version="1.0.1.0" store="WA200000011" storeType="OMEX"/>
+  </we:alternateReferences>
+  <we:properties>
+    <we:property name="language" value="&quot;Json&quot;"/>
+    <we:property name="theme" value="&quot;A11y Dark&quot;"/>
+  </we:properties>
+  <we:bindings/>
+  <we:snapshot xmlns:r="http://schemas.openxmlformats.org/officeDocument/2006/relationships"/>
+</we:webextension>
+</file>
+
+<file path=customXml/item1.xml><?xml version="1.0" encoding="utf-8"?>
+<b:Sources xmlns:b="http://schemas.openxmlformats.org/officeDocument/2006/bibliography" xmlns="http://schemas.openxmlformats.org/officeDocument/2006/bibliography" SelectedStyle="\APASixthEditionOfficeOnline.xsl" StyleName="APA" Version="6"/>
+</file>
+
+<file path=customXml/itemProps1.xml><?xml version="1.0" encoding="utf-8"?>
+<ds:datastoreItem xmlns:ds="http://schemas.openxmlformats.org/officeDocument/2006/customXml" ds:itemID="{76EB2DC2-D5B1-4333-A3CF-A4B2F1B06A26}">
+  <ds:schemaRefs>
+    <ds:schemaRef ds:uri="http://schemas.openxmlformats.org/officeDocument/2006/bibliography"/>
+  </ds:schemaRefs>
+</ds:datastoreItem>
 </file>
</xml_diff>